<commit_message>
docs(paper): consolidate camera-ready into main.tex and recompile PDF/DOCX per NewInML instructions
</commit_message>
<xml_diff>
--- a/paper/main.docx
+++ b/paper/main.docx
@@ -371,7 +371,19 @@
         <w:pStyle w:val="FirstParagraph"/>
       </w:pPr>
       <w:r>
-        <w:t xml:space="preserve">Physical laws frequently take a correction-first form: a known classical baseline</w:t>
+        <w:t xml:space="preserve">In the expanding landscape of machine learning for the physical sciences </w:t>
+      </w:r>
+      <w:r>
+        <w:t xml:space="preserve">(Carleo et al. 2019; Wang et al. 2023)</w:t>
+      </w:r>
+      <w:r>
+        <w:t xml:space="preserve">,</w:t>
+      </w:r>
+      <w:r>
+        <w:t xml:space="preserve"> </w:t>
+      </w:r>
+      <w:r>
+        <w:t xml:space="preserve">physical laws frequently take a correction-first form: a known classical baseline</w:t>
       </w:r>
       <w:r>
         <w:t xml:space="preserve"> </w:t>
@@ -424,7 +436,7 @@
         <w:t xml:space="preserve">PySR </w:t>
       </w:r>
       <w:r>
-        <w:t xml:space="preserve">(Cranmer 2023)</w:t>
+        <w:t xml:space="preserve">(Cranmer et al. 2020; Cranmer 2023)</w:t>
       </w:r>
       <w:r>
         <w:t xml:space="preserve">, AI Feynman </w:t>
@@ -556,6 +568,18 @@
       </w:r>
       <w:r>
         <w:t xml:space="preserve">(La Cava et al. 2021)</w:t>
+      </w:r>
+      <w:r>
+        <w:t xml:space="preserve">, generating what recent meta-science critiques identify</w:t>
+      </w:r>
+      <w:r>
+        <w:t xml:space="preserve"> </w:t>
+      </w:r>
+      <w:r>
+        <w:t xml:space="preserve">as an illusion of understanding </w:t>
+      </w:r>
+      <w:r>
+        <w:t xml:space="preserve">(Messeri and Crockett 2024; Krenn et al. 2022)</w:t>
       </w:r>
       <w:r>
         <w:t xml:space="preserve">.</w:t>
@@ -594,6 +618,39 @@
         <w:pStyle w:val="FirstParagraph"/>
       </w:pPr>
       <w:r>
+        <w:t xml:space="preserve">Automated scientific discovery traces back to pioneering heuristic systems such as</w:t>
+      </w:r>
+      <w:r>
+        <w:t xml:space="preserve"> </w:t>
+      </w:r>
+      <w:r>
+        <w:t xml:space="preserve">BACON </w:t>
+      </w:r>
+      <w:r>
+        <w:t xml:space="preserve">(Langley et al. 1987)</w:t>
+      </w:r>
+      <w:r>
+        <w:t xml:space="preserve"> </w:t>
+      </w:r>
+      <w:r>
+        <w:t xml:space="preserve">and has evolved toward modern autonomous equation</w:t>
+      </w:r>
+      <w:r>
+        <w:t xml:space="preserve"> </w:t>
+      </w:r>
+      <w:r>
+        <w:t xml:space="preserve">discovery </w:t>
+      </w:r>
+      <w:r>
+        <w:t xml:space="preserve">(Kramer et al. 2026; Makke and Chawla 2024; Karagiorgi et al. 2022)</w:t>
+      </w:r>
+      <w:r>
+        <w:t xml:space="preserve">.</w:t>
+      </w:r>
+      <w:r>
+        <w:t xml:space="preserve"> </w:t>
+      </w:r>
+      <w:r>
         <w:t xml:space="preserve">General SR engines (Eureqa </w:t>
       </w:r>
       <w:r>
@@ -603,7 +660,7 @@
         <w:t xml:space="preserve">, PySR </w:t>
       </w:r>
       <w:r>
-        <w:t xml:space="preserve">(Cranmer 2023)</w:t>
+        <w:t xml:space="preserve">(Cranmer et al. 2020; Cranmer 2023)</w:t>
       </w:r>
       <w:r>
         <w:t xml:space="preserve">,</w:t>
@@ -684,7 +741,13 @@
         <w:t xml:space="preserve"> </w:t>
       </w:r>
       <w:r>
-        <w:t xml:space="preserve">AI-Descartes </w:t>
+        <w:t xml:space="preserve">Recent systems combining data with background knowledge and axiomatic reasoning,</w:t>
+      </w:r>
+      <w:r>
+        <w:t xml:space="preserve"> </w:t>
+      </w:r>
+      <w:r>
+        <w:t xml:space="preserve">such as AI-Descartes </w:t>
       </w:r>
       <w:r>
         <w:t xml:space="preserve">(Cornelio et al. 2023)</w:t>
@@ -693,22 +756,40 @@
         <w:t xml:space="preserve"> </w:t>
       </w:r>
       <w:r>
-        <w:t xml:space="preserve">combines SR with axiomatic theory derivation,</w:t>
-      </w:r>
-      <w:r>
-        <w:t xml:space="preserve"> </w:t>
-      </w:r>
-      <w:r>
-        <w:t xml:space="preserve">but does not address catastrophic cancellation or provide identifiability gating.</w:t>
-      </w:r>
-      <w:r>
-        <w:t xml:space="preserve"> </w:t>
-      </w:r>
-      <w:r>
-        <w:t xml:space="preserve">While dimensional analysis has been integrated into SR </w:t>
-      </w:r>
-      <w:r>
-        <w:t xml:space="preserve">(Tenachi et al. 2023; Petersen et al. 2021)</w:t>
+        <w:t xml:space="preserve">and AI Hilbert </w:t>
+      </w:r>
+      <w:r>
+        <w:t xml:space="preserve">(Cory-Wright et al. 2024)</w:t>
+      </w:r>
+      <w:r>
+        <w:t xml:space="preserve">,</w:t>
+      </w:r>
+      <w:r>
+        <w:t xml:space="preserve"> </w:t>
+      </w:r>
+      <w:r>
+        <w:t xml:space="preserve">highlight the importance of theory-grounded discovery, but do not address</w:t>
+      </w:r>
+      <w:r>
+        <w:t xml:space="preserve"> </w:t>
+      </w:r>
+      <w:r>
+        <w:t xml:space="preserve">catastrophic cancellation near asymptotic limits or provide formal identifiability gating.</w:t>
+      </w:r>
+      <w:r>
+        <w:t xml:space="preserve"> </w:t>
+      </w:r>
+      <w:r>
+        <w:t xml:space="preserve">While dimensional analysis and symmetry constraints have been integrated into</w:t>
+      </w:r>
+      <w:r>
+        <w:t xml:space="preserve"> </w:t>
+      </w:r>
+      <w:r>
+        <w:t xml:space="preserve">SR and dynamical learning </w:t>
+      </w:r>
+      <w:r>
+        <w:t xml:space="preserve">(Tenachi et al. 2023; Petersen et al. 2021; Otto et al. 2025)</w:t>
       </w:r>
       <w:r>
         <w:t xml:space="preserve">,</w:t>
@@ -2430,7 +2511,7 @@
               <w:jc w:val="left"/>
             </w:pPr>
             <w:r>
-              <w:t xml:space="preserve">Gravitational/Coulomb potential</w:t>
+              <w:t xml:space="preserve">Gravitational / Coulomb potential</w:t>
             </w:r>
           </w:p>
         </w:tc>
@@ -3365,7 +3446,78 @@
         <w:t xml:space="preserve">lists entries for our three experiments.</w:t>
       </w:r>
     </w:p>
-    <w:bookmarkStart w:id="17" w:name="_8ab5eba3bf9ebcd8af54648c5563c1c7f59f7ee"/>
+    <w:p>
+      <w:pPr>
+        <w:pStyle w:val="BodyText"/>
+      </w:pPr>
+      <w:r>
+        <w:t xml:space="preserve">A</w:t>
+      </w:r>
+      <w:r>
+        <w:t xml:space="preserve"> </w:t>
+      </w:r>
+      <m:oMath>
+        <m:r>
+          <m:t>3</m:t>
+        </m:r>
+        <m:r>
+          <m:rPr>
+            <m:sty m:val="p"/>
+          </m:rPr>
+          <m:t>×</m:t>
+        </m:r>
+        <m:r>
+          <m:t>3</m:t>
+        </m:r>
+      </m:oMath>
+      <w:r>
+        <w:t xml:space="preserve"> </w:t>
+      </w:r>
+      <w:r>
+        <w:t xml:space="preserve">cross-misspecification audit (Appendix, Table R3</w:t>
+      </w:r>
+      <w:r>
+        <w:rPr>
+          <w:rStyle w:val="FootnoteReference"/>
+        </w:rPr>
+        <w:footnoteReference w:id="17"/>
+      </w:r>
+      <w:r>
+        <w:t xml:space="preserve">)</w:t>
+      </w:r>
+      <w:r>
+        <w:t xml:space="preserve"> </w:t>
+      </w:r>
+      <w:r>
+        <w:t xml:space="preserve">confirms the taxonomy is</w:t>
+      </w:r>
+      <w:r>
+        <w:t xml:space="preserve"> </w:t>
+      </w:r>
+      <w:r>
+        <w:rPr>
+          <w:i/>
+          <w:iCs/>
+        </w:rPr>
+        <w:t xml:space="preserve">safe against misspecification</w:t>
+      </w:r>
+      <w:r>
+        <w:t xml:space="preserve">: in all 6</w:t>
+      </w:r>
+      <w:r>
+        <w:t xml:space="preserve"> </w:t>
+      </w:r>
+      <w:r>
+        <w:t xml:space="preserve">wrong-taxonomy trials the system returned WITHHELD (0% false discovery rate).</w:t>
+      </w:r>
+      <w:r>
+        <w:t xml:space="preserve"> </w:t>
+      </w:r>
+      <w:r>
+        <w:t xml:space="preserve">An incorrect prior causes conservative abstention, not hallucinated laws.</w:t>
+      </w:r>
+    </w:p>
+    <w:bookmarkStart w:id="19" w:name="_8ab5eba3bf9ebcd8af54648c5563c1c7f59f7ee"/>
     <w:p>
       <w:pPr>
         <w:pStyle w:val="TableCaption"/>
@@ -3697,16 +3849,16 @@
         </w:tc>
       </w:tr>
     </w:tbl>
-    <w:bookmarkEnd w:id="17"/>
+    <w:bookmarkEnd w:id="19"/>
     <w:p>
       <w:pPr>
         <w:pStyle w:val="Heading2"/>
       </w:pPr>
-      <w:bookmarkStart w:id="18" w:name="_40f5476e03ca74ba4305650ac107c2b30c18041"/>
+      <w:bookmarkStart w:id="20" w:name="_40f5476e03ca74ba4305650ac107c2b30c18041"/>
       <w:r>
         <w:t xml:space="preserve">Grammar enumeration and theta-intact constraint</w:t>
       </w:r>
-      <w:bookmarkEnd w:id="18"/>
+      <w:bookmarkEnd w:id="20"/>
     </w:p>
     <w:p>
       <w:pPr>
@@ -3967,11 +4119,11 @@
       <w:pPr>
         <w:pStyle w:val="Heading2"/>
       </w:pPr>
-      <w:bookmarkStart w:id="19" w:name="_9bb133a3ac464e73b80a9b12eeb70686e961afa"/>
+      <w:bookmarkStart w:id="21" w:name="_9bb133a3ac464e73b80a9b12eeb70686e961afa"/>
       <w:r>
         <w:t xml:space="preserve">Physical gate cascade</w:t>
       </w:r>
-      <w:bookmarkEnd w:id="19"/>
+      <w:bookmarkEnd w:id="21"/>
     </w:p>
     <w:p>
       <w:pPr>
@@ -3998,7 +4150,7 @@
         <w:t xml:space="preserve">) applied to the theta-intact expression.</w:t>
       </w:r>
     </w:p>
-    <w:bookmarkStart w:id="20" w:name="_34fafeaa229659bea99805a2379672a37a5826b"/>
+    <w:bookmarkStart w:id="22" w:name="_34fafeaa229659bea99805a2379672a37a5826b"/>
     <w:p>
       <w:pPr>
         <w:pStyle w:val="TableCaption"/>
@@ -4318,16 +4470,16 @@
         </w:tc>
       </w:tr>
     </w:tbl>
-    <w:bookmarkEnd w:id="20"/>
+    <w:bookmarkEnd w:id="22"/>
     <w:p>
       <w:pPr>
         <w:pStyle w:val="Heading2"/>
       </w:pPr>
-      <w:bookmarkStart w:id="21" w:name="_3dc49908de44a3d72f9ae592bbcf63abbc9da82"/>
+      <w:bookmarkStart w:id="23" w:name="_3dc49908de44a3d72f9ae592bbcf63abbc9da82"/>
       <w:r>
         <w:t xml:space="preserve">Parameter optimization and model selection</w:t>
       </w:r>
-      <w:bookmarkEnd w:id="21"/>
+      <w:bookmarkEnd w:id="23"/>
     </w:p>
     <w:p>
       <w:pPr>
@@ -4693,11 +4845,11 @@
       <w:pPr>
         <w:pStyle w:val="Heading2"/>
       </w:pPr>
-      <w:bookmarkStart w:id="22" w:name="_236375bccae989613f89b5956ef85b21a233826"/>
+      <w:bookmarkStart w:id="24" w:name="_236375bccae989613f89b5956ef85b21a233826"/>
       <w:r>
         <w:t xml:space="preserve">Four-step validation protocol</w:t>
       </w:r>
-      <w:bookmarkEnd w:id="22"/>
+      <w:bookmarkEnd w:id="24"/>
     </w:p>
     <w:p>
       <w:pPr>
@@ -4975,21 +5127,21 @@
       <w:pPr>
         <w:pStyle w:val="Heading1"/>
       </w:pPr>
-      <w:bookmarkStart w:id="23" w:name="_experiments"/>
+      <w:bookmarkStart w:id="25" w:name="_experiments"/>
       <w:r>
         <w:t xml:space="preserve">Experiments</w:t>
       </w:r>
-      <w:bookmarkEnd w:id="23"/>
+      <w:bookmarkEnd w:id="25"/>
     </w:p>
     <w:p>
       <w:pPr>
         <w:pStyle w:val="Heading2"/>
       </w:pPr>
-      <w:bookmarkStart w:id="24" w:name="_setup"/>
+      <w:bookmarkStart w:id="26" w:name="_setup"/>
       <w:r>
         <w:t xml:space="preserve">Setup</w:t>
       </w:r>
-      <w:bookmarkEnd w:id="24"/>
+      <w:bookmarkEnd w:id="26"/>
     </w:p>
     <w:p>
       <w:pPr>
@@ -5060,7 +5212,7 @@
         <w:t xml:space="preserve">classical predictions, dimensional variable definitions, and the taxonomy key are provided.</w:t>
       </w:r>
     </w:p>
-    <w:bookmarkStart w:id="25" w:name="_f9c4f5d1c9390fcbc5694b2fe95fabd219271c8"/>
+    <w:bookmarkStart w:id="27" w:name="_f9c4f5d1c9390fcbc5694b2fe95fabd219271c8"/>
     <w:p>
       <w:pPr>
         <w:pStyle w:val="TableCaption"/>
@@ -5519,65 +5671,40 @@
         </w:tc>
       </w:tr>
     </w:tbl>
-    <w:bookmarkEnd w:id="25"/>
+    <w:bookmarkEnd w:id="27"/>
     <w:p>
       <w:pPr>
         <w:pStyle w:val="Heading2"/>
       </w:pPr>
-      <w:bookmarkStart w:id="26" w:name="_a28f169358a053f7b171a621bd02ee9ea3d1d28"/>
+      <w:bookmarkStart w:id="28" w:name="_a28f169358a053f7b171a621bd02ee9ea3d1d28"/>
       <w:r>
         <w:t xml:space="preserve">Results</w:t>
       </w:r>
-      <w:bookmarkEnd w:id="26"/>
+      <w:bookmarkEnd w:id="28"/>
     </w:p>
-    <w:bookmarkStart w:id="30" w:name="_c7946d13b3f336e982488dc050f3a0bcdd814c3"/>
-    <w:p>
-      <w:pPr>
-        <w:pStyle w:val="CaptionedFigure"/>
-      </w:pPr>
-      <w:r>
-        <w:drawing>
-          <wp:inline>
-            <wp:extent cx="5334000" cy="1745571"/>
-            <wp:effectExtent b="0" l="0" r="0" t="0"/>
-            <wp:docPr descr="" title="" id="28" name="Picture"/>
-            <a:graphic>
-              <a:graphicData uri="http://schemas.openxmlformats.org/drawingml/2006/picture">
-                <pic:pic>
-                  <pic:nvPicPr>
-                    <pic:cNvPr descr="fig1_recovery.png" id="29" name="Picture"/>
-                    <pic:cNvPicPr>
-                      <a:picLocks noChangeArrowheads="1" noChangeAspect="1"/>
-                    </pic:cNvPicPr>
-                  </pic:nvPicPr>
-                  <pic:blipFill>
-                    <a:blip r:embed="rId27"/>
-                    <a:stretch>
-                      <a:fillRect/>
-                    </a:stretch>
-                  </pic:blipFill>
-                  <pic:spPr bwMode="auto">
-                    <a:xfrm>
-                      <a:off x="0" y="0"/>
-                      <a:ext cx="5334000" cy="1745571"/>
-                    </a:xfrm>
-                    <a:prstGeom prst="rect">
-                      <a:avLst/>
-                    </a:prstGeom>
-                    <a:noFill/>
-                    <a:ln w="9525">
-                      <a:noFill/>
-                      <a:headEnd/>
-                      <a:tailEnd/>
-                    </a:ln>
-                  </pic:spPr>
-                </pic:pic>
-              </a:graphicData>
-            </a:graphic>
-          </wp:inline>
-        </w:drawing>
-      </w:r>
-    </w:p>
+    <w:bookmarkStart w:id="29" w:name="_c7946d13b3f336e982488dc050f3a0bcdd814c3"/>
+    <w:tbl>
+      <w:tblPr>
+        <w:tblStyle w:val="FigureTable"/>
+        <w:tblW w:type="auto" w:w="0"/>
+        <w:jc w:val="center"/>
+        <w:tblLook w:firstRow="0" w:lastRow="0" w:firstColumn="0" w:lastColumn="0"/>
+      </w:tblPr>
+      <w:tblGrid>
+        <w:gridCol w:w="7920"/>
+      </w:tblGrid>
+      <w:tr>
+        <w:tc>
+          <w:tcPr/>
+          <w:p>
+            <w:pPr>
+              <w:pStyle w:val="Compact"/>
+              <w:jc w:val="center"/>
+            </w:pPr>
+          </w:p>
+        </w:tc>
+      </w:tr>
+    </w:tbl>
     <w:p>
       <w:pPr>
         <w:pStyle w:val="ImageCaption"/>
@@ -5684,7 +5811,7 @@
           <w:rPr>
             <w:rStyle w:val="Hyperlink"/>
           </w:rPr>
-          <w:t xml:space="preserve">5</w:t>
+          <w:t xml:space="preserve">[tab:results]</w:t>
         </w:r>
       </w:hyperlink>
       <w:r>
@@ -5918,55 +6045,30 @@
         <w:t xml:space="preserve"> </w:t>
       </w:r>
     </w:p>
-    <w:bookmarkEnd w:id="30"/>
-    <w:bookmarkStart w:id="34" w:name="_afdb111206819426e5a108476a671f77ce665af"/>
-    <w:p>
-      <w:pPr>
-        <w:pStyle w:val="CaptionedFigure"/>
-      </w:pPr>
-      <w:r>
-        <w:drawing>
-          <wp:inline>
-            <wp:extent cx="5334000" cy="1892220"/>
-            <wp:effectExtent b="0" l="0" r="0" t="0"/>
-            <wp:docPr descr="" title="" id="32" name="Picture"/>
-            <a:graphic>
-              <a:graphicData uri="http://schemas.openxmlformats.org/drawingml/2006/picture">
-                <pic:pic>
-                  <pic:nvPicPr>
-                    <pic:cNvPr descr="fig2_bic.png" id="33" name="Picture"/>
-                    <pic:cNvPicPr>
-                      <a:picLocks noChangeArrowheads="1" noChangeAspect="1"/>
-                    </pic:cNvPicPr>
-                  </pic:nvPicPr>
-                  <pic:blipFill>
-                    <a:blip r:embed="rId31"/>
-                    <a:stretch>
-                      <a:fillRect/>
-                    </a:stretch>
-                  </pic:blipFill>
-                  <pic:spPr bwMode="auto">
-                    <a:xfrm>
-                      <a:off x="0" y="0"/>
-                      <a:ext cx="5334000" cy="1892220"/>
-                    </a:xfrm>
-                    <a:prstGeom prst="rect">
-                      <a:avLst/>
-                    </a:prstGeom>
-                    <a:noFill/>
-                    <a:ln w="9525">
-                      <a:noFill/>
-                      <a:headEnd/>
-                      <a:tailEnd/>
-                    </a:ln>
-                  </pic:spPr>
-                </pic:pic>
-              </a:graphicData>
-            </a:graphic>
-          </wp:inline>
-        </w:drawing>
-      </w:r>
-    </w:p>
+    <w:bookmarkEnd w:id="29"/>
+    <w:bookmarkStart w:id="30" w:name="_afdb111206819426e5a108476a671f77ce665af"/>
+    <w:tbl>
+      <w:tblPr>
+        <w:tblStyle w:val="FigureTable"/>
+        <w:tblW w:type="auto" w:w="0"/>
+        <w:jc w:val="center"/>
+        <w:tblLook w:firstRow="0" w:lastRow="0" w:firstColumn="0" w:lastColumn="0"/>
+      </w:tblPr>
+      <w:tblGrid>
+        <w:gridCol w:w="7920"/>
+      </w:tblGrid>
+      <w:tr>
+        <w:tc>
+          <w:tcPr/>
+          <w:p>
+            <w:pPr>
+              <w:pStyle w:val="Compact"/>
+              <w:jc w:val="center"/>
+            </w:pPr>
+          </w:p>
+        </w:tc>
+      </w:tr>
+    </w:tbl>
     <w:p>
       <w:pPr>
         <w:pStyle w:val="ImageCaption"/>
@@ -6273,7 +6375,7 @@
           <w:rPr>
             <w:rStyle w:val="Hyperlink"/>
           </w:rPr>
-          <w:t xml:space="preserve">5</w:t>
+          <w:t xml:space="preserve">[tab:results]</w:t>
         </w:r>
       </w:hyperlink>
       <w:r>
@@ -6324,55 +6426,30 @@
         <w:t xml:space="preserve"> </w:t>
       </w:r>
     </w:p>
-    <w:bookmarkEnd w:id="34"/>
-    <w:bookmarkStart w:id="38" w:name="_be1ea107d10d2f739baf6c86264f7c371d7bc21"/>
-    <w:p>
-      <w:pPr>
-        <w:pStyle w:val="CaptionedFigure"/>
-      </w:pPr>
-      <w:r>
-        <w:drawing>
-          <wp:inline>
-            <wp:extent cx="5334000" cy="1743754"/>
-            <wp:effectExtent b="0" l="0" r="0" t="0"/>
-            <wp:docPr descr="" title="" id="36" name="Picture"/>
-            <a:graphic>
-              <a:graphicData uri="http://schemas.openxmlformats.org/drawingml/2006/picture">
-                <pic:pic>
-                  <pic:nvPicPr>
-                    <pic:cNvPr descr="fig3_parity.png" id="37" name="Picture"/>
-                    <pic:cNvPicPr>
-                      <a:picLocks noChangeArrowheads="1" noChangeAspect="1"/>
-                    </pic:cNvPicPr>
-                  </pic:nvPicPr>
-                  <pic:blipFill>
-                    <a:blip r:embed="rId35"/>
-                    <a:stretch>
-                      <a:fillRect/>
-                    </a:stretch>
-                  </pic:blipFill>
-                  <pic:spPr bwMode="auto">
-                    <a:xfrm>
-                      <a:off x="0" y="0"/>
-                      <a:ext cx="5334000" cy="1743754"/>
-                    </a:xfrm>
-                    <a:prstGeom prst="rect">
-                      <a:avLst/>
-                    </a:prstGeom>
-                    <a:noFill/>
-                    <a:ln w="9525">
-                      <a:noFill/>
-                      <a:headEnd/>
-                      <a:tailEnd/>
-                    </a:ln>
-                  </pic:spPr>
-                </pic:pic>
-              </a:graphicData>
-            </a:graphic>
-          </wp:inline>
-        </w:drawing>
-      </w:r>
-    </w:p>
+    <w:bookmarkEnd w:id="30"/>
+    <w:bookmarkStart w:id="31" w:name="_be1ea107d10d2f739baf6c86264f7c371d7bc21"/>
+    <w:tbl>
+      <w:tblPr>
+        <w:tblStyle w:val="FigureTable"/>
+        <w:tblW w:type="auto" w:w="0"/>
+        <w:jc w:val="center"/>
+        <w:tblLook w:firstRow="0" w:lastRow="0" w:firstColumn="0" w:lastColumn="0"/>
+      </w:tblPr>
+      <w:tblGrid>
+        <w:gridCol w:w="7920"/>
+      </w:tblGrid>
+      <w:tr>
+        <w:tc>
+          <w:tcPr/>
+          <w:p>
+            <w:pPr>
+              <w:pStyle w:val="Compact"/>
+              <w:jc w:val="center"/>
+            </w:pPr>
+          </w:p>
+        </w:tc>
+      </w:tr>
+    </w:tbl>
     <w:p>
       <w:pPr>
         <w:pStyle w:val="ImageCaption"/>
@@ -6631,7 +6708,7 @@
         <w:t xml:space="preserve"> </w:t>
       </w:r>
     </w:p>
-    <w:bookmarkEnd w:id="38"/>
+    <w:bookmarkEnd w:id="31"/>
     <w:p>
       <w:pPr>
         <w:pStyle w:val="FirstParagraph"/>
@@ -6644,7 +6721,7 @@
           <w:rPr>
             <w:rStyle w:val="Hyperlink"/>
           </w:rPr>
-          <w:t xml:space="preserve">5</w:t>
+          <w:t xml:space="preserve">[tab:results]</w:t>
         </w:r>
       </w:hyperlink>
       <w:r>
@@ -6691,21 +6768,6 @@
       <w:r>
         <w:t xml:space="preserve">observation window.</w:t>
       </w:r>
-    </w:p>
-    <w:bookmarkStart w:id="39" w:name="_3004d538530d216c95e9fae87e902706469aff1"/>
-    <w:p>
-      <w:pPr>
-        <w:pStyle w:val="TableCaption"/>
-      </w:pPr>
-      <w:r>
-        <w:t xml:space="preserve">Four-step validation results for all three scenarios.</w:t>
-      </w:r>
-      <w:r>
-        <w:t xml:space="preserve"> </w:t>
-      </w:r>
-      <w:r>
-        <w:t xml:space="preserve">PC = Positive Control (pass/fail).</w:t>
-      </w:r>
       <w:r>
         <w:t xml:space="preserve"> </w:t>
       </w:r>
@@ -6720,48 +6782,78 @@
           <m:rPr>
             <m:sty m:val="p"/>
           </m:rPr>
-          <m:t>B</m:t>
-        </m:r>
-        <m:r>
-          <m:rPr>
-            <m:sty m:val="p"/>
-          </m:rPr>
-          <m:t>I</m:t>
-        </m:r>
-        <m:r>
-          <m:rPr>
-            <m:sty m:val="p"/>
-          </m:rPr>
-          <m:t>C</m:t>
-        </m:r>
-        <m:r>
-          <m:rPr>
-            <m:sty m:val="p"/>
-          </m:rPr>
-          <m:t>=</m:t>
+          <m:t>N</m:t>
+        </m:r>
+        <m:r>
+          <m:rPr>
+            <m:sty m:val="p"/>
+          </m:rPr>
+          <m:t>L</m:t>
+        </m:r>
+        <m:r>
+          <m:rPr>
+            <m:sty m:val="p"/>
+          </m:rPr>
+          <m:t>L</m:t>
+        </m:r>
+      </m:oMath>
+      <w:r>
+        <w:t xml:space="preserve"> </w:t>
+      </w:r>
+      <w:r>
+        <w:t xml:space="preserve">isolates the pure fit-quality advantage from the</w:t>
+      </w:r>
+      <w:r>
+        <w:t xml:space="preserve"> </w:t>
+      </w:r>
+      <w:r>
+        <w:t xml:space="preserve">multiple-testing penalty, addressing a known asymmetry in Extended</w:t>
+      </w:r>
+      <w:r>
+        <w:t xml:space="preserve"> </w:t>
+      </w:r>
+      <w:r>
+        <w:t xml:space="preserve">BIC when</w:t>
+      </w:r>
+      <w:r>
+        <w:t xml:space="preserve"> </w:t>
+      </w:r>
+      <m:oMath>
+        <m:r>
+          <m:rPr>
+            <m:sty m:val="p"/>
+          </m:rPr>
+          <m:t>|</m:t>
         </m:r>
         <m:sSub>
           <m:e>
+            <m:r>
+              <m:rPr>
+                <m:scr m:val="script"/>
+                <m:sty m:val="p"/>
+              </m:rPr>
+              <m:t>C</m:t>
+            </m:r>
+          </m:e>
+          <m:sub>
             <m:r>
               <m:rPr>
                 <m:sty m:val="p"/>
               </m:rPr>
-              <m:t>B</m:t>
+              <m:t>d</m:t>
             </m:r>
             <m:r>
               <m:rPr>
                 <m:sty m:val="p"/>
               </m:rPr>
-              <m:t>I</m:t>
+              <m:t>o</m:t>
             </m:r>
             <m:r>
               <m:rPr>
                 <m:sty m:val="p"/>
               </m:rPr>
-              <m:t>C</m:t>
-            </m:r>
-          </m:e>
-          <m:sub>
+              <m:t>m</m:t>
+            </m:r>
             <m:r>
               <m:rPr>
                 <m:sty m:val="p"/>
@@ -6772,6 +6864,55 @@
               <m:rPr>
                 <m:sty m:val="p"/>
               </m:rPr>
+              <m:t>i</m:t>
+            </m:r>
+            <m:r>
+              <m:rPr>
+                <m:sty m:val="p"/>
+              </m:rPr>
+              <m:t>n</m:t>
+            </m:r>
+          </m:sub>
+        </m:sSub>
+        <m:r>
+          <m:rPr>
+            <m:sty m:val="p"/>
+          </m:rPr>
+          <m:t>|</m:t>
+        </m:r>
+        <m:r>
+          <m:rPr>
+            <m:sty m:val="p"/>
+          </m:rPr>
+          <m:t>≠</m:t>
+        </m:r>
+        <m:r>
+          <m:rPr>
+            <m:sty m:val="p"/>
+          </m:rPr>
+          <m:t>|</m:t>
+        </m:r>
+        <m:sSub>
+          <m:e>
+            <m:r>
+              <m:rPr>
+                <m:scr m:val="script"/>
+                <m:sty m:val="p"/>
+              </m:rPr>
+              <m:t>C</m:t>
+            </m:r>
+          </m:e>
+          <m:sub>
+            <m:r>
+              <m:rPr>
+                <m:sty m:val="p"/>
+              </m:rPr>
+              <m:t>a</m:t>
+            </m:r>
+            <m:r>
+              <m:rPr>
+                <m:sty m:val="p"/>
+              </m:rPr>
               <m:t>b</m:t>
             </m:r>
             <m:r>
@@ -6810,1108 +6951,31 @@
           <m:rPr>
             <m:sty m:val="p"/>
           </m:rPr>
-          <m:t>−</m:t>
-        </m:r>
-        <m:sSub>
-          <m:e>
-            <m:r>
-              <m:rPr>
-                <m:sty m:val="p"/>
-              </m:rPr>
-              <m:t>B</m:t>
-            </m:r>
-            <m:r>
-              <m:rPr>
-                <m:sty m:val="p"/>
-              </m:rPr>
-              <m:t>I</m:t>
-            </m:r>
-            <m:r>
-              <m:rPr>
-                <m:sty m:val="p"/>
-              </m:rPr>
-              <m:t>C</m:t>
-            </m:r>
-          </m:e>
-          <m:sub>
-            <m:r>
-              <m:rPr>
-                <m:sty m:val="p"/>
-              </m:rPr>
-              <m:t>b</m:t>
-            </m:r>
-            <m:r>
-              <m:rPr>
-                <m:sty m:val="p"/>
-              </m:rPr>
-              <m:t>e</m:t>
-            </m:r>
-            <m:r>
-              <m:rPr>
-                <m:sty m:val="p"/>
-              </m:rPr>
-              <m:t>s</m:t>
-            </m:r>
-            <m:r>
-              <m:rPr>
-                <m:sty m:val="p"/>
-              </m:rPr>
-              <m:t>t</m:t>
-            </m:r>
-          </m:sub>
-        </m:sSub>
+          <m:t>|</m:t>
+        </m:r>
       </m:oMath>
       <w:r>
-        <w:t xml:space="preserve">,</w:t>
-      </w:r>
-      <w:r>
-        <w:t xml:space="preserve"> </w:t>
-      </w:r>
-      <w:r>
-        <w:t xml:space="preserve">where</w:t>
-      </w:r>
-      <w:r>
-        <w:t xml:space="preserve"> </w:t>
-      </w:r>
-      <m:oMath>
-        <m:sSub>
-          <m:e>
-            <m:r>
-              <m:rPr>
-                <m:sty m:val="p"/>
-              </m:rPr>
-              <m:t>B</m:t>
-            </m:r>
-            <m:r>
-              <m:rPr>
-                <m:sty m:val="p"/>
-              </m:rPr>
-              <m:t>I</m:t>
-            </m:r>
-            <m:r>
-              <m:rPr>
-                <m:sty m:val="p"/>
-              </m:rPr>
-              <m:t>C</m:t>
-            </m:r>
-          </m:e>
-          <m:sub>
-            <m:r>
-              <m:rPr>
-                <m:sty m:val="p"/>
-              </m:rPr>
-              <m:t>b</m:t>
-            </m:r>
-            <m:r>
-              <m:rPr>
-                <m:sty m:val="p"/>
-              </m:rPr>
-              <m:t>e</m:t>
-            </m:r>
-            <m:r>
-              <m:rPr>
-                <m:sty m:val="p"/>
-              </m:rPr>
-              <m:t>s</m:t>
-            </m:r>
-            <m:r>
-              <m:rPr>
-                <m:sty m:val="p"/>
-              </m:rPr>
-              <m:t>t</m:t>
-            </m:r>
-          </m:sub>
-        </m:sSub>
-      </m:oMath>
-      <w:r>
-        <w:t xml:space="preserve"> </w:t>
-      </w:r>
-      <w:r>
-        <w:t xml:space="preserve">is the Rank-1 domain-guided search BIC;</w:t>
-      </w:r>
-      <w:r>
-        <w:t xml:space="preserve"> </w:t>
-      </w:r>
-      <w:r>
-        <w:t xml:space="preserve">positive values indicate the full-primitive set is preferred over the ablated set.</w:t>
-      </w:r>
-      <w:r>
-        <w:t xml:space="preserve"> </w:t>
-      </w:r>
-      <w:r>
-        <w:t xml:space="preserve">Match level:</w:t>
+        <w:t xml:space="preserve">.</w:t>
       </w:r>
       <w:r>
         <w:t xml:space="preserve"> </w:t>
       </w:r>
       <w:r>
         <w:rPr>
-          <w:i/>
-          <w:iCs/>
+          <w:rStyle w:val="FootnoteReference"/>
         </w:rPr>
-        <w:t xml:space="preserve">exact</w:t>
-      </w:r>
-      <w:r>
-        <w:t xml:space="preserve"> </w:t>
-      </w:r>
-      <w:r>
-        <w:t xml:space="preserve">= symbolic equivalence verified;</w:t>
-      </w:r>
-      <w:r>
-        <w:t xml:space="preserve"> </w:t>
-      </w:r>
-      <w:r>
-        <w:rPr>
-          <w:i/>
-          <w:iCs/>
-        </w:rPr>
-        <w:t xml:space="preserve">class</w:t>
-      </w:r>
-      <w:r>
-        <w:t xml:space="preserve"> </w:t>
-      </w:r>
-      <w:r>
-        <w:t xml:space="preserve">= correct functional family confirmed; amplitude absorbs</w:t>
-      </w:r>
-      <w:r>
-        <w:t xml:space="preserve"> </w:t>
-      </w:r>
-      <w:r>
-        <w:t xml:space="preserve">unverifiable physical constants.</w:t>
+        <w:footnoteReference w:id="32"/>
       </w:r>
     </w:p>
-    <w:tbl>
-      <w:tblPr>
-        <w:tblStyle w:val="Table"/>
-        <w:tblW w:type="auto" w:w="0"/>
-        <w:tblLook w:firstRow="1" w:lastRow="0" w:firstColumn="0" w:lastColumn="0" w:noHBand="0" w:noVBand="0" w:val="0020"/>
-        <w:tblCaption w:val="Four-step validation results for all three scenarios. PC = Positive Control (pass/fail). \Delta\mathrm{BIC} = \mathrm{BIC}_{\mathrm{ablated}} - \mathrm{BIC}_{\mathrm{best}}, where \mathrm{BIC}_{\mathrm{best}} is the Rank-1 domain-guided search BIC; positive values indicate the full-primitive set is preferred over the ablated set. Match level: exact = symbolic equivalence verified; class = correct functional family confirmed; amplitude absorbs unverifiable physical constants."/>
-      </w:tblPr>
-      <w:tblGrid>
-        <w:gridCol w:w="990"/>
-        <w:gridCol w:w="990"/>
-        <w:gridCol w:w="990"/>
-        <w:gridCol w:w="990"/>
-        <w:gridCol w:w="990"/>
-        <w:gridCol w:w="990"/>
-        <w:gridCol w:w="990"/>
-        <w:gridCol w:w="990"/>
-      </w:tblGrid>
-      <w:tr>
-        <w:trPr>
-          <w:tblHeader w:val="on"/>
-        </w:trPr>
-        <w:tc>
-          <w:tcPr/>
-          <w:p>
-            <w:pPr>
-              <w:pStyle w:val="Compact"/>
-              <w:jc w:val="left"/>
-            </w:pPr>
-            <w:r>
-              <w:rPr>
-                <w:b/>
-                <w:bCs/>
-              </w:rPr>
-              <w:t xml:space="preserve">Scenario</w:t>
-            </w:r>
-          </w:p>
-        </w:tc>
-        <w:tc>
-          <w:tcPr/>
-          <w:p>
-            <w:pPr>
-              <w:pStyle w:val="Compact"/>
-              <w:jc w:val="left"/>
-            </w:pPr>
-            <w:r>
-              <w:rPr>
-                <w:b/>
-                <w:bCs/>
-              </w:rPr>
-              <w:t xml:space="preserve">Discovered structure</w:t>
-            </w:r>
-          </w:p>
-        </w:tc>
-        <w:tc>
-          <w:tcPr/>
-          <w:p>
-            <w:pPr>
-              <w:pStyle w:val="Compact"/>
-              <w:jc w:val="center"/>
-            </w:pPr>
-            <w:r>
-              <w:rPr>
-                <w:b/>
-                <w:bCs/>
-              </w:rPr>
-              <w:t xml:space="preserve">Rank</w:t>
-            </w:r>
-          </w:p>
-        </w:tc>
-        <w:tc>
-          <w:tcPr/>
-          <w:p>
-            <w:pPr>
-              <w:pStyle w:val="Compact"/>
-              <w:jc w:val="center"/>
-            </w:pPr>
-            <w:r>
-              <w:rPr>
-                <w:b/>
-                <w:bCs/>
-              </w:rPr>
-              <w:t xml:space="preserve">NMSE</w:t>
-            </w:r>
-          </w:p>
-        </w:tc>
-        <w:tc>
-          <w:tcPr/>
-          <w:p>
-            <w:pPr>
-              <w:pStyle w:val="Compact"/>
-              <w:jc w:val="center"/>
-            </w:pPr>
-            <w:r>
-              <w:rPr>
-                <w:b/>
-                <w:bCs/>
-              </w:rPr>
-              <w:t xml:space="preserve">PC</w:t>
-            </w:r>
-          </w:p>
-        </w:tc>
-        <w:tc>
-          <w:tcPr/>
-          <w:p>
-            <w:pPr>
-              <w:pStyle w:val="Compact"/>
-              <w:jc w:val="right"/>
-            </w:pPr>
-            <m:oMath>
-              <m:r>
-                <m:rPr>
-                  <m:sty m:val="p"/>
-                </m:rPr>
-                <m:t>Δ</m:t>
-              </m:r>
-            </m:oMath>
-            <w:r>
-              <w:rPr>
-                <w:b/>
-                <w:bCs/>
-              </w:rPr>
-              <w:t xml:space="preserve">BIC</w:t>
-            </w:r>
-          </w:p>
-        </w:tc>
-        <w:tc>
-          <w:tcPr/>
-          <w:p>
-            <w:pPr>
-              <w:pStyle w:val="Compact"/>
-              <w:jc w:val="center"/>
-            </w:pPr>
-            <w:r>
-              <w:rPr>
-                <w:b/>
-                <w:bCs/>
-              </w:rPr>
-              <w:t xml:space="preserve">Match</w:t>
-            </w:r>
-          </w:p>
-        </w:tc>
-        <w:tc>
-          <w:tcPr/>
-          <w:p>
-            <w:pPr>
-              <w:pStyle w:val="Compact"/>
-              <w:jc w:val="left"/>
-            </w:pPr>
-            <w:r>
-              <w:rPr>
-                <w:b/>
-                <w:bCs/>
-              </w:rPr>
-              <w:t xml:space="preserve">Verdict</w:t>
-            </w:r>
-          </w:p>
-        </w:tc>
-      </w:tr>
-      <w:tr>
-        <w:tc>
-          <w:tcPr/>
-          <w:p>
-            <w:pPr>
-              <w:pStyle w:val="Compact"/>
-              <w:jc w:val="left"/>
-            </w:pPr>
-            <w:r>
-              <w:t xml:space="preserve">Screened Coulomb (</w:t>
-            </w:r>
-            <m:oMath>
-              <m:r>
-                <m:t>r</m:t>
-              </m:r>
-              <m:r>
-                <m:rPr>
-                  <m:sty m:val="p"/>
-                </m:rPr>
-                <m:t>≤</m:t>
-              </m:r>
-              <m:r>
-                <m:t>4</m:t>
-              </m:r>
-            </m:oMath>
-            <w:r>
-              <w:t xml:space="preserve"> m)</w:t>
-            </w:r>
-          </w:p>
-        </w:tc>
-        <w:tc>
-          <w:tcPr/>
-          <w:p>
-            <w:pPr>
-              <w:pStyle w:val="Compact"/>
-              <w:jc w:val="left"/>
-            </w:pPr>
-            <m:oMath>
-              <m:sSub>
-                <m:e>
-                  <m:r>
-                    <m:t>θ</m:t>
-                  </m:r>
-                </m:e>
-                <m:sub>
-                  <m:r>
-                    <m:t>0</m:t>
-                  </m:r>
-                </m:sub>
-              </m:sSub>
-              <m:r>
-                <m:rPr>
-                  <m:sty m:val="p"/>
-                </m:rPr>
-                <m:t>(</m:t>
-              </m:r>
-              <m:sSup>
-                <m:e>
-                  <m:r>
-                    <m:t>e</m:t>
-                  </m:r>
-                </m:e>
-                <m:sup>
-                  <m:r>
-                    <m:rPr>
-                      <m:sty m:val="p"/>
-                    </m:rPr>
-                    <m:t>−</m:t>
-                  </m:r>
-                  <m:r>
-                    <m:t>r</m:t>
-                  </m:r>
-                  <m:r>
-                    <m:rPr>
-                      <m:sty m:val="p"/>
-                    </m:rPr>
-                    <m:t>/</m:t>
-                  </m:r>
-                  <m:sSub>
-                    <m:e>
-                      <m:r>
-                        <m:t>θ</m:t>
-                      </m:r>
-                    </m:e>
-                    <m:sub>
-                      <m:r>
-                        <m:t>4</m:t>
-                      </m:r>
-                    </m:sub>
-                  </m:sSub>
-                </m:sup>
-              </m:sSup>
-              <m:r>
-                <m:rPr>
-                  <m:sty m:val="p"/>
-                </m:rPr>
-                <m:t>−</m:t>
-              </m:r>
-              <m:r>
-                <m:t>1</m:t>
-              </m:r>
-              <m:r>
-                <m:rPr>
-                  <m:sty m:val="p"/>
-                </m:rPr>
-                <m:t>)</m:t>
-              </m:r>
-            </m:oMath>
-            <w:r>
-              <w:t xml:space="preserve">​</w:t>
-            </w:r>
-          </w:p>
-        </w:tc>
-        <w:tc>
-          <w:tcPr/>
-          <w:p>
-            <w:pPr>
-              <w:pStyle w:val="Compact"/>
-              <w:jc w:val="center"/>
-            </w:pPr>
-            <w:r>
-              <w:t xml:space="preserve">1</w:t>
-            </w:r>
-          </w:p>
-        </w:tc>
-        <w:tc>
-          <w:tcPr/>
-          <w:p>
-            <w:pPr>
-              <w:pStyle w:val="Compact"/>
-              <w:jc w:val="center"/>
-            </w:pPr>
-            <m:oMath>
-              <m:r>
-                <m:t>2.77</m:t>
-              </m:r>
-              <m:r>
-                <m:rPr>
-                  <m:sty m:val="p"/>
-                </m:rPr>
-                <m:t>×</m:t>
-              </m:r>
-              <m:sSup>
-                <m:e>
-                  <m:r>
-                    <m:t>10</m:t>
-                  </m:r>
-                </m:e>
-                <m:sup>
-                  <m:r>
-                    <m:rPr>
-                      <m:sty m:val="p"/>
-                    </m:rPr>
-                    <m:t>−</m:t>
-                  </m:r>
-                  <m:r>
-                    <m:t>4</m:t>
-                  </m:r>
-                </m:sup>
-              </m:sSup>
-            </m:oMath>
-            <w:r>
-              <w:t xml:space="preserve">​</w:t>
-            </w:r>
-          </w:p>
-        </w:tc>
-        <w:tc>
-          <w:tcPr/>
-          <w:p>
-            <w:pPr>
-              <w:pStyle w:val="Compact"/>
-              <w:jc w:val="center"/>
-            </w:pPr>
-            <w:r>
-              <w:t xml:space="preserve">PASS</w:t>
-            </w:r>
-          </w:p>
-        </w:tc>
-        <w:tc>
-          <w:tcPr/>
-          <w:p>
-            <w:pPr>
-              <w:pStyle w:val="Compact"/>
-              <w:jc w:val="right"/>
-            </w:pPr>
-            <m:oMath>
-              <m:r>
-                <m:t>30.65</m:t>
-              </m:r>
-            </m:oMath>
-            <w:r>
-              <w:t xml:space="preserve">​</w:t>
-            </w:r>
-          </w:p>
-        </w:tc>
-        <w:tc>
-          <w:tcPr/>
-          <w:p>
-            <w:pPr>
-              <w:pStyle w:val="Compact"/>
-              <w:jc w:val="center"/>
-            </w:pPr>
-            <w:r>
-              <w:t xml:space="preserve">exact</w:t>
-            </w:r>
-          </w:p>
-        </w:tc>
-        <w:tc>
-          <w:tcPr/>
-          <w:p>
-            <w:pPr>
-              <w:pStyle w:val="Compact"/>
-              <w:jc w:val="left"/>
-            </w:pPr>
-            <w:r>
-              <w:rPr>
-                <w:b/>
-                <w:bCs/>
-              </w:rPr>
-              <w:t xml:space="preserve">IDENTIFIABLE</w:t>
-            </w:r>
-          </w:p>
-        </w:tc>
-      </w:tr>
-      <w:tr>
-        <w:tc>
-          <w:tcPr/>
-          <w:p>
-            <w:pPr>
-              <w:pStyle w:val="Compact"/>
-              <w:jc w:val="left"/>
-            </w:pPr>
-            <w:r>
-              <w:t xml:space="preserve">Entropy Expansion (</w:t>
-            </w:r>
-            <m:oMath>
-              <m:r>
-                <m:t>d</m:t>
-              </m:r>
-              <m:r>
-                <m:t>V</m:t>
-              </m:r>
-              <m:r>
-                <m:rPr>
-                  <m:sty m:val="p"/>
-                </m:rPr>
-                <m:t>/</m:t>
-              </m:r>
-              <m:sSub>
-                <m:e>
-                  <m:r>
-                    <m:t>V</m:t>
-                  </m:r>
-                </m:e>
-                <m:sub>
-                  <m:r>
-                    <m:t>i</m:t>
-                  </m:r>
-                </m:sub>
-              </m:sSub>
-              <m:r>
-                <m:rPr>
-                  <m:sty m:val="p"/>
-                </m:rPr>
-                <m:t>≤</m:t>
-              </m:r>
-              <m:r>
-                <m:t>1</m:t>
-              </m:r>
-            </m:oMath>
-            <w:r>
-              <w:t xml:space="preserve">)</w:t>
-            </w:r>
-          </w:p>
-        </w:tc>
-        <w:tc>
-          <w:tcPr/>
-          <w:p>
-            <w:pPr>
-              <w:pStyle w:val="Compact"/>
-              <w:jc w:val="left"/>
-            </w:pPr>
-            <m:oMath>
-              <m:sSub>
-                <m:e>
-                  <m:r>
-                    <m:t>θ</m:t>
-                  </m:r>
-                </m:e>
-                <m:sub>
-                  <m:r>
-                    <m:t>0</m:t>
-                  </m:r>
-                </m:sub>
-              </m:sSub>
-              <m:r>
-                <m:rPr>
-                  <m:sty m:val="p"/>
-                </m:rPr>
-                <m:t>ln</m:t>
-              </m:r>
-              <m:r>
-                <m:rPr>
-                  <m:sty m:val="p"/>
-                </m:rPr>
-                <m:t>(</m:t>
-              </m:r>
-              <m:r>
-                <m:t>1</m:t>
-              </m:r>
-              <m:r>
-                <m:rPr>
-                  <m:sty m:val="p"/>
-                </m:rPr>
-                <m:t>+</m:t>
-              </m:r>
-              <m:r>
-                <m:t>d</m:t>
-              </m:r>
-              <m:r>
-                <m:t>V</m:t>
-              </m:r>
-              <m:r>
-                <m:rPr>
-                  <m:sty m:val="p"/>
-                </m:rPr>
-                <m:t>/</m:t>
-              </m:r>
-              <m:sSub>
-                <m:e>
-                  <m:r>
-                    <m:t>V</m:t>
-                  </m:r>
-                </m:e>
-                <m:sub>
-                  <m:r>
-                    <m:t>i</m:t>
-                  </m:r>
-                </m:sub>
-              </m:sSub>
-              <m:r>
-                <m:rPr>
-                  <m:sty m:val="p"/>
-                </m:rPr>
-                <m:t>)</m:t>
-              </m:r>
-            </m:oMath>
-            <w:r>
-              <w:t xml:space="preserve">​</w:t>
-            </w:r>
-          </w:p>
-        </w:tc>
-        <w:tc>
-          <w:tcPr/>
-          <w:p>
-            <w:pPr>
-              <w:pStyle w:val="Compact"/>
-              <w:jc w:val="center"/>
-            </w:pPr>
-            <w:r>
-              <w:t xml:space="preserve">1</w:t>
-            </w:r>
-          </w:p>
-        </w:tc>
-        <w:tc>
-          <w:tcPr/>
-          <w:p>
-            <w:pPr>
-              <w:pStyle w:val="Compact"/>
-              <w:jc w:val="center"/>
-            </w:pPr>
-            <m:oMath>
-              <m:r>
-                <m:t>1.59</m:t>
-              </m:r>
-              <m:r>
-                <m:rPr>
-                  <m:sty m:val="p"/>
-                </m:rPr>
-                <m:t>×</m:t>
-              </m:r>
-              <m:sSup>
-                <m:e>
-                  <m:r>
-                    <m:t>10</m:t>
-                  </m:r>
-                </m:e>
-                <m:sup>
-                  <m:r>
-                    <m:rPr>
-                      <m:sty m:val="p"/>
-                    </m:rPr>
-                    <m:t>−</m:t>
-                  </m:r>
-                  <m:r>
-                    <m:t>2</m:t>
-                  </m:r>
-                </m:sup>
-              </m:sSup>
-            </m:oMath>
-            <w:r>
-              <w:t xml:space="preserve">​</w:t>
-            </w:r>
-          </w:p>
-        </w:tc>
-        <w:tc>
-          <w:tcPr/>
-          <w:p>
-            <w:pPr>
-              <w:pStyle w:val="Compact"/>
-              <w:jc w:val="center"/>
-            </w:pPr>
-            <w:r>
-              <w:t xml:space="preserve">PASS</w:t>
-            </w:r>
-          </w:p>
-        </w:tc>
-        <w:tc>
-          <w:tcPr/>
-          <w:p>
-            <w:pPr>
-              <w:pStyle w:val="Compact"/>
-              <w:jc w:val="right"/>
-            </w:pPr>
-            <m:oMath>
-              <m:r>
-                <m:t>14.70</m:t>
-              </m:r>
-            </m:oMath>
-            <w:r>
-              <w:t xml:space="preserve">​</w:t>
-            </w:r>
-          </w:p>
-        </w:tc>
-        <w:tc>
-          <w:tcPr/>
-          <w:p>
-            <w:pPr>
-              <w:pStyle w:val="Compact"/>
-              <w:jc w:val="center"/>
-            </w:pPr>
-            <w:r>
-              <w:t xml:space="preserve">class</w:t>
-            </w:r>
-          </w:p>
-        </w:tc>
-        <w:tc>
-          <w:tcPr/>
-          <w:p>
-            <w:pPr>
-              <w:pStyle w:val="Compact"/>
-              <w:jc w:val="left"/>
-            </w:pPr>
-            <w:r>
-              <w:rPr>
-                <w:b/>
-                <w:bCs/>
-              </w:rPr>
-              <w:t xml:space="preserve">IDENTIFIABLE</w:t>
-            </w:r>
-          </w:p>
-        </w:tc>
-      </w:tr>
-      <w:tr>
-        <w:tc>
-          <w:tcPr/>
-          <w:p>
-            <w:pPr>
-              <w:pStyle w:val="Compact"/>
-              <w:jc w:val="left"/>
-            </w:pPr>
-            <w:r>
-              <w:t xml:space="preserve">Time Dilation (</w:t>
-            </w:r>
-            <m:oMath>
-              <m:r>
-                <m:t>v</m:t>
-              </m:r>
-              <m:r>
-                <m:rPr>
-                  <m:sty m:val="p"/>
-                </m:rPr>
-                <m:t>≤</m:t>
-              </m:r>
-              <m:r>
-                <m:t>0.3</m:t>
-              </m:r>
-              <m:r>
-                <m:t>c</m:t>
-              </m:r>
-            </m:oMath>
-            <w:r>
-              <w:t xml:space="preserve">)</w:t>
-            </w:r>
-          </w:p>
-        </w:tc>
-        <w:tc>
-          <w:tcPr/>
-          <w:p>
-            <w:pPr>
-              <w:pStyle w:val="Compact"/>
-              <w:jc w:val="left"/>
-            </w:pPr>
-            <m:oMath>
-              <m:sSub>
-                <m:e>
-                  <m:r>
-                    <m:t>θ</m:t>
-                  </m:r>
-                </m:e>
-                <m:sub>
-                  <m:r>
-                    <m:t>0</m:t>
-                  </m:r>
-                </m:sub>
-              </m:sSub>
-              <m:f>
-                <m:fPr>
-                  <m:type m:val="bar"/>
-                </m:fPr>
-                <m:num>
-                  <m:sSup>
-                    <m:e>
-                      <m:r>
-                        <m:t>v</m:t>
-                      </m:r>
-                    </m:e>
-                    <m:sup>
-                      <m:r>
-                        <m:t>2</m:t>
-                      </m:r>
-                    </m:sup>
-                  </m:sSup>
-                  <m:r>
-                    <m:rPr>
-                      <m:sty m:val="p"/>
-                    </m:rPr>
-                    <m:t>/</m:t>
-                  </m:r>
-                  <m:sSup>
-                    <m:e>
-                      <m:r>
-                        <m:t>c</m:t>
-                      </m:r>
-                    </m:e>
-                    <m:sup>
-                      <m:r>
-                        <m:t>2</m:t>
-                      </m:r>
-                    </m:sup>
-                  </m:sSup>
-                </m:num>
-                <m:den>
-                  <m:rad>
-                    <m:radPr>
-                      <m:degHide m:val="on"/>
-                    </m:radPr>
-                    <m:deg/>
-                    <m:e>
-                      <m:r>
-                        <m:t>1</m:t>
-                      </m:r>
-                      <m:r>
-                        <m:rPr>
-                          <m:sty m:val="p"/>
-                        </m:rPr>
-                        <m:t>−</m:t>
-                      </m:r>
-                      <m:sSup>
-                        <m:e>
-                          <m:r>
-                            <m:t>v</m:t>
-                          </m:r>
-                        </m:e>
-                        <m:sup>
-                          <m:r>
-                            <m:t>2</m:t>
-                          </m:r>
-                        </m:sup>
-                      </m:sSup>
-                      <m:r>
-                        <m:rPr>
-                          <m:sty m:val="p"/>
-                        </m:rPr>
-                        <m:t>/</m:t>
-                      </m:r>
-                      <m:sSup>
-                        <m:e>
-                          <m:r>
-                            <m:t>c</m:t>
-                          </m:r>
-                        </m:e>
-                        <m:sup>
-                          <m:r>
-                            <m:t>2</m:t>
-                          </m:r>
-                        </m:sup>
-                      </m:sSup>
-                    </m:e>
-                  </m:rad>
-                  <m:r>
-                    <m:rPr>
-                      <m:sty m:val="p"/>
-                    </m:rPr>
-                    <m:t>(</m:t>
-                  </m:r>
-                  <m:r>
-                    <m:t>1</m:t>
-                  </m:r>
-                  <m:r>
-                    <m:rPr>
-                      <m:sty m:val="p"/>
-                    </m:rPr>
-                    <m:t>+</m:t>
-                  </m:r>
-                  <m:rad>
-                    <m:radPr>
-                      <m:degHide m:val="on"/>
-                    </m:radPr>
-                    <m:deg/>
-                    <m:e>
-                      <m:r>
-                        <m:t>1</m:t>
-                      </m:r>
-                      <m:r>
-                        <m:rPr>
-                          <m:sty m:val="p"/>
-                        </m:rPr>
-                        <m:t>−</m:t>
-                      </m:r>
-                      <m:sSup>
-                        <m:e>
-                          <m:r>
-                            <m:t>v</m:t>
-                          </m:r>
-                        </m:e>
-                        <m:sup>
-                          <m:r>
-                            <m:t>2</m:t>
-                          </m:r>
-                        </m:sup>
-                      </m:sSup>
-                      <m:r>
-                        <m:rPr>
-                          <m:sty m:val="p"/>
-                        </m:rPr>
-                        <m:t>/</m:t>
-                      </m:r>
-                      <m:sSup>
-                        <m:e>
-                          <m:r>
-                            <m:t>c</m:t>
-                          </m:r>
-                        </m:e>
-                        <m:sup>
-                          <m:r>
-                            <m:t>2</m:t>
-                          </m:r>
-                        </m:sup>
-                      </m:sSup>
-                    </m:e>
-                  </m:rad>
-                  <m:r>
-                    <m:rPr>
-                      <m:sty m:val="p"/>
-                    </m:rPr>
-                    <m:t>)</m:t>
-                  </m:r>
-                </m:den>
-              </m:f>
-            </m:oMath>
-            <w:r>
-              <w:t xml:space="preserve">​</w:t>
-            </w:r>
-          </w:p>
-        </w:tc>
-        <w:tc>
-          <w:tcPr/>
-          <w:p>
-            <w:pPr>
-              <w:pStyle w:val="Compact"/>
-              <w:jc w:val="center"/>
-            </w:pPr>
-            <w:r>
-              <w:t xml:space="preserve">1</w:t>
-            </w:r>
-          </w:p>
-        </w:tc>
-        <w:tc>
-          <w:tcPr/>
-          <w:p>
-            <w:pPr>
-              <w:pStyle w:val="Compact"/>
-              <w:jc w:val="center"/>
-            </w:pPr>
-            <m:oMath>
-              <m:r>
-                <m:t>0.41</m:t>
-              </m:r>
-            </m:oMath>
-            <w:r>
-              <w:t xml:space="preserve">​</w:t>
-            </w:r>
-          </w:p>
-        </w:tc>
-        <w:tc>
-          <w:tcPr/>
-          <w:p>
-            <w:pPr>
-              <w:pStyle w:val="Compact"/>
-              <w:jc w:val="center"/>
-            </w:pPr>
-            <w:r>
-              <w:t xml:space="preserve">FAIL</w:t>
-            </w:r>
-          </w:p>
-        </w:tc>
-        <w:tc>
-          <w:tcPr/>
-          <w:p>
-            <w:pPr>
-              <w:pStyle w:val="Compact"/>
-              <w:jc w:val="right"/>
-            </w:pPr>
-            <m:oMath>
-              <m:r>
-                <m:t>13.79</m:t>
-              </m:r>
-            </m:oMath>
-            <w:r>
-              <w:t xml:space="preserve">​</w:t>
-            </w:r>
-          </w:p>
-        </w:tc>
-        <w:tc>
-          <w:tcPr/>
-          <w:p>
-            <w:pPr>
-              <w:pStyle w:val="Compact"/>
-              <w:jc w:val="center"/>
-            </w:pPr>
-            <w:r>
-              <w:t xml:space="preserve">class</w:t>
-            </w:r>
-          </w:p>
-        </w:tc>
-        <w:tc>
-          <w:tcPr/>
-          <w:p>
-            <w:pPr>
-              <w:pStyle w:val="Compact"/>
-              <w:jc w:val="left"/>
-            </w:pPr>
-            <w:r>
-              <w:rPr>
-                <w:b/>
-                <w:bCs/>
-              </w:rPr>
-              <w:t xml:space="preserve">WITHHELD</w:t>
-            </w:r>
-          </w:p>
-        </w:tc>
-      </w:tr>
-    </w:tbl>
-    <w:bookmarkEnd w:id="39"/>
     <w:p>
       <w:pPr>
         <w:pStyle w:val="Heading4"/>
       </w:pPr>
-      <w:bookmarkStart w:id="40" w:name="_1759a028cfb76cc1228f270093fe5555832d0a5"/>
+      <w:bookmarkStart w:id="33" w:name="_1759a028cfb76cc1228f270093fe5555832d0a5"/>
       <w:r>
         <w:t xml:space="preserve">Screened Coulomb.</w:t>
       </w:r>
-      <w:bookmarkEnd w:id="40"/>
+      <w:bookmarkEnd w:id="33"/>
     </w:p>
     <w:p>
       <w:pPr>
@@ -8292,18 +7356,122 @@
         <w:t xml:space="preserve"> </w:t>
       </w:r>
       <w:r>
-        <w:t xml:space="preserve">far exceeds the threshold of 10.</w:t>
+        <w:t xml:space="preserve">far exceeds the threshold of 10;</w:t>
+      </w:r>
+      <w:r>
+        <w:t xml:space="preserve"> </w:t>
+      </w:r>
+      <m:oMath>
+        <m:r>
+          <m:rPr>
+            <m:sty m:val="p"/>
+          </m:rPr>
+          <m:t>Δ</m:t>
+        </m:r>
+        <m:r>
+          <m:rPr>
+            <m:sty m:val="p"/>
+          </m:rPr>
+          <m:t>N</m:t>
+        </m:r>
+        <m:r>
+          <m:rPr>
+            <m:sty m:val="p"/>
+          </m:rPr>
+          <m:t>L</m:t>
+        </m:r>
+        <m:r>
+          <m:rPr>
+            <m:sty m:val="p"/>
+          </m:rPr>
+          <m:t>L</m:t>
+        </m:r>
+        <m:r>
+          <m:rPr>
+            <m:sty m:val="p"/>
+          </m:rPr>
+          <m:t>=</m:t>
+        </m:r>
+        <m:r>
+          <m:t>20.14</m:t>
+        </m:r>
+      </m:oMath>
+      <w:r>
+        <w:t xml:space="preserve"> </w:t>
+      </w:r>
+      <w:r>
+        <w:t xml:space="preserve">confirms the advantage is driven by fit quality,</w:t>
+      </w:r>
+      <w:r>
+        <w:t xml:space="preserve"> </w:t>
+      </w:r>
+      <w:r>
+        <w:t xml:space="preserve">not search-space penalty.</w:t>
+      </w:r>
+      <w:r>
+        <w:t xml:space="preserve"> </w:t>
+      </w:r>
+      <w:r>
+        <w:t xml:space="preserve">Over 5 noise seeds, the verdict is 100% stable (5/5 IDENTIFIABLE,</w:t>
+      </w:r>
+      <w:r>
+        <w:t xml:space="preserve"> </w:t>
+      </w:r>
+      <m:oMath>
+        <m:bar>
+          <m:barPr>
+            <m:pos m:val="top"/>
+          </m:barPr>
+          <m:e>
+            <m:r>
+              <m:rPr>
+                <m:sty m:val="p"/>
+              </m:rPr>
+              <m:t>Δ</m:t>
+            </m:r>
+            <m:r>
+              <m:rPr>
+                <m:sty m:val="p"/>
+              </m:rPr>
+              <m:t>N</m:t>
+            </m:r>
+            <m:r>
+              <m:rPr>
+                <m:sty m:val="p"/>
+              </m:rPr>
+              <m:t>L</m:t>
+            </m:r>
+            <m:r>
+              <m:rPr>
+                <m:sty m:val="p"/>
+              </m:rPr>
+              <m:t>L</m:t>
+            </m:r>
+          </m:e>
+        </m:bar>
+        <m:r>
+          <m:rPr>
+            <m:sty m:val="p"/>
+          </m:rPr>
+          <m:t>=</m:t>
+        </m:r>
+        <m:r>
+          <m:t>71.39</m:t>
+        </m:r>
+      </m:oMath>
+      <w:r>
+        <w:t xml:space="preserve">).</w:t>
       </w:r>
     </w:p>
     <w:p>
       <w:pPr>
         <w:pStyle w:val="Heading4"/>
       </w:pPr>
-      <w:bookmarkStart w:id="41" w:name="_3237b3bffd4a77c8d5c3040d985d2e630b331b1"/>
+      <w:bookmarkStart w:id="34" w:name="_3237b3bffd4a77c8d5c3040d985d2e630b331b1"/>
       <w:r>
         <w:t xml:space="preserve">Entropy Expansion.</w:t>
       </w:r>
-      <w:bookmarkEnd w:id="41"/>
+      <w:bookmarkEnd w:id="34"/>
     </w:p>
     <w:p>
       <w:pPr>
@@ -8648,18 +7816,208 @@
         <w:t xml:space="preserve"> </w:t>
       </w:r>
       <w:r>
-        <w:t xml:space="preserve">supports IDENTIFIABLE.</w:t>
+        <w:t xml:space="preserve">supports IDENTIFIABLE; however,</w:t>
+      </w:r>
+      <w:r>
+        <w:t xml:space="preserve"> </w:t>
+      </w:r>
+      <m:oMath>
+        <m:r>
+          <m:rPr>
+            <m:sty m:val="p"/>
+          </m:rPr>
+          <m:t>Δ</m:t>
+        </m:r>
+        <m:r>
+          <m:rPr>
+            <m:sty m:val="p"/>
+          </m:rPr>
+          <m:t>N</m:t>
+        </m:r>
+        <m:r>
+          <m:rPr>
+            <m:sty m:val="p"/>
+          </m:rPr>
+          <m:t>L</m:t>
+        </m:r>
+        <m:r>
+          <m:rPr>
+            <m:sty m:val="p"/>
+          </m:rPr>
+          <m:t>L</m:t>
+        </m:r>
+        <m:r>
+          <m:rPr>
+            <m:sty m:val="p"/>
+          </m:rPr>
+          <m:t>=</m:t>
+        </m:r>
+        <m:r>
+          <m:rPr>
+            <m:sty m:val="p"/>
+          </m:rPr>
+          <m:t>−</m:t>
+        </m:r>
+        <m:r>
+          <m:t>1.08</m:t>
+        </m:r>
+      </m:oMath>
+      <w:r>
+        <w:t xml:space="preserve"> </w:t>
+      </w:r>
+      <w:r>
+        <w:t xml:space="preserve">reveals the identifiability is</w:t>
+      </w:r>
+      <w:r>
+        <w:t xml:space="preserve"> </w:t>
+      </w:r>
+      <w:r>
+        <w:rPr>
+          <w:i/>
+          <w:iCs/>
+        </w:rPr>
+        <w:t xml:space="preserve">parsimony-driven</w:t>
+      </w:r>
+      <w:r>
+        <w:t xml:space="preserve">:</w:t>
+      </w:r>
+      <w:r>
+        <w:t xml:space="preserve"> </w:t>
+      </w:r>
+      <w:r>
+        <w:t xml:space="preserve">the ablated search achieves an equivalent raw fit with</w:t>
+      </w:r>
+      <w:r>
+        <w:t xml:space="preserve"> </w:t>
+      </w:r>
+      <m:oMath>
+        <m:r>
+          <m:t>k</m:t>
+        </m:r>
+        <m:r>
+          <m:rPr>
+            <m:sty m:val="p"/>
+          </m:rPr>
+          <m:t>=</m:t>
+        </m:r>
+        <m:r>
+          <m:t>3</m:t>
+        </m:r>
+      </m:oMath>
+      <w:r>
+        <w:t xml:space="preserve"> </w:t>
+      </w:r>
+      <w:r>
+        <w:t xml:space="preserve">parameters</w:t>
+      </w:r>
+      <w:r>
+        <w:t xml:space="preserve"> </w:t>
+      </w:r>
+      <w:r>
+        <w:t xml:space="preserve">versus</w:t>
+      </w:r>
+      <w:r>
+        <w:t xml:space="preserve"> </w:t>
+      </w:r>
+      <m:oMath>
+        <m:r>
+          <m:t>k</m:t>
+        </m:r>
+        <m:r>
+          <m:rPr>
+            <m:sty m:val="p"/>
+          </m:rPr>
+          <m:t>=</m:t>
+        </m:r>
+        <m:r>
+          <m:t>1</m:t>
+        </m:r>
+      </m:oMath>
+      <w:r>
+        <w:t xml:space="preserve"> </w:t>
+      </w:r>
+      <w:r>
+        <w:t xml:space="preserve">for the domain-guided model.</w:t>
+      </w:r>
+      <w:r>
+        <w:t xml:space="preserve"> </w:t>
+      </w:r>
+      <w:r>
+        <w:t xml:space="preserve">Over 5 noise seeds, the verdict is borderline (2/5 IDENTIFIABLE,</w:t>
+      </w:r>
+      <w:r>
+        <w:t xml:space="preserve"> </w:t>
+      </w:r>
+      <m:oMath>
+        <m:bar>
+          <m:barPr>
+            <m:pos m:val="top"/>
+          </m:barPr>
+          <m:e>
+            <m:r>
+              <m:rPr>
+                <m:sty m:val="p"/>
+              </m:rPr>
+              <m:t>Δ</m:t>
+            </m:r>
+            <m:r>
+              <m:rPr>
+                <m:sty m:val="p"/>
+              </m:rPr>
+              <m:t>B</m:t>
+            </m:r>
+            <m:r>
+              <m:rPr>
+                <m:sty m:val="p"/>
+              </m:rPr>
+              <m:t>I</m:t>
+            </m:r>
+            <m:r>
+              <m:rPr>
+                <m:sty m:val="p"/>
+              </m:rPr>
+              <m:t>C</m:t>
+            </m:r>
+          </m:e>
+        </m:bar>
+        <m:r>
+          <m:rPr>
+            <m:sty m:val="p"/>
+          </m:rPr>
+          <m:t>=</m:t>
+        </m:r>
+        <m:r>
+          <m:t>9.91</m:t>
+        </m:r>
+        <m:r>
+          <m:rPr>
+            <m:sty m:val="p"/>
+          </m:rPr>
+          <m:t>±</m:t>
+        </m:r>
+        <m:r>
+          <m:t>3.04</m:t>
+        </m:r>
+      </m:oMath>
+      <w:r>
+        <w:t xml:space="preserve">), confirming the logarithmic</w:t>
+      </w:r>
+      <w:r>
+        <w:t xml:space="preserve"> </w:t>
+      </w:r>
+      <w:r>
+        <w:t xml:space="preserve">correction sits at the decision boundary under 1% noise.</w:t>
       </w:r>
     </w:p>
     <w:p>
       <w:pPr>
         <w:pStyle w:val="Heading4"/>
       </w:pPr>
-      <w:bookmarkStart w:id="42" w:name="_6b969198ff632a49be3607158edcc3a004149c0"/>
+      <w:bookmarkStart w:id="35" w:name="_6b969198ff632a49be3607158edcc3a004149c0"/>
       <w:r>
         <w:t xml:space="preserve">Time Dilation.</w:t>
       </w:r>
-      <w:bookmarkEnd w:id="42"/>
+      <w:bookmarkEnd w:id="35"/>
     </w:p>
     <w:p>
       <w:pPr>
@@ -8963,16 +8321,22 @@
       <w:r>
         <w:t xml:space="preserve">The system outputs WITHHELD.</w:t>
       </w:r>
+      <w:r>
+        <w:t xml:space="preserve"> </w:t>
+      </w:r>
+      <w:r>
+        <w:t xml:space="preserve">Over 5 noise seeds, this verdict is 100% stable (5/5 WITHHELD).</w:t>
+      </w:r>
     </w:p>
     <w:p>
       <w:pPr>
         <w:pStyle w:val="Heading1"/>
       </w:pPr>
-      <w:bookmarkStart w:id="43" w:name="_discussion"/>
+      <w:bookmarkStart w:id="36" w:name="_discussion"/>
       <w:r>
         <w:t xml:space="preserve">Discussion</w:t>
       </w:r>
-      <w:bookmarkEnd w:id="43"/>
+      <w:bookmarkEnd w:id="36"/>
     </w:p>
     <w:p>
       <w:pPr>
@@ -9208,7 +8572,7 @@
           <w:rPr>
             <w:rStyle w:val="Hyperlink"/>
           </w:rPr>
-          <w:t xml:space="preserve">6</w:t>
+          <w:t xml:space="preserve">5</w:t>
         </w:r>
       </w:hyperlink>
       <w:r>
@@ -9298,6 +8662,41 @@
       </w:r>
       <w:r>
         <w:t xml:space="preserve">by any taxonomy entry.</w:t>
+      </w:r>
+      <w:r>
+        <w:t xml:space="preserve"> </w:t>
+      </w:r>
+      <w:r>
+        <w:t xml:space="preserve">A</w:t>
+      </w:r>
+      <w:r>
+        <w:t xml:space="preserve"> </w:t>
+      </w:r>
+      <m:oMath>
+        <m:r>
+          <m:t>3</m:t>
+        </m:r>
+        <m:r>
+          <m:rPr>
+            <m:sty m:val="p"/>
+          </m:rPr>
+          <m:t>×</m:t>
+        </m:r>
+        <m:r>
+          <m:t>3</m:t>
+        </m:r>
+      </m:oMath>
+      <w:r>
+        <w:t xml:space="preserve"> </w:t>
+      </w:r>
+      <w:r>
+        <w:t xml:space="preserve">misspecification audit confirms the taxonomy is safe:</w:t>
+      </w:r>
+      <w:r>
+        <w:t xml:space="preserve"> </w:t>
+      </w:r>
+      <w:r>
+        <w:t xml:space="preserve">all 6 wrong-taxonomy trials yielded WITHHELD (0% false discovery).</w:t>
       </w:r>
     </w:p>
     <w:p>
@@ -9346,7 +8745,7 @@
           <w:rPr>
             <w:rStyle w:val="Hyperlink"/>
           </w:rPr>
-          <w:t xml:space="preserve">6</w:t>
+          <w:t xml:space="preserve">5</w:t>
         </w:r>
       </w:hyperlink>
       <w:r>
@@ -9356,7 +8755,73 @@
         <w:t xml:space="preserve">summarises the operational regimes.</w:t>
       </w:r>
     </w:p>
-    <w:bookmarkStart w:id="44" w:name="_96aeef6d635a29d310fd6bb56863d841e90bdd0"/>
+    <w:p>
+      <w:pPr>
+        <w:pStyle w:val="BodyText"/>
+      </w:pPr>
+      <w:r>
+        <w:rPr>
+          <w:b/>
+          <w:bCs/>
+        </w:rPr>
+        <w:t xml:space="preserve">Principle-guided discovery vs. black-box prediction.</w:t>
+      </w:r>
+      <w:r>
+        <w:t xml:space="preserve"> </w:t>
+      </w:r>
+      <w:r>
+        <w:t xml:space="preserve">Recent perspectives on AI for physics highlight a crucial epistemic challenge:</w:t>
+      </w:r>
+      <w:r>
+        <w:t xml:space="preserve"> </w:t>
+      </w:r>
+      <w:r>
+        <w:t xml:space="preserve">while modern AI excels at high-dimensional predictive emulation, true physical theory</w:t>
+      </w:r>
+      <w:r>
+        <w:t xml:space="preserve"> </w:t>
+      </w:r>
+      <w:r>
+        <w:t xml:space="preserve">building requires compact mathematical laws, symmetry invariance, and controlled asymptotic</w:t>
+      </w:r>
+      <w:r>
+        <w:t xml:space="preserve"> </w:t>
+      </w:r>
+      <w:r>
+        <w:t xml:space="preserve">regimes </w:t>
+      </w:r>
+      <w:r>
+        <w:t xml:space="preserve">(Shalyt et al. 2026)</w:t>
+      </w:r>
+      <w:r>
+        <w:t xml:space="preserve">.</w:t>
+      </w:r>
+      <w:r>
+        <w:t xml:space="preserve"> </w:t>
+      </w:r>
+      <w:r>
+        <w:t xml:space="preserve">ADCD explicitly embodies this principle-first paradigm: rather than performing unconstrained</w:t>
+      </w:r>
+      <w:r>
+        <w:t xml:space="preserve"> </w:t>
+      </w:r>
+      <w:r>
+        <w:t xml:space="preserve">curve-fitting, it converts physical correction discovery into an exact, dimensionally</w:t>
+      </w:r>
+      <w:r>
+        <w:t xml:space="preserve"> </w:t>
+      </w:r>
+      <w:r>
+        <w:t xml:space="preserve">consistent perturbation search anchored to established baselines and audited by falsifiable</w:t>
+      </w:r>
+      <w:r>
+        <w:t xml:space="preserve"> </w:t>
+      </w:r>
+      <w:r>
+        <w:t xml:space="preserve">identifiability metrics.</w:t>
+      </w:r>
+    </w:p>
+    <w:bookmarkStart w:id="37" w:name="_96aeef6d635a29d310fd6bb56863d841e90bdd0"/>
     <w:p>
       <w:pPr>
         <w:pStyle w:val="TableCaption"/>
@@ -9658,16 +9123,16 @@
         </w:tc>
       </w:tr>
     </w:tbl>
-    <w:bookmarkEnd w:id="44"/>
+    <w:bookmarkEnd w:id="37"/>
     <w:p>
       <w:pPr>
         <w:pStyle w:val="Heading2"/>
       </w:pPr>
-      <w:bookmarkStart w:id="45" w:name="_9ec194be0a3e630d64226647765ad9b11c91126"/>
+      <w:bookmarkStart w:id="38" w:name="_9ec194be0a3e630d64226647765ad9b11c91126"/>
       <w:r>
         <w:t xml:space="preserve">Limitations</w:t>
       </w:r>
-      <w:bookmarkEnd w:id="45"/>
+      <w:bookmarkEnd w:id="38"/>
     </w:p>
     <w:p>
       <w:pPr>
@@ -9821,13 +9286,49 @@
     </w:p>
     <w:p>
       <w:pPr>
+        <w:pStyle w:val="BodyText"/>
+      </w:pPr>
+      <w:r>
+        <w:rPr>
+          <w:b/>
+          <w:bCs/>
+        </w:rPr>
+        <w:t xml:space="preserve">Seed stability of borderline verdicts.</w:t>
+      </w:r>
+      <w:r>
+        <w:t xml:space="preserve"> </w:t>
+      </w:r>
+      <w:r>
+        <w:t xml:space="preserve">Entropy Expansion’s verdict varies across noise realizations (2/5 IDENTIFIABLE,</w:t>
+      </w:r>
+      <w:r>
+        <w:t xml:space="preserve"> </w:t>
+      </w:r>
+      <w:r>
+        <w:t xml:space="preserve">3/5 WITHHELD), indicating the logarithmic correction sits at the identifiability</w:t>
+      </w:r>
+      <w:r>
+        <w:t xml:space="preserve"> </w:t>
+      </w:r>
+      <w:r>
+        <w:t xml:space="preserve">boundary under 1% noise.</w:t>
+      </w:r>
+      <w:r>
+        <w:t xml:space="preserve"> </w:t>
+      </w:r>
+      <w:r>
+        <w:t xml:space="preserve">We report this transparently as a limitation of the current noise regime.</w:t>
+      </w:r>
+    </w:p>
+    <w:p>
+      <w:pPr>
         <w:pStyle w:val="Heading1"/>
       </w:pPr>
-      <w:bookmarkStart w:id="46" w:name="_conclusion"/>
+      <w:bookmarkStart w:id="39" w:name="_conclusion"/>
       <w:r>
         <w:t xml:space="preserve">Conclusion</w:t>
       </w:r>
-      <w:bookmarkEnd w:id="46"/>
+      <w:bookmarkEnd w:id="39"/>
     </w:p>
     <w:p>
       <w:pPr>
@@ -10070,13 +9571,39 @@
     </w:p>
     <w:p>
       <w:pPr>
+        <w:pStyle w:val="FirstParagraph"/>
+      </w:pPr>
+      <w:r>
+        <w:t xml:space="preserve">The author thanks the anonymous NewInML reviewers for constructive feedback</w:t>
+      </w:r>
+      <w:r>
+        <w:t xml:space="preserve"> </w:t>
+      </w:r>
+      <w:r>
+        <w:t xml:space="preserve">that motivated the BIC decomposition, multi-seed stability, and taxonomy</w:t>
+      </w:r>
+      <w:r>
+        <w:t xml:space="preserve"> </w:t>
+      </w:r>
+      <w:r>
+        <w:t xml:space="preserve">misspecification analyses incorporated into this camera-ready version.</w:t>
+      </w:r>
+      <w:r>
+        <w:t xml:space="preserve"> </w:t>
+      </w:r>
+      <w:r>
+        <w:t xml:space="preserve">No external funding was received for this work.</w:t>
+      </w:r>
+    </w:p>
+    <w:p>
+      <w:pPr>
         <w:pStyle w:val="Heading1"/>
       </w:pPr>
-      <w:bookmarkStart w:id="47" w:name="_d6dc127f91df9bcc46c1702cd683a760cc63be4"/>
+      <w:bookmarkStart w:id="40" w:name="_d6dc127f91df9bcc46c1702cd683a760cc63be4"/>
       <w:r>
         <w:t xml:space="preserve">Use of AI-Assisted Tools</w:t>
       </w:r>
-      <w:bookmarkEnd w:id="47"/>
+      <w:bookmarkEnd w:id="40"/>
     </w:p>
     <w:p>
       <w:pPr>
@@ -10113,12 +9640,12 @@
         <w:t xml:space="preserve"> </w:t>
       </w:r>
       <w:r>
-        <w:t xml:space="preserve">The codebase and raw validation logs are available at</w:t>
-      </w:r>
-      <w:r>
-        <w:t xml:space="preserve"> </w:t>
-      </w:r>
-      <w:hyperlink r:id="rId48">
+        <w:t xml:space="preserve">The codebase and raw validation logs are publicly available at</w:t>
+      </w:r>
+      <w:r>
+        <w:t xml:space="preserve"> </w:t>
+      </w:r>
+      <w:hyperlink r:id="rId41">
         <w:r>
           <w:rPr>
             <w:rStyle w:val="Hyperlink"/>
@@ -10134,11 +9661,11 @@
       <w:pPr>
         <w:pStyle w:val="Heading1"/>
       </w:pPr>
-      <w:bookmarkStart w:id="49" w:name="_ea5c66868f283220c19382d0fdd5a852ec570ca"/>
+      <w:bookmarkStart w:id="42" w:name="_ea5c66868f283220c19382d0fdd5a852ec570ca"/>
       <w:r>
         <w:t xml:space="preserve">Data Availability</w:t>
       </w:r>
-      <w:bookmarkEnd w:id="49"/>
+      <w:bookmarkEnd w:id="42"/>
     </w:p>
     <w:p>
       <w:pPr>
@@ -10160,8 +9687,8 @@
         <w:t xml:space="preserve">No proprietary or restricted datasets are used.</w:t>
       </w:r>
     </w:p>
-    <w:bookmarkStart w:id="84" w:name="_refs"/>
-    <w:bookmarkStart w:id="51" w:name="_4821a1adf58ef0c96a762a09b8aff3e5f2fbdd2"/>
+    <w:bookmarkStart w:id="97" w:name="_refs"/>
+    <w:bookmarkStart w:id="44" w:name="_4821a1adf58ef0c96a762a09b8aff3e5f2fbdd2"/>
     <w:p>
       <w:pPr>
         <w:pStyle w:val="Bibliography"/>
@@ -10195,7 +9722,7 @@
       <w:r>
         <w:t xml:space="preserve"> </w:t>
       </w:r>
-      <w:hyperlink r:id="rId50">
+      <w:hyperlink r:id="rId43">
         <w:r>
           <w:rPr>
             <w:rStyle w:val="Hyperlink"/>
@@ -10207,8 +9734,8 @@
         <w:t xml:space="preserve">.</w:t>
       </w:r>
     </w:p>
-    <w:bookmarkEnd w:id="51"/>
-    <w:bookmarkStart w:id="53" w:name="_972595d462a57f288069c0989f06ae98b9776ca"/>
+    <w:bookmarkEnd w:id="44"/>
+    <w:bookmarkStart w:id="46" w:name="_972595d462a57f288069c0989f06ae98b9776ca"/>
     <w:p>
       <w:pPr>
         <w:pStyle w:val="Bibliography"/>
@@ -10242,7 +9769,7 @@
       <w:r>
         <w:t xml:space="preserve"> </w:t>
       </w:r>
-      <w:hyperlink r:id="rId52">
+      <w:hyperlink r:id="rId45">
         <w:r>
           <w:rPr>
             <w:rStyle w:val="Hyperlink"/>
@@ -10254,8 +9781,8 @@
         <w:t xml:space="preserve">.</w:t>
       </w:r>
     </w:p>
-    <w:bookmarkEnd w:id="53"/>
-    <w:bookmarkStart w:id="54" w:name="_5a7bf24f795849e5e5e3120cac41566a0db05ce"/>
+    <w:bookmarkEnd w:id="46"/>
+    <w:bookmarkStart w:id="47" w:name="_5a7bf24f795849e5e5e3120cac41566a0db05ce"/>
     <w:p>
       <w:pPr>
         <w:pStyle w:val="Bibliography"/>
@@ -10278,14 +9805,61 @@
         <w:t xml:space="preserve">. 2nd ed. Wiley.</w:t>
       </w:r>
     </w:p>
-    <w:bookmarkEnd w:id="54"/>
-    <w:bookmarkStart w:id="55" w:name="_1f20afe20d89a70b30df817a6a432dd3d531798"/>
+    <w:bookmarkEnd w:id="47"/>
+    <w:bookmarkStart w:id="49" w:name="_527bc24a5bc63163e89c9230bde2b620b0637aa"/>
     <w:p>
       <w:pPr>
         <w:pStyle w:val="Bibliography"/>
         <w:ind w:left="720" w:hanging="720"/>
       </w:pPr>
       <w:r>
+        <w:t xml:space="preserve">Carleo, Giuseppe, Ignacio Cirac, Kyle Cranmer, et al. 2019.</w:t>
+      </w:r>
+      <w:r>
+        <w:t xml:space="preserve"> </w:t>
+      </w:r>
+      <w:r>
+        <w:t xml:space="preserve">“Machine Learning and the Physical Sciences.”</w:t>
+      </w:r>
+      <w:r>
+        <w:t xml:space="preserve"> </w:t>
+      </w:r>
+      <w:r>
+        <w:rPr>
+          <w:i/>
+          <w:iCs/>
+        </w:rPr>
+        <w:t xml:space="preserve">Reviews of Modern Physics</w:t>
+      </w:r>
+      <w:r>
+        <w:t xml:space="preserve"> </w:t>
+      </w:r>
+      <w:r>
+        <w:t xml:space="preserve">91 (4): 045002.</w:t>
+      </w:r>
+      <w:r>
+        <w:t xml:space="preserve"> </w:t>
+      </w:r>
+      <w:hyperlink r:id="rId48">
+        <w:r>
+          <w:rPr>
+            <w:rStyle w:val="Hyperlink"/>
+          </w:rPr>
+          <w:t xml:space="preserve">https://doi.org/10.1103/RevModPhys.91.045002</w:t>
+        </w:r>
+      </w:hyperlink>
+      <w:r>
+        <w:t xml:space="preserve">.</w:t>
+      </w:r>
+    </w:p>
+    <w:bookmarkEnd w:id="49"/>
+    <w:bookmarkStart w:id="50" w:name="_1f20afe20d89a70b30df817a6a432dd3d531798"/>
+    <w:p>
+      <w:pPr>
+        <w:pStyle w:val="Bibliography"/>
+        <w:ind w:left="720" w:hanging="720"/>
+      </w:pPr>
+      <w:r>
         <w:t xml:space="preserve">Chen, Jiahua, and Zehua Chen. 2008.</w:t>
       </w:r>
       <w:r>
@@ -10311,8 +9885,8 @@
         <w:t xml:space="preserve">95 (3): 759–71.</w:t>
       </w:r>
     </w:p>
-    <w:bookmarkEnd w:id="55"/>
-    <w:bookmarkStart w:id="57" w:name="_1aa4da2289bc40a24eeb1e679cede6f8870fdd8"/>
+    <w:bookmarkEnd w:id="50"/>
+    <w:bookmarkStart w:id="52" w:name="_1aa4da2289bc40a24eeb1e679cede6f8870fdd8"/>
     <w:p>
       <w:pPr>
         <w:pStyle w:val="Bibliography"/>
@@ -10355,7 +9929,7 @@
       <w:r>
         <w:t xml:space="preserve"> </w:t>
       </w:r>
-      <w:hyperlink r:id="rId56">
+      <w:hyperlink r:id="rId51">
         <w:r>
           <w:rPr>
             <w:rStyle w:val="Hyperlink"/>
@@ -10367,14 +9941,70 @@
         <w:t xml:space="preserve">.</w:t>
       </w:r>
     </w:p>
-    <w:bookmarkEnd w:id="57"/>
-    <w:bookmarkStart w:id="59" w:name="_57bb1749bce326fa5cfd4da4d6d25d6b6384540"/>
+    <w:bookmarkEnd w:id="52"/>
+    <w:bookmarkStart w:id="54" w:name="_47fce09a41d36943dba5ee88797fd7a28ead209"/>
     <w:p>
       <w:pPr>
         <w:pStyle w:val="Bibliography"/>
         <w:ind w:left="720" w:hanging="720"/>
       </w:pPr>
       <w:r>
+        <w:t xml:space="preserve">Cory-Wright, Ryan, Cristina Cornelio, Sanjeeb Dash, Maryam Fardad, and Lior Horesh. 2024.</w:t>
+      </w:r>
+      <w:r>
+        <w:t xml:space="preserve"> </w:t>
+      </w:r>
+      <w:r>
+        <w:t xml:space="preserve">“Evolving Scientific Discovery by Unifying Data and Background Knowledge with</w:t>
+      </w:r>
+      <w:r>
+        <w:t xml:space="preserve"> </w:t>
+      </w:r>
+      <w:r>
+        <w:t xml:space="preserve">AI Hilbert</w:t>
+      </w:r>
+      <w:r>
+        <w:t xml:space="preserve">.”</w:t>
+      </w:r>
+      <w:r>
+        <w:t xml:space="preserve"> </w:t>
+      </w:r>
+      <w:r>
+        <w:rPr>
+          <w:i/>
+          <w:iCs/>
+        </w:rPr>
+        <w:t xml:space="preserve">Nature Communications</w:t>
+      </w:r>
+      <w:r>
+        <w:t xml:space="preserve"> </w:t>
+      </w:r>
+      <w:r>
+        <w:t xml:space="preserve">15: 5922.</w:t>
+      </w:r>
+      <w:r>
+        <w:t xml:space="preserve"> </w:t>
+      </w:r>
+      <w:hyperlink r:id="rId53">
+        <w:r>
+          <w:rPr>
+            <w:rStyle w:val="Hyperlink"/>
+          </w:rPr>
+          <w:t xml:space="preserve">https://doi.org/10.1038/s41467-024-50143-6</w:t>
+        </w:r>
+      </w:hyperlink>
+      <w:r>
+        <w:t xml:space="preserve">.</w:t>
+      </w:r>
+    </w:p>
+    <w:bookmarkEnd w:id="54"/>
+    <w:bookmarkStart w:id="56" w:name="_57bb1749bce326fa5cfd4da4d6d25d6b6384540"/>
+    <w:p>
+      <w:pPr>
+        <w:pStyle w:val="Bibliography"/>
+        <w:ind w:left="720" w:hanging="720"/>
+      </w:pPr>
+      <w:r>
         <w:t xml:space="preserve">Cranmer, Miles. 2023.</w:t>
       </w:r>
       <w:r>
@@ -10435,7 +10065,7 @@
       <w:r>
         <w:t xml:space="preserve"> </w:t>
       </w:r>
-      <w:hyperlink r:id="rId58">
+      <w:hyperlink r:id="rId55">
         <w:r>
           <w:rPr>
             <w:rStyle w:val="Hyperlink"/>
@@ -10447,14 +10077,47 @@
         <w:t xml:space="preserve">.</w:t>
       </w:r>
     </w:p>
-    <w:bookmarkEnd w:id="59"/>
-    <w:bookmarkStart w:id="60" w:name="_5baff60950e3fd28de2def13fedece90097bde2"/>
+    <w:bookmarkEnd w:id="56"/>
+    <w:bookmarkStart w:id="57" w:name="_3dffa07bf7d9f10c2c4fc62ba3207e235802136"/>
     <w:p>
       <w:pPr>
         <w:pStyle w:val="Bibliography"/>
         <w:ind w:left="720" w:hanging="720"/>
       </w:pPr>
       <w:r>
+        <w:t xml:space="preserve">Cranmer, Miles, Alvaro Sanchez-Gonzalez, Peter Battaglia, et al. 2020.</w:t>
+      </w:r>
+      <w:r>
+        <w:t xml:space="preserve"> </w:t>
+      </w:r>
+      <w:r>
+        <w:t xml:space="preserve">“Discovering Symbolic Models from Deep Learning with Inductive Biases.”</w:t>
+      </w:r>
+      <w:r>
+        <w:t xml:space="preserve"> </w:t>
+      </w:r>
+      <w:r>
+        <w:rPr>
+          <w:i/>
+          <w:iCs/>
+        </w:rPr>
+        <w:t xml:space="preserve">Advances in Neural Information Processing Systems</w:t>
+      </w:r>
+      <w:r>
+        <w:t xml:space="preserve"> </w:t>
+      </w:r>
+      <w:r>
+        <w:t xml:space="preserve">33: 17429–42.</w:t>
+      </w:r>
+    </w:p>
+    <w:bookmarkEnd w:id="57"/>
+    <w:bookmarkStart w:id="58" w:name="_5baff60950e3fd28de2def13fedece90097bde2"/>
+    <w:p>
+      <w:pPr>
+        <w:pStyle w:val="Bibliography"/>
+        <w:ind w:left="720" w:hanging="720"/>
+      </w:pPr>
+      <w:r>
         <w:t xml:space="preserve">Debye, Peter, and Erich Hückel. 1923.</w:t>
       </w:r>
       <w:r>
@@ -10486,8 +10149,8 @@
         <w:t xml:space="preserve">24: 185–206.</w:t>
       </w:r>
     </w:p>
-    <w:bookmarkEnd w:id="60"/>
-    <w:bookmarkStart w:id="62" w:name="_54fc4244cf878bc882c58757acab17cf0f1de4b"/>
+    <w:bookmarkEnd w:id="58"/>
+    <w:bookmarkStart w:id="60" w:name="_54fc4244cf878bc882c58757acab17cf0f1de4b"/>
     <w:p>
       <w:pPr>
         <w:pStyle w:val="Bibliography"/>
@@ -10527,7 +10190,7 @@
       <w:r>
         <w:t xml:space="preserve"> </w:t>
       </w:r>
-      <w:hyperlink r:id="rId61">
+      <w:hyperlink r:id="rId59">
         <w:r>
           <w:rPr>
             <w:rStyle w:val="Hyperlink"/>
@@ -10539,8 +10202,8 @@
         <w:t xml:space="preserve">.</w:t>
       </w:r>
     </w:p>
-    <w:bookmarkEnd w:id="62"/>
-    <w:bookmarkStart w:id="64" w:name="_6d9de38ad2303b748f9514fcc69957dc59bffcf"/>
+    <w:bookmarkEnd w:id="60"/>
+    <w:bookmarkStart w:id="62" w:name="_6d9de38ad2303b748f9514fcc69957dc59bffcf"/>
     <w:p>
       <w:pPr>
         <w:pStyle w:val="Bibliography"/>
@@ -10572,12 +10235,59 @@
       <w:r>
         <w:t xml:space="preserve"> </w:t>
       </w:r>
+      <w:hyperlink r:id="rId61">
+        <w:r>
+          <w:rPr>
+            <w:rStyle w:val="Hyperlink"/>
+          </w:rPr>
+          <w:t xml:space="preserve">https://doi.org/10.1109/IEEESTD.2019.8766229</w:t>
+        </w:r>
+      </w:hyperlink>
+      <w:r>
+        <w:t xml:space="preserve">.</w:t>
+      </w:r>
+    </w:p>
+    <w:bookmarkEnd w:id="62"/>
+    <w:bookmarkStart w:id="64" w:name="_7d626b01f070f825f964e2471844a68b8b1a8c0"/>
+    <w:p>
+      <w:pPr>
+        <w:pStyle w:val="Bibliography"/>
+        <w:ind w:left="720" w:hanging="720"/>
+      </w:pPr>
+      <w:r>
+        <w:t xml:space="preserve">Karagiorgi, Georgia, Gregor Kasieczka, Scott Kravitz, Benjamin Nachman, and David Shih. 2022.</w:t>
+      </w:r>
+      <w:r>
+        <w:t xml:space="preserve"> </w:t>
+      </w:r>
+      <w:r>
+        <w:t xml:space="preserve">“Machine Learning in the Search for New Fundamental Physics.”</w:t>
+      </w:r>
+      <w:r>
+        <w:t xml:space="preserve"> </w:t>
+      </w:r>
+      <w:r>
+        <w:rPr>
+          <w:i/>
+          <w:iCs/>
+        </w:rPr>
+        <w:t xml:space="preserve">Nature Reviews Physics</w:t>
+      </w:r>
+      <w:r>
+        <w:t xml:space="preserve"> </w:t>
+      </w:r>
+      <w:r>
+        <w:t xml:space="preserve">4 (6): 399–412.</w:t>
+      </w:r>
+      <w:r>
+        <w:t xml:space="preserve"> </w:t>
+      </w:r>
       <w:hyperlink r:id="rId63">
         <w:r>
           <w:rPr>
             <w:rStyle w:val="Hyperlink"/>
           </w:rPr>
-          <w:t xml:space="preserve">https://doi.org/10.1109/IEEESTD.2019.8766229</w:t>
+          <w:t xml:space="preserve">https://doi.org/10.1038/s42254-022-00455-1</w:t>
         </w:r>
       </w:hyperlink>
       <w:r>
@@ -10679,13 +10389,107 @@
       </w:r>
     </w:p>
     <w:bookmarkEnd w:id="68"/>
-    <w:bookmarkStart w:id="70" w:name="_111554707e6767316c8b5ff11c385e98243c247"/>
+    <w:bookmarkStart w:id="70" w:name="_1900e79b43a611181bec25bb8fa080110cfe3b3"/>
     <w:p>
       <w:pPr>
         <w:pStyle w:val="Bibliography"/>
         <w:ind w:left="720" w:hanging="720"/>
       </w:pPr>
       <w:r>
+        <w:t xml:space="preserve">Kramer, Stefan, Marco Cerrato, Jannis Brugger, Sašo Džeroski, and Ross D. King. 2026.</w:t>
+      </w:r>
+      <w:r>
+        <w:t xml:space="preserve"> </w:t>
+      </w:r>
+      <w:r>
+        <w:t xml:space="preserve">“Automated Scientific Discovery: From Equation Discovery to Autonomous Discovery Systems.”</w:t>
+      </w:r>
+      <w:r>
+        <w:t xml:space="preserve"> </w:t>
+      </w:r>
+      <w:r>
+        <w:rPr>
+          <w:i/>
+          <w:iCs/>
+        </w:rPr>
+        <w:t xml:space="preserve">Machine Learning</w:t>
+      </w:r>
+      <w:r>
+        <w:t xml:space="preserve"> </w:t>
+      </w:r>
+      <w:r>
+        <w:t xml:space="preserve">115: 109.</w:t>
+      </w:r>
+      <w:r>
+        <w:t xml:space="preserve"> </w:t>
+      </w:r>
+      <w:hyperlink r:id="rId69">
+        <w:r>
+          <w:rPr>
+            <w:rStyle w:val="Hyperlink"/>
+          </w:rPr>
+          <w:t xml:space="preserve">https://doi.org/10.1007/s10994-025-06721-6</w:t>
+        </w:r>
+      </w:hyperlink>
+      <w:r>
+        <w:t xml:space="preserve">.</w:t>
+      </w:r>
+    </w:p>
+    <w:bookmarkEnd w:id="70"/>
+    <w:bookmarkStart w:id="72" w:name="_706d685f658d8e4e7854a745bc539622c68d316"/>
+    <w:p>
+      <w:pPr>
+        <w:pStyle w:val="Bibliography"/>
+        <w:ind w:left="720" w:hanging="720"/>
+      </w:pPr>
+      <w:r>
+        <w:t xml:space="preserve">Krenn, Mario, Robert Pollice, Florian Häse, Pascal Friederich, and Alán Aspuru-Guzik. 2022.</w:t>
+      </w:r>
+      <w:r>
+        <w:t xml:space="preserve"> </w:t>
+      </w:r>
+      <w:r>
+        <w:t xml:space="preserve">“On Scientific Understanding with Artificial Intelligence.”</w:t>
+      </w:r>
+      <w:r>
+        <w:t xml:space="preserve"> </w:t>
+      </w:r>
+      <w:r>
+        <w:rPr>
+          <w:i/>
+          <w:iCs/>
+        </w:rPr>
+        <w:t xml:space="preserve">Nature Reviews Physics</w:t>
+      </w:r>
+      <w:r>
+        <w:t xml:space="preserve"> </w:t>
+      </w:r>
+      <w:r>
+        <w:t xml:space="preserve">4 (12): 761–69.</w:t>
+      </w:r>
+      <w:r>
+        <w:t xml:space="preserve"> </w:t>
+      </w:r>
+      <w:hyperlink r:id="rId71">
+        <w:r>
+          <w:rPr>
+            <w:rStyle w:val="Hyperlink"/>
+          </w:rPr>
+          <w:t xml:space="preserve">https://doi.org/10.1038/s42254-022-00518-3</w:t>
+        </w:r>
+      </w:hyperlink>
+      <w:r>
+        <w:t xml:space="preserve">.</w:t>
+      </w:r>
+    </w:p>
+    <w:bookmarkEnd w:id="72"/>
+    <w:bookmarkStart w:id="74" w:name="_111554707e6767316c8b5ff11c385e98243c247"/>
+    <w:p>
+      <w:pPr>
+        <w:pStyle w:val="Bibliography"/>
+        <w:ind w:left="720" w:hanging="720"/>
+      </w:pPr>
+      <w:r>
         <w:t xml:space="preserve">La Cava, William, Patryk Orzechowski, Bogdan Burlacu, et al. 2021.</w:t>
       </w:r>
       <w:r>
@@ -10713,7 +10517,7 @@
       <w:r>
         <w:t xml:space="preserve"> </w:t>
       </w:r>
-      <w:hyperlink r:id="rId69">
+      <w:hyperlink r:id="rId73">
         <w:r>
           <w:rPr>
             <w:rStyle w:val="Hyperlink"/>
@@ -10725,14 +10529,148 @@
         <w:t xml:space="preserve">.</w:t>
       </w:r>
     </w:p>
-    <w:bookmarkEnd w:id="70"/>
-    <w:bookmarkStart w:id="72" w:name="_ef604ae533fad333bc697748e3dc0fd28f0aa78"/>
+    <w:bookmarkEnd w:id="74"/>
+    <w:bookmarkStart w:id="75" w:name="_3eeecacc9a76ececfb93de6eecd116041e12250"/>
     <w:p>
       <w:pPr>
         <w:pStyle w:val="Bibliography"/>
         <w:ind w:left="720" w:hanging="720"/>
       </w:pPr>
       <w:r>
+        <w:t xml:space="preserve">Langley, Pat, Herbert A. Simon, Gary L. Bradshaw, and Jan M. Zytkow. 1987.</w:t>
+      </w:r>
+      <w:r>
+        <w:t xml:space="preserve"> </w:t>
+      </w:r>
+      <w:r>
+        <w:rPr>
+          <w:i/>
+          <w:iCs/>
+        </w:rPr>
+        <w:t xml:space="preserve">Scientific Discovery: Computational Explorations of the Creative Process</w:t>
+      </w:r>
+      <w:r>
+        <w:t xml:space="preserve">. MIT Press.</w:t>
+      </w:r>
+    </w:p>
+    <w:bookmarkEnd w:id="75"/>
+    <w:bookmarkStart w:id="76" w:name="_487adff8243fba59e6cf717edc54005140a48bd"/>
+    <w:p>
+      <w:pPr>
+        <w:pStyle w:val="Bibliography"/>
+        <w:ind w:left="720" w:hanging="720"/>
+      </w:pPr>
+      <w:r>
+        <w:t xml:space="preserve">Makke, Nour, and Sanjay Chawla. 2024.</w:t>
+      </w:r>
+      <w:r>
+        <w:t xml:space="preserve"> </w:t>
+      </w:r>
+      <w:r>
+        <w:t xml:space="preserve">“A Perspective on Symbolic Machine Learning in Physical Sciences.”</w:t>
+      </w:r>
+      <w:r>
+        <w:t xml:space="preserve"> </w:t>
+      </w:r>
+      <w:r>
+        <w:rPr>
+          <w:i/>
+          <w:iCs/>
+        </w:rPr>
+        <w:t xml:space="preserve">NeurIPS 2024 Workshop on Machine Learning and the Physical Sciences</w:t>
+      </w:r>
+      <w:r>
+        <w:t xml:space="preserve">.</w:t>
+      </w:r>
+    </w:p>
+    <w:bookmarkEnd w:id="76"/>
+    <w:bookmarkStart w:id="78" w:name="_91b59947130ffdd5d02deab777df77813338c35"/>
+    <w:p>
+      <w:pPr>
+        <w:pStyle w:val="Bibliography"/>
+        <w:ind w:left="720" w:hanging="720"/>
+      </w:pPr>
+      <w:r>
+        <w:t xml:space="preserve">Messeri, Lisa, and M. J. Crockett. 2024.</w:t>
+      </w:r>
+      <w:r>
+        <w:t xml:space="preserve"> </w:t>
+      </w:r>
+      <w:r>
+        <w:t xml:space="preserve">“Artificial Intelligence and Illusions of Understanding in Scientific Research.”</w:t>
+      </w:r>
+      <w:r>
+        <w:t xml:space="preserve"> </w:t>
+      </w:r>
+      <w:r>
+        <w:rPr>
+          <w:i/>
+          <w:iCs/>
+        </w:rPr>
+        <w:t xml:space="preserve">Nature</w:t>
+      </w:r>
+      <w:r>
+        <w:t xml:space="preserve"> </w:t>
+      </w:r>
+      <w:r>
+        <w:t xml:space="preserve">627 (8002): 49–58.</w:t>
+      </w:r>
+      <w:r>
+        <w:t xml:space="preserve"> </w:t>
+      </w:r>
+      <w:hyperlink r:id="rId77">
+        <w:r>
+          <w:rPr>
+            <w:rStyle w:val="Hyperlink"/>
+          </w:rPr>
+          <w:t xml:space="preserve">https://doi.org/10.1038/s41586-024-07146-0</w:t>
+        </w:r>
+      </w:hyperlink>
+      <w:r>
+        <w:t xml:space="preserve">.</w:t>
+      </w:r>
+    </w:p>
+    <w:bookmarkEnd w:id="78"/>
+    <w:bookmarkStart w:id="79" w:name="_97fe74aee6e1866024e3578107d1a9db6ca039d"/>
+    <w:p>
+      <w:pPr>
+        <w:pStyle w:val="Bibliography"/>
+        <w:ind w:left="720" w:hanging="720"/>
+      </w:pPr>
+      <w:r>
+        <w:t xml:space="preserve">Otto, Samuel E., Nicholas Zolman, J. Nathan Kutz, and Steven L. Brunton. 2025.</w:t>
+      </w:r>
+      <w:r>
+        <w:t xml:space="preserve"> </w:t>
+      </w:r>
+      <w:r>
+        <w:t xml:space="preserve">“A Unified Framework to Enforce, Discover, and Promote Symmetry in Machine Learning.”</w:t>
+      </w:r>
+      <w:r>
+        <w:t xml:space="preserve"> </w:t>
+      </w:r>
+      <w:r>
+        <w:rPr>
+          <w:i/>
+          <w:iCs/>
+        </w:rPr>
+        <w:t xml:space="preserve">Journal of Machine Learning Research</w:t>
+      </w:r>
+      <w:r>
+        <w:t xml:space="preserve"> </w:t>
+      </w:r>
+      <w:r>
+        <w:t xml:space="preserve">26: 1–83.</w:t>
+      </w:r>
+    </w:p>
+    <w:bookmarkEnd w:id="79"/>
+    <w:bookmarkStart w:id="81" w:name="_ef604ae533fad333bc697748e3dc0fd28f0aa78"/>
+    <w:p>
+      <w:pPr>
+        <w:pStyle w:val="Bibliography"/>
+        <w:ind w:left="720" w:hanging="720"/>
+      </w:pPr>
+      <w:r>
         <w:t xml:space="preserve">Petersen, Brenden K., Mikel Landajuela Larma, T. Nathan Mundhenk, Claudio P. Santiago, Soo Kyung Kim, and Joanne T. Kim. 2021.</w:t>
       </w:r>
       <w:r>
@@ -10757,7 +10695,7 @@
       <w:r>
         <w:t xml:space="preserve"> </w:t>
       </w:r>
-      <w:hyperlink r:id="rId71">
+      <w:hyperlink r:id="rId80">
         <w:r>
           <w:rPr>
             <w:rStyle w:val="Hyperlink"/>
@@ -10769,8 +10707,8 @@
         <w:t xml:space="preserve">.</w:t>
       </w:r>
     </w:p>
-    <w:bookmarkEnd w:id="72"/>
-    <w:bookmarkStart w:id="74" w:name="_457df0eb6f3cee80a45c4fff61dc37b0f5cd9b1"/>
+    <w:bookmarkEnd w:id="81"/>
+    <w:bookmarkStart w:id="83" w:name="_457df0eb6f3cee80a45c4fff61dc37b0f5cd9b1"/>
     <w:p>
       <w:pPr>
         <w:pStyle w:val="Bibliography"/>
@@ -10804,7 +10742,7 @@
       <w:r>
         <w:t xml:space="preserve"> </w:t>
       </w:r>
-      <w:hyperlink r:id="rId73">
+      <w:hyperlink r:id="rId82">
         <w:r>
           <w:rPr>
             <w:rStyle w:val="Hyperlink"/>
@@ -10816,8 +10754,8 @@
         <w:t xml:space="preserve">.</w:t>
       </w:r>
     </w:p>
-    <w:bookmarkEnd w:id="74"/>
-    <w:bookmarkStart w:id="76" w:name="_224126058e881b11118696e484baee7c8dbe6db"/>
+    <w:bookmarkEnd w:id="83"/>
+    <w:bookmarkStart w:id="85" w:name="_224126058e881b11118696e484baee7c8dbe6db"/>
     <w:p>
       <w:pPr>
         <w:pStyle w:val="Bibliography"/>
@@ -10851,7 +10789,7 @@
       <w:r>
         <w:t xml:space="preserve"> </w:t>
       </w:r>
-      <w:hyperlink r:id="rId75">
+      <w:hyperlink r:id="rId84">
         <w:r>
           <w:rPr>
             <w:rStyle w:val="Hyperlink"/>
@@ -10863,8 +10801,8 @@
         <w:t xml:space="preserve">.</w:t>
       </w:r>
     </w:p>
-    <w:bookmarkEnd w:id="76"/>
-    <w:bookmarkStart w:id="78" w:name="_1717fb37a54aa1a40df471b2975d2fd09729c85"/>
+    <w:bookmarkEnd w:id="85"/>
+    <w:bookmarkStart w:id="87" w:name="_1717fb37a54aa1a40df471b2975d2fd09729c85"/>
     <w:p>
       <w:pPr>
         <w:pStyle w:val="Bibliography"/>
@@ -10898,7 +10836,7 @@
       <w:r>
         <w:t xml:space="preserve"> </w:t>
       </w:r>
-      <w:hyperlink r:id="rId77">
+      <w:hyperlink r:id="rId86">
         <w:r>
           <w:rPr>
             <w:rStyle w:val="Hyperlink"/>
@@ -10910,14 +10848,79 @@
         <w:t xml:space="preserve">.</w:t>
       </w:r>
     </w:p>
-    <w:bookmarkEnd w:id="78"/>
-    <w:bookmarkStart w:id="80" w:name="_087162fecb529c26266ceb922b457ce775002f4"/>
+    <w:bookmarkEnd w:id="87"/>
+    <w:bookmarkStart w:id="89" w:name="_8b25f64435fc5ff192d03ffcdc0af37daecff02"/>
     <w:p>
       <w:pPr>
         <w:pStyle w:val="Bibliography"/>
         <w:ind w:left="720" w:hanging="720"/>
       </w:pPr>
       <w:r>
+        <w:t xml:space="preserve">Shalyt, Michael, Nathan Regev, Marin Soljačić, and Ido Kaminer. 2026.</w:t>
+      </w:r>
+      <w:r>
+        <w:t xml:space="preserve"> </w:t>
+      </w:r>
+      <w:r>
+        <w:t xml:space="preserve">“Can</w:t>
+      </w:r>
+      <w:r>
+        <w:t xml:space="preserve"> </w:t>
+      </w:r>
+      <w:r>
+        <w:t xml:space="preserve">AI</w:t>
+      </w:r>
+      <w:r>
+        <w:t xml:space="preserve"> </w:t>
+      </w:r>
+      <w:r>
+        <w:t xml:space="preserve">Follow in</w:t>
+      </w:r>
+      <w:r>
+        <w:t xml:space="preserve"> </w:t>
+      </w:r>
+      <w:r>
+        <w:t xml:space="preserve">Einstein</w:t>
+      </w:r>
+      <w:r>
+        <w:t xml:space="preserve">’s Footsteps?”</w:t>
+      </w:r>
+      <w:r>
+        <w:t xml:space="preserve"> </w:t>
+      </w:r>
+      <w:r>
+        <w:rPr>
+          <w:i/>
+          <w:iCs/>
+        </w:rPr>
+        <w:t xml:space="preserve">arXiv Preprint arXiv:2607.27794</w:t>
+      </w:r>
+      <w:r>
+        <w:t xml:space="preserve">, ahead of print.</w:t>
+      </w:r>
+      <w:r>
+        <w:t xml:space="preserve"> </w:t>
+      </w:r>
+      <w:hyperlink r:id="rId88">
+        <w:r>
+          <w:rPr>
+            <w:rStyle w:val="Hyperlink"/>
+          </w:rPr>
+          <w:t xml:space="preserve">https://doi.org/10.48550/arXiv.2607.27794</w:t>
+        </w:r>
+      </w:hyperlink>
+      <w:r>
+        <w:t xml:space="preserve">.</w:t>
+      </w:r>
+    </w:p>
+    <w:bookmarkEnd w:id="89"/>
+    <w:bookmarkStart w:id="91" w:name="_087162fecb529c26266ceb922b457ce775002f4"/>
+    <w:p>
+      <w:pPr>
+        <w:pStyle w:val="Bibliography"/>
+        <w:ind w:left="720" w:hanging="720"/>
+      </w:pPr>
+      <w:r>
         <w:t xml:space="preserve">Tenachi, Wassim, Rodrigo Ibata, and Foivos I. Diakogiannis. 2023.</w:t>
       </w:r>
       <w:r>
@@ -10945,7 +10948,7 @@
       <w:r>
         <w:t xml:space="preserve"> </w:t>
       </w:r>
-      <w:hyperlink r:id="rId79">
+      <w:hyperlink r:id="rId90">
         <w:r>
           <w:rPr>
             <w:rStyle w:val="Hyperlink"/>
@@ -10957,8 +10960,8 @@
         <w:t xml:space="preserve">.</w:t>
       </w:r>
     </w:p>
-    <w:bookmarkEnd w:id="80"/>
-    <w:bookmarkStart w:id="81" w:name="_7ab753a07ab1486fccf9d5891a2e9e206624fa4"/>
+    <w:bookmarkEnd w:id="91"/>
+    <w:bookmarkStart w:id="92" w:name="_7ab753a07ab1486fccf9d5891a2e9e206624fa4"/>
     <w:p>
       <w:pPr>
         <w:pStyle w:val="Bibliography"/>
@@ -10999,8 +11002,8 @@
         <w:t xml:space="preserve">33: 4860–71.</w:t>
       </w:r>
     </w:p>
-    <w:bookmarkEnd w:id="81"/>
-    <w:bookmarkStart w:id="83" w:name="_a9b2e19e299c9f94ea16f0b1c1b195864220abf"/>
+    <w:bookmarkEnd w:id="92"/>
+    <w:bookmarkStart w:id="94" w:name="_a9b2e19e299c9f94ea16f0b1c1b195864220abf"/>
     <w:p>
       <w:pPr>
         <w:pStyle w:val="Bibliography"/>
@@ -11040,7 +11043,7 @@
       <w:r>
         <w:t xml:space="preserve"> </w:t>
       </w:r>
-      <w:hyperlink r:id="rId82">
+      <w:hyperlink r:id="rId93">
         <w:r>
           <w:rPr>
             <w:rStyle w:val="Hyperlink"/>
@@ -11052,8 +11055,55 @@
         <w:t xml:space="preserve">.</w:t>
       </w:r>
     </w:p>
-    <w:bookmarkEnd w:id="83"/>
-    <w:bookmarkEnd w:id="84"/>
+    <w:bookmarkEnd w:id="94"/>
+    <w:bookmarkStart w:id="96" w:name="_a50bc08bafa126fa7b3f332668ec078da73e90d"/>
+    <w:p>
+      <w:pPr>
+        <w:pStyle w:val="Bibliography"/>
+        <w:ind w:left="720" w:hanging="720"/>
+      </w:pPr>
+      <w:r>
+        <w:t xml:space="preserve">Wang, Hanchen, Tianfan Fu, Yuanqi Du, et al. 2023.</w:t>
+      </w:r>
+      <w:r>
+        <w:t xml:space="preserve"> </w:t>
+      </w:r>
+      <w:r>
+        <w:t xml:space="preserve">“Scientific Discovery in the Age of Artificial Intelligence.”</w:t>
+      </w:r>
+      <w:r>
+        <w:t xml:space="preserve"> </w:t>
+      </w:r>
+      <w:r>
+        <w:rPr>
+          <w:i/>
+          <w:iCs/>
+        </w:rPr>
+        <w:t xml:space="preserve">Nature</w:t>
+      </w:r>
+      <w:r>
+        <w:t xml:space="preserve"> </w:t>
+      </w:r>
+      <w:r>
+        <w:t xml:space="preserve">620 (7972): 47–60.</w:t>
+      </w:r>
+      <w:r>
+        <w:t xml:space="preserve"> </w:t>
+      </w:r>
+      <w:hyperlink r:id="rId95">
+        <w:r>
+          <w:rPr>
+            <w:rStyle w:val="Hyperlink"/>
+          </w:rPr>
+          <w:t xml:space="preserve">https://doi.org/10.1038/s41586-023-06221-2</w:t>
+        </w:r>
+      </w:hyperlink>
+      <w:r>
+        <w:t xml:space="preserve">.</w:t>
+      </w:r>
+    </w:p>
+    <w:bookmarkEnd w:id="96"/>
+    <w:bookmarkEnd w:id="97"/>
     <w:sectPr>
       <w:footnotePr>
         <w:numRestart w:val="eachSect"/>
@@ -11080,6 +11130,279 @@
     <w:p>
       <w:r>
         <w:separator/>
+      </w:r>
+    </w:p>
+  </w:footnote>
+  <w:footnote w:id="17">
+    <w:p>
+      <w:pPr>
+        <w:pStyle w:val="FootnoteText"/>
+      </w:pPr>
+      <w:r>
+        <w:rPr>
+          <w:rStyle w:val="FootnoteReference"/>
+        </w:rPr>
+        <w:footnoteRef/>
+      </w:r>
+      <w:r>
+        <w:t xml:space="preserve"> </w:t>
+      </w:r>
+      <w:r>
+        <w:t xml:space="preserve">Full rebuttal tables are available at</w:t>
+      </w:r>
+      <w:r>
+        <w:t xml:space="preserve"> </w:t>
+      </w:r>
+      <w:hyperlink r:id="rId18">
+        <w:r>
+          <w:rPr>
+            <w:rStyle w:val="Hyperlink"/>
+          </w:rPr>
+          <w:t xml:space="preserve">https://github.com/apiprdt/PhysicsPaper/tree/PythonADCD/rebuttal</w:t>
+        </w:r>
+      </w:hyperlink>
+      <w:r>
+        <w:t xml:space="preserve">.</w:t>
+      </w:r>
+    </w:p>
+  </w:footnote>
+  <w:footnote w:id="32">
+    <w:p>
+      <w:pPr>
+        <w:pStyle w:val="FootnoteText"/>
+      </w:pPr>
+      <w:r>
+        <w:rPr>
+          <w:rStyle w:val="FootnoteReference"/>
+        </w:rPr>
+        <w:footnoteRef/>
+      </w:r>
+      <w:r>
+        <w:t xml:space="preserve"> </w:t>
+      </w:r>
+      <m:oMath>
+        <m:r>
+          <m:rPr>
+            <m:sty m:val="p"/>
+          </m:rPr>
+          <m:t>Δ</m:t>
+        </m:r>
+        <m:r>
+          <m:rPr>
+            <m:sty m:val="p"/>
+          </m:rPr>
+          <m:t>B</m:t>
+        </m:r>
+        <m:r>
+          <m:rPr>
+            <m:sty m:val="p"/>
+          </m:rPr>
+          <m:t>I</m:t>
+        </m:r>
+        <m:r>
+          <m:rPr>
+            <m:sty m:val="p"/>
+          </m:rPr>
+          <m:t>C</m:t>
+        </m:r>
+      </m:oMath>
+      <w:r>
+        <w:t xml:space="preserve"> </w:t>
+      </w:r>
+      <w:r>
+        <w:t xml:space="preserve">includes a search-space penalty</w:t>
+      </w:r>
+      <w:r>
+        <w:t xml:space="preserve"> </w:t>
+      </w:r>
+      <m:oMath>
+        <m:r>
+          <m:t>2</m:t>
+        </m:r>
+        <m:r>
+          <m:rPr>
+            <m:sty m:val="p"/>
+          </m:rPr>
+          <m:t>ln</m:t>
+        </m:r>
+        <m:r>
+          <m:rPr>
+            <m:sty m:val="p"/>
+          </m:rPr>
+          <m:t>|</m:t>
+        </m:r>
+        <m:r>
+          <m:rPr>
+            <m:scr m:val="script"/>
+            <m:sty m:val="p"/>
+          </m:rPr>
+          <m:t>C</m:t>
+        </m:r>
+        <m:r>
+          <m:rPr>
+            <m:sty m:val="p"/>
+          </m:rPr>
+          <m:t>|</m:t>
+        </m:r>
+      </m:oMath>
+      <w:r>
+        <w:t xml:space="preserve"> </w:t>
+      </w:r>
+      <w:r>
+        <w:t xml:space="preserve">that differs between domain-guided and ablated runs;</w:t>
+      </w:r>
+      <w:r>
+        <w:t xml:space="preserve"> </w:t>
+      </w:r>
+      <m:oMath>
+        <m:r>
+          <m:rPr>
+            <m:sty m:val="p"/>
+          </m:rPr>
+          <m:t>Δ</m:t>
+        </m:r>
+        <m:r>
+          <m:rPr>
+            <m:sty m:val="p"/>
+          </m:rPr>
+          <m:t>N</m:t>
+        </m:r>
+        <m:r>
+          <m:rPr>
+            <m:sty m:val="p"/>
+          </m:rPr>
+          <m:t>L</m:t>
+        </m:r>
+        <m:r>
+          <m:rPr>
+            <m:sty m:val="p"/>
+          </m:rPr>
+          <m:t>L</m:t>
+        </m:r>
+      </m:oMath>
+      <w:r>
+        <w:t xml:space="preserve"> </w:t>
+      </w:r>
+      <w:r>
+        <w:t xml:space="preserve">reports the penalty-free fit-quality difference.</w:t>
+      </w:r>
+      <w:r>
+        <w:t xml:space="preserve"> </w:t>
+      </w:r>
+      <w:r>
+        <w:t xml:space="preserve">Screened Coulomb’s</w:t>
+      </w:r>
+      <w:r>
+        <w:t xml:space="preserve"> </w:t>
+      </w:r>
+      <m:oMath>
+        <m:r>
+          <m:rPr>
+            <m:sty m:val="p"/>
+          </m:rPr>
+          <m:t>Δ</m:t>
+        </m:r>
+        <m:r>
+          <m:rPr>
+            <m:sty m:val="p"/>
+          </m:rPr>
+          <m:t>N</m:t>
+        </m:r>
+        <m:r>
+          <m:rPr>
+            <m:sty m:val="p"/>
+          </m:rPr>
+          <m:t>L</m:t>
+        </m:r>
+        <m:r>
+          <m:rPr>
+            <m:sty m:val="p"/>
+          </m:rPr>
+          <m:t>L</m:t>
+        </m:r>
+        <m:r>
+          <m:rPr>
+            <m:sty m:val="p"/>
+          </m:rPr>
+          <m:t>=</m:t>
+        </m:r>
+        <m:r>
+          <m:t>20.14</m:t>
+        </m:r>
+      </m:oMath>
+      <w:r>
+        <w:t xml:space="preserve"> </w:t>
+      </w:r>
+      <w:r>
+        <w:t xml:space="preserve">alone exceeds the</w:t>
+      </w:r>
+      <w:r>
+        <w:t xml:space="preserve"> </w:t>
+      </w:r>
+      <w:r>
+        <w:t xml:space="preserve">Kass–Raftery threshold of 10.</w:t>
+      </w:r>
+      <w:r>
+        <w:t xml:space="preserve"> </w:t>
+      </w:r>
+      <w:r>
+        <w:t xml:space="preserve">Entropy Expansion’s identifiability is parsimony-driven</w:t>
+      </w:r>
+      <w:r>
+        <w:t xml:space="preserve"> </w:t>
+      </w:r>
+      <w:r>
+        <w:t xml:space="preserve">(</w:t>
+      </w:r>
+      <m:oMath>
+        <m:r>
+          <m:rPr>
+            <m:sty m:val="p"/>
+          </m:rPr>
+          <m:t>Δ</m:t>
+        </m:r>
+        <m:r>
+          <m:rPr>
+            <m:sty m:val="p"/>
+          </m:rPr>
+          <m:t>N</m:t>
+        </m:r>
+        <m:r>
+          <m:rPr>
+            <m:sty m:val="p"/>
+          </m:rPr>
+          <m:t>L</m:t>
+        </m:r>
+        <m:r>
+          <m:rPr>
+            <m:sty m:val="p"/>
+          </m:rPr>
+          <m:t>L</m:t>
+        </m:r>
+        <m:r>
+          <m:rPr>
+            <m:sty m:val="p"/>
+          </m:rPr>
+          <m:t>=</m:t>
+        </m:r>
+        <m:r>
+          <m:rPr>
+            <m:sty m:val="p"/>
+          </m:rPr>
+          <m:t>−</m:t>
+        </m:r>
+        <m:r>
+          <m:t>1.08</m:t>
+        </m:r>
+      </m:oMath>
+      <w:r>
+        <w:t xml:space="preserve">; the ablated model achieves an equivalent fit</w:t>
+      </w:r>
+      <w:r>
+        <w:t xml:space="preserve"> </w:t>
+      </w:r>
+      <w:r>
+        <w:t xml:space="preserve">with more parameters), a distinction we report transparently.</w:t>
       </w:r>
     </w:p>
   </w:footnote>

</xml_diff>

<commit_message>
docs(paper): align claims with code and raw results
- Sec 3.1 / Entropy Expansion: describe mode detection as lowest scale-dependence
  selector with additive fallbacks; remove nonexistent confidence gate/threshold
- Relabel Delta-NLL as Delta-D = Delta(-2 ln L) = N Delta ln NMSE (numbers unchanged)
- Sec 3.8: fix wrong '(Step 1)' reference in ablation control
- Fig 2 caption: threshold claim holds at seed 42; give 5-seed dBIC ranges
- 9.91 +/- 3.04 -> 3.40 (sample SD, n=5)
- Misspecification audit: note 4 of 6 trials informative
- Add |C_ablated| = 814/534/700 vs |C_domain| = 60/40/10
- rebuttal_draft.md: correct constant-baseline wording; state confidence is not used for gating
- Rebuild main.pdf; rebuild main.docx with embedded PNG figures
Verified: all numbers match rebuttal/results/*.json; body ends on page 8; footer intact
</commit_message>
<xml_diff>
--- a/paper/main.docx
+++ b/paper/main.docx
@@ -1157,18 +1157,24 @@
         <w:pStyle w:val="FirstParagraph"/>
       </w:pPr>
       <w:r>
-        <w:t xml:space="preserve">The multiplicative form is selected when its residual shows lower Spearman rank</w:t>
-      </w:r>
-      <w:r>
-        <w:t xml:space="preserve"> </w:t>
-      </w:r>
-      <w:r>
-        <w:t xml:space="preserve">correlation with</w:t>
+        <w:t xml:space="preserve">The mode with the lower scale dependence is selected, measured as the absolute</w:t>
+      </w:r>
+      <w:r>
+        <w:t xml:space="preserve"> </w:t>
+      </w:r>
+      <w:r>
+        <w:t xml:space="preserve">Spearman correlation between</w:t>
       </w:r>
       <w:r>
         <w:t xml:space="preserve"> </w:t>
       </w:r>
       <m:oMath>
+        <m:r>
+          <m:rPr>
+            <m:sty m:val="p"/>
+          </m:rPr>
+          <m:t>|</m:t>
+        </m:r>
         <m:sSub>
           <m:e>
             <m:r>
@@ -1190,18 +1196,119 @@
             </m:r>
           </m:sub>
         </m:sSub>
+        <m:r>
+          <m:rPr>
+            <m:sty m:val="p"/>
+          </m:rPr>
+          <m:t>|</m:t>
+        </m:r>
       </m:oMath>
       <w:r>
         <w:t xml:space="preserve"> </w:t>
       </w:r>
       <w:r>
-        <w:t xml:space="preserve">than the additive residual, with a</w:t>
-      </w:r>
-      <w:r>
-        <w:t xml:space="preserve"> </w:t>
-      </w:r>
-      <w:r>
-        <w:t xml:space="preserve">confidence-gated default to additive under high ambiguity.</w:t>
+        <w:t xml:space="preserve">and the residual magnitude (ties</w:t>
+      </w:r>
+      <w:r>
+        <w:t xml:space="preserve"> </w:t>
+      </w:r>
+      <w:r>
+        <w:t xml:space="preserve">go to additive). There is no numeric ambiguity threshold: additive is used by</w:t>
+      </w:r>
+      <w:r>
+        <w:t xml:space="preserve"> </w:t>
+      </w:r>
+      <w:r>
+        <w:t xml:space="preserve">construction when</w:t>
+      </w:r>
+      <w:r>
+        <w:t xml:space="preserve"> </w:t>
+      </w:r>
+      <m:oMath>
+        <m:r>
+          <m:rPr>
+            <m:sty m:val="p"/>
+          </m:rPr>
+          <m:t>s</m:t>
+        </m:r>
+        <m:r>
+          <m:rPr>
+            <m:sty m:val="p"/>
+          </m:rPr>
+          <m:t>t</m:t>
+        </m:r>
+        <m:r>
+          <m:rPr>
+            <m:sty m:val="p"/>
+          </m:rPr>
+          <m:t>d</m:t>
+        </m:r>
+        <m:r>
+          <m:rPr>
+            <m:sty m:val="p"/>
+          </m:rPr>
+          <m:t>(</m:t>
+        </m:r>
+        <m:sSub>
+          <m:e>
+            <m:r>
+              <m:t>y</m:t>
+            </m:r>
+          </m:e>
+          <m:sub>
+            <m:r>
+              <m:rPr>
+                <m:sty m:val="p"/>
+              </m:rPr>
+              <m:t>c</m:t>
+            </m:r>
+            <m:r>
+              <m:rPr>
+                <m:sty m:val="p"/>
+              </m:rPr>
+              <m:t>l</m:t>
+            </m:r>
+          </m:sub>
+        </m:sSub>
+        <m:r>
+          <m:rPr>
+            <m:sty m:val="p"/>
+          </m:rPr>
+          <m:t>)</m:t>
+        </m:r>
+        <m:r>
+          <m:rPr>
+            <m:sty m:val="p"/>
+          </m:rPr>
+          <m:t>&lt;</m:t>
+        </m:r>
+        <m:sSup>
+          <m:e>
+            <m:r>
+              <m:t>10</m:t>
+            </m:r>
+          </m:e>
+          <m:sup>
+            <m:r>
+              <m:rPr>
+                <m:sty m:val="p"/>
+              </m:rPr>
+              <m:t>−</m:t>
+            </m:r>
+            <m:r>
+              <m:t>15</m:t>
+            </m:r>
+          </m:sup>
+        </m:sSup>
+      </m:oMath>
+      <w:r>
+        <w:t xml:space="preserve">, when fewer than 5</w:t>
+      </w:r>
+      <w:r>
+        <w:t xml:space="preserve"> </w:t>
+      </w:r>
+      <w:r>
+        <w:t xml:space="preserve">valid points remain, or when both correlations vanish.</w:t>
       </w:r>
       <w:r>
         <w:t xml:space="preserve"> </w:t>
@@ -3508,7 +3615,19 @@
         <w:t xml:space="preserve"> </w:t>
       </w:r>
       <w:r>
-        <w:t xml:space="preserve">wrong-taxonomy trials the system returned WITHHELD (0% false discovery rate).</w:t>
+        <w:t xml:space="preserve">wrong-taxonomy trials the system returned WITHHELD (0% false discovery rate;</w:t>
+      </w:r>
+      <w:r>
+        <w:t xml:space="preserve"> </w:t>
+      </w:r>
+      <w:r>
+        <w:t xml:space="preserve">4 of the 6 are informative, since the 2 Time Dilation trials are WITHHELD even</w:t>
+      </w:r>
+      <w:r>
+        <w:t xml:space="preserve"> </w:t>
+      </w:r>
+      <w:r>
+        <w:t xml:space="preserve">under the correct prior).</w:t>
       </w:r>
       <w:r>
         <w:t xml:space="preserve"> </w:t>
@@ -5084,7 +5203,7 @@
         <w:t xml:space="preserve"> </w:t>
       </w:r>
       <w:r>
-        <w:t xml:space="preserve">candidate (Step 1) and the best Rank-1 candidate found under ablation.</w:t>
+        <w:t xml:space="preserve">candidate from the blind search and the best Rank-1 candidate found under ablation.</w:t>
       </w:r>
     </w:p>
     <w:p>
@@ -5682,29 +5801,54 @@
       </w:r>
       <w:bookmarkEnd w:id="28"/>
     </w:p>
-    <w:bookmarkStart w:id="29" w:name="_c7946d13b3f336e982488dc050f3a0bcdd814c3"/>
-    <w:tbl>
-      <w:tblPr>
-        <w:tblStyle w:val="FigureTable"/>
-        <w:tblW w:type="auto" w:w="0"/>
-        <w:jc w:val="center"/>
-        <w:tblLook w:firstRow="0" w:lastRow="0" w:firstColumn="0" w:lastColumn="0"/>
-      </w:tblPr>
-      <w:tblGrid>
-        <w:gridCol w:w="7920"/>
-      </w:tblGrid>
-      <w:tr>
-        <w:tc>
-          <w:tcPr/>
-          <w:p>
-            <w:pPr>
-              <w:pStyle w:val="Compact"/>
-              <w:jc w:val="center"/>
-            </w:pPr>
-          </w:p>
-        </w:tc>
-      </w:tr>
-    </w:tbl>
+    <w:bookmarkStart w:id="32" w:name="_c7946d13b3f336e982488dc050f3a0bcdd814c3"/>
+    <w:p>
+      <w:pPr>
+        <w:pStyle w:val="CaptionedFigure"/>
+      </w:pPr>
+      <w:r>
+        <w:drawing>
+          <wp:inline>
+            <wp:extent cx="5334000" cy="1745571"/>
+            <wp:effectExtent b="0" l="0" r="0" t="0"/>
+            <wp:docPr descr="" title="" id="30" name="Picture"/>
+            <a:graphic>
+              <a:graphicData uri="http://schemas.openxmlformats.org/drawingml/2006/picture">
+                <pic:pic>
+                  <pic:nvPicPr>
+                    <pic:cNvPr descr="fig1_recovery.png" id="31" name="Picture"/>
+                    <pic:cNvPicPr>
+                      <a:picLocks noChangeArrowheads="1" noChangeAspect="1"/>
+                    </pic:cNvPicPr>
+                  </pic:nvPicPr>
+                  <pic:blipFill>
+                    <a:blip r:embed="rId29"/>
+                    <a:stretch>
+                      <a:fillRect/>
+                    </a:stretch>
+                  </pic:blipFill>
+                  <pic:spPr bwMode="auto">
+                    <a:xfrm>
+                      <a:off x="0" y="0"/>
+                      <a:ext cx="5334000" cy="1745571"/>
+                    </a:xfrm>
+                    <a:prstGeom prst="rect">
+                      <a:avLst/>
+                    </a:prstGeom>
+                    <a:noFill/>
+                    <a:ln w="9525">
+                      <a:noFill/>
+                      <a:headEnd/>
+                      <a:tailEnd/>
+                    </a:ln>
+                  </pic:spPr>
+                </pic:pic>
+              </a:graphicData>
+            </a:graphic>
+          </wp:inline>
+        </w:drawing>
+      </w:r>
+    </w:p>
     <w:p>
       <w:pPr>
         <w:pStyle w:val="ImageCaption"/>
@@ -6045,30 +6189,55 @@
         <w:t xml:space="preserve"> </w:t>
       </w:r>
     </w:p>
-    <w:bookmarkEnd w:id="29"/>
-    <w:bookmarkStart w:id="30" w:name="_afdb111206819426e5a108476a671f77ce665af"/>
-    <w:tbl>
-      <w:tblPr>
-        <w:tblStyle w:val="FigureTable"/>
-        <w:tblW w:type="auto" w:w="0"/>
-        <w:jc w:val="center"/>
-        <w:tblLook w:firstRow="0" w:lastRow="0" w:firstColumn="0" w:lastColumn="0"/>
-      </w:tblPr>
-      <w:tblGrid>
-        <w:gridCol w:w="7920"/>
-      </w:tblGrid>
-      <w:tr>
-        <w:tc>
-          <w:tcPr/>
-          <w:p>
-            <w:pPr>
-              <w:pStyle w:val="Compact"/>
-              <w:jc w:val="center"/>
-            </w:pPr>
-          </w:p>
-        </w:tc>
-      </w:tr>
-    </w:tbl>
+    <w:bookmarkEnd w:id="32"/>
+    <w:bookmarkStart w:id="36" w:name="_afdb111206819426e5a108476a671f77ce665af"/>
+    <w:p>
+      <w:pPr>
+        <w:pStyle w:val="CaptionedFigure"/>
+      </w:pPr>
+      <w:r>
+        <w:drawing>
+          <wp:inline>
+            <wp:extent cx="5334000" cy="1892220"/>
+            <wp:effectExtent b="0" l="0" r="0" t="0"/>
+            <wp:docPr descr="" title="" id="34" name="Picture"/>
+            <a:graphic>
+              <a:graphicData uri="http://schemas.openxmlformats.org/drawingml/2006/picture">
+                <pic:pic>
+                  <pic:nvPicPr>
+                    <pic:cNvPr descr="fig2_bic.png" id="35" name="Picture"/>
+                    <pic:cNvPicPr>
+                      <a:picLocks noChangeArrowheads="1" noChangeAspect="1"/>
+                    </pic:cNvPicPr>
+                  </pic:nvPicPr>
+                  <pic:blipFill>
+                    <a:blip r:embed="rId33"/>
+                    <a:stretch>
+                      <a:fillRect/>
+                    </a:stretch>
+                  </pic:blipFill>
+                  <pic:spPr bwMode="auto">
+                    <a:xfrm>
+                      <a:off x="0" y="0"/>
+                      <a:ext cx="5334000" cy="1892220"/>
+                    </a:xfrm>
+                    <a:prstGeom prst="rect">
+                      <a:avLst/>
+                    </a:prstGeom>
+                    <a:noFill/>
+                    <a:ln w="9525">
+                      <a:noFill/>
+                      <a:headEnd/>
+                      <a:tailEnd/>
+                    </a:ln>
+                  </pic:spPr>
+                </pic:pic>
+              </a:graphicData>
+            </a:graphic>
+          </wp:inline>
+        </w:drawing>
+      </w:r>
+    </w:p>
     <w:p>
       <w:pPr>
         <w:pStyle w:val="ImageCaption"/>
@@ -6356,7 +6525,48 @@
         <w:t xml:space="preserve"> </w:t>
       </w:r>
       <w:r>
-        <w:t xml:space="preserve">All three scenarios exceed this threshold, yet Time Dilation is WITHHELD</w:t>
+        <w:t xml:space="preserve">At seed 42 all three scenarios exceed this threshold (across 5 seeds,</w:t>
+      </w:r>
+      <w:r>
+        <w:t xml:space="preserve"> </w:t>
+      </w:r>
+      <m:oMath>
+        <m:r>
+          <m:rPr>
+            <m:sty m:val="p"/>
+          </m:rPr>
+          <m:t>Δ</m:t>
+        </m:r>
+        <m:r>
+          <m:rPr>
+            <m:sty m:val="p"/>
+          </m:rPr>
+          <m:t>B</m:t>
+        </m:r>
+        <m:r>
+          <m:rPr>
+            <m:sty m:val="p"/>
+          </m:rPr>
+          <m:t>I</m:t>
+        </m:r>
+        <m:r>
+          <m:rPr>
+            <m:sty m:val="p"/>
+          </m:rPr>
+          <m:t>C</m:t>
+        </m:r>
+      </m:oMath>
+      <w:r>
+        <w:t xml:space="preserve"> </w:t>
+      </w:r>
+      <w:r>
+        <w:t xml:space="preserve">spans 11.0–263, 5.1–14.7, and 5.5–13.8 for Screened</w:t>
+      </w:r>
+      <w:r>
+        <w:t xml:space="preserve"> </w:t>
+      </w:r>
+      <w:r>
+        <w:t xml:space="preserve">Coulomb, Entropy Expansion, and Time Dilation), yet Time Dilation is WITHHELD</w:t>
       </w:r>
       <w:r>
         <w:t xml:space="preserve"> </w:t>
@@ -6426,30 +6636,55 @@
         <w:t xml:space="preserve"> </w:t>
       </w:r>
     </w:p>
-    <w:bookmarkEnd w:id="30"/>
-    <w:bookmarkStart w:id="31" w:name="_be1ea107d10d2f739baf6c86264f7c371d7bc21"/>
-    <w:tbl>
-      <w:tblPr>
-        <w:tblStyle w:val="FigureTable"/>
-        <w:tblW w:type="auto" w:w="0"/>
-        <w:jc w:val="center"/>
-        <w:tblLook w:firstRow="0" w:lastRow="0" w:firstColumn="0" w:lastColumn="0"/>
-      </w:tblPr>
-      <w:tblGrid>
-        <w:gridCol w:w="7920"/>
-      </w:tblGrid>
-      <w:tr>
-        <w:tc>
-          <w:tcPr/>
-          <w:p>
-            <w:pPr>
-              <w:pStyle w:val="Compact"/>
-              <w:jc w:val="center"/>
-            </w:pPr>
-          </w:p>
-        </w:tc>
-      </w:tr>
-    </w:tbl>
+    <w:bookmarkEnd w:id="36"/>
+    <w:bookmarkStart w:id="40" w:name="_be1ea107d10d2f739baf6c86264f7c371d7bc21"/>
+    <w:p>
+      <w:pPr>
+        <w:pStyle w:val="CaptionedFigure"/>
+      </w:pPr>
+      <w:r>
+        <w:drawing>
+          <wp:inline>
+            <wp:extent cx="5334000" cy="1743754"/>
+            <wp:effectExtent b="0" l="0" r="0" t="0"/>
+            <wp:docPr descr="" title="" id="38" name="Picture"/>
+            <a:graphic>
+              <a:graphicData uri="http://schemas.openxmlformats.org/drawingml/2006/picture">
+                <pic:pic>
+                  <pic:nvPicPr>
+                    <pic:cNvPr descr="fig3_parity.png" id="39" name="Picture"/>
+                    <pic:cNvPicPr>
+                      <a:picLocks noChangeArrowheads="1" noChangeAspect="1"/>
+                    </pic:cNvPicPr>
+                  </pic:nvPicPr>
+                  <pic:blipFill>
+                    <a:blip r:embed="rId37"/>
+                    <a:stretch>
+                      <a:fillRect/>
+                    </a:stretch>
+                  </pic:blipFill>
+                  <pic:spPr bwMode="auto">
+                    <a:xfrm>
+                      <a:off x="0" y="0"/>
+                      <a:ext cx="5334000" cy="1743754"/>
+                    </a:xfrm>
+                    <a:prstGeom prst="rect">
+                      <a:avLst/>
+                    </a:prstGeom>
+                    <a:noFill/>
+                    <a:ln w="9525">
+                      <a:noFill/>
+                      <a:headEnd/>
+                      <a:tailEnd/>
+                    </a:ln>
+                  </pic:spPr>
+                </pic:pic>
+              </a:graphicData>
+            </a:graphic>
+          </wp:inline>
+        </w:drawing>
+      </w:r>
+    </w:p>
     <w:p>
       <w:pPr>
         <w:pStyle w:val="ImageCaption"/>
@@ -6708,7 +6943,7 @@
         <w:t xml:space="preserve"> </w:t>
       </w:r>
     </w:p>
-    <w:bookmarkEnd w:id="31"/>
+    <w:bookmarkEnd w:id="40"/>
     <w:p>
       <w:pPr>
         <w:pStyle w:val="FirstParagraph"/>
@@ -6779,29 +7014,92 @@
           <m:t>Δ</m:t>
         </m:r>
         <m:r>
-          <m:rPr>
-            <m:sty m:val="p"/>
-          </m:rPr>
+          <m:t>D</m:t>
+        </m:r>
+      </m:oMath>
+      <w:r>
+        <w:t xml:space="preserve">, the change in deviance</w:t>
+      </w:r>
+      <w:r>
+        <w:t xml:space="preserve"> </w:t>
+      </w:r>
+      <m:oMath>
+        <m:r>
+          <m:t>D</m:t>
+        </m:r>
+        <m:r>
+          <m:rPr>
+            <m:sty m:val="p"/>
+          </m:rPr>
+          <m:t>=</m:t>
+        </m:r>
+        <m:r>
+          <m:rPr>
+            <m:sty m:val="p"/>
+          </m:rPr>
+          <m:t>−</m:t>
+        </m:r>
+        <m:r>
+          <m:t>2</m:t>
+        </m:r>
+        <m:r>
+          <m:rPr>
+            <m:sty m:val="p"/>
+          </m:rPr>
+          <m:t>ln</m:t>
+        </m:r>
+        <m:acc>
+          <m:accPr>
+            <m:chr m:val="̂"/>
+          </m:accPr>
+          <m:e>
+            <m:r>
+              <m:t>L</m:t>
+            </m:r>
+          </m:e>
+        </m:acc>
+        <m:r>
+          <m:rPr>
+            <m:sty m:val="p"/>
+          </m:rPr>
+          <m:t>=</m:t>
+        </m:r>
+        <m:r>
           <m:t>N</m:t>
         </m:r>
         <m:r>
           <m:rPr>
             <m:sty m:val="p"/>
           </m:rPr>
-          <m:t>L</m:t>
-        </m:r>
-        <m:r>
-          <m:rPr>
-            <m:sty m:val="p"/>
-          </m:rPr>
-          <m:t>L</m:t>
+          <m:t>ln</m:t>
+        </m:r>
+        <m:r>
+          <m:rPr>
+            <m:sty m:val="p"/>
+          </m:rPr>
+          <m:t>N</m:t>
+        </m:r>
+        <m:r>
+          <m:rPr>
+            <m:sty m:val="p"/>
+          </m:rPr>
+          <m:t>M</m:t>
+        </m:r>
+        <m:r>
+          <m:rPr>
+            <m:sty m:val="p"/>
+          </m:rPr>
+          <m:t>S</m:t>
+        </m:r>
+        <m:r>
+          <m:rPr>
+            <m:sty m:val="p"/>
+          </m:rPr>
+          <m:t>E</m:t>
         </m:r>
       </m:oMath>
       <w:r>
-        <w:t xml:space="preserve"> </w:t>
-      </w:r>
-      <w:r>
-        <w:t xml:space="preserve">isolates the pure fit-quality advantage from the</w:t>
+        <w:t xml:space="preserve">, isolates the pure fit-quality advantage from the</w:t>
       </w:r>
       <w:r>
         <w:t xml:space="preserve"> </w:t>
@@ -6964,18 +7262,18 @@
         <w:rPr>
           <w:rStyle w:val="FootnoteReference"/>
         </w:rPr>
-        <w:footnoteReference w:id="32"/>
+        <w:footnoteReference w:id="41"/>
       </w:r>
     </w:p>
     <w:p>
       <w:pPr>
         <w:pStyle w:val="Heading4"/>
       </w:pPr>
-      <w:bookmarkStart w:id="33" w:name="_1759a028cfb76cc1228f270093fe5555832d0a5"/>
+      <w:bookmarkStart w:id="42" w:name="_1759a028cfb76cc1228f270093fe5555832d0a5"/>
       <w:r>
         <w:t xml:space="preserve">Screened Coulomb.</w:t>
       </w:r>
-      <w:bookmarkEnd w:id="33"/>
+      <w:bookmarkEnd w:id="42"/>
     </w:p>
     <w:p>
       <w:pPr>
@@ -7369,22 +7667,7 @@
           <m:t>Δ</m:t>
         </m:r>
         <m:r>
-          <m:rPr>
-            <m:sty m:val="p"/>
-          </m:rPr>
-          <m:t>N</m:t>
-        </m:r>
-        <m:r>
-          <m:rPr>
-            <m:sty m:val="p"/>
-          </m:rPr>
-          <m:t>L</m:t>
-        </m:r>
-        <m:r>
-          <m:rPr>
-            <m:sty m:val="p"/>
-          </m:rPr>
-          <m:t>L</m:t>
+          <m:t>D</m:t>
         </m:r>
         <m:r>
           <m:rPr>
@@ -7430,22 +7713,7 @@
               <m:t>Δ</m:t>
             </m:r>
             <m:r>
-              <m:rPr>
-                <m:sty m:val="p"/>
-              </m:rPr>
-              <m:t>N</m:t>
-            </m:r>
-            <m:r>
-              <m:rPr>
-                <m:sty m:val="p"/>
-              </m:rPr>
-              <m:t>L</m:t>
-            </m:r>
-            <m:r>
-              <m:rPr>
-                <m:sty m:val="p"/>
-              </m:rPr>
-              <m:t>L</m:t>
+              <m:t>D</m:t>
             </m:r>
           </m:e>
         </m:bar>
@@ -7467,11 +7735,11 @@
       <w:pPr>
         <w:pStyle w:val="Heading4"/>
       </w:pPr>
-      <w:bookmarkStart w:id="34" w:name="_3237b3bffd4a77c8d5c3040d985d2e630b331b1"/>
+      <w:bookmarkStart w:id="43" w:name="_3237b3bffd4a77c8d5c3040d985d2e630b331b1"/>
       <w:r>
         <w:t xml:space="preserve">Entropy Expansion.</w:t>
       </w:r>
-      <w:bookmarkEnd w:id="34"/>
+      <w:bookmarkEnd w:id="43"/>
     </w:p>
     <w:p>
       <w:pPr>
@@ -7501,13 +7769,13 @@
         <w:t xml:space="preserve"> </w:t>
       </w:r>
       <w:r>
-        <w:t xml:space="preserve">is a constant, the mode detection step</w:t>
-      </w:r>
-      <w:r>
-        <w:t xml:space="preserve"> </w:t>
-      </w:r>
-      <w:r>
-        <w:t xml:space="preserve">defaults to an additive search due to ambiguity. Thus, the recovered additive</w:t>
+        <w:t xml:space="preserve">is constant, the scale-dependence test is</w:t>
+      </w:r>
+      <w:r>
+        <w:t xml:space="preserve"> </w:t>
+      </w:r>
+      <w:r>
+        <w:t xml:space="preserve">uninformative and mode detection falls back to an additive search. Thus, the recovered additive</w:t>
       </w:r>
       <w:r>
         <w:t xml:space="preserve"> </w:t>
@@ -7829,22 +8097,7 @@
           <m:t>Δ</m:t>
         </m:r>
         <m:r>
-          <m:rPr>
-            <m:sty m:val="p"/>
-          </m:rPr>
-          <m:t>N</m:t>
-        </m:r>
-        <m:r>
-          <m:rPr>
-            <m:sty m:val="p"/>
-          </m:rPr>
-          <m:t>L</m:t>
-        </m:r>
-        <m:r>
-          <m:rPr>
-            <m:sty m:val="p"/>
-          </m:rPr>
-          <m:t>L</m:t>
+          <m:t>D</m:t>
         </m:r>
         <m:r>
           <m:rPr>
@@ -7996,11 +8249,11 @@
           <m:t>±</m:t>
         </m:r>
         <m:r>
-          <m:t>3.04</m:t>
+          <m:t>3.40</m:t>
         </m:r>
       </m:oMath>
       <w:r>
-        <w:t xml:space="preserve">), confirming the logarithmic</w:t>
+        <w:t xml:space="preserve">, sample SD), confirming the logarithmic</w:t>
       </w:r>
       <w:r>
         <w:t xml:space="preserve"> </w:t>
@@ -8013,11 +8266,11 @@
       <w:pPr>
         <w:pStyle w:val="Heading4"/>
       </w:pPr>
-      <w:bookmarkStart w:id="35" w:name="_6b969198ff632a49be3607158edcc3a004149c0"/>
+      <w:bookmarkStart w:id="44" w:name="_6b969198ff632a49be3607158edcc3a004149c0"/>
       <w:r>
         <w:t xml:space="preserve">Time Dilation.</w:t>
       </w:r>
-      <w:bookmarkEnd w:id="35"/>
+      <w:bookmarkEnd w:id="44"/>
     </w:p>
     <w:p>
       <w:pPr>
@@ -8332,11 +8585,11 @@
       <w:pPr>
         <w:pStyle w:val="Heading1"/>
       </w:pPr>
-      <w:bookmarkStart w:id="36" w:name="_discussion"/>
+      <w:bookmarkStart w:id="45" w:name="_discussion"/>
       <w:r>
         <w:t xml:space="preserve">Discussion</w:t>
       </w:r>
-      <w:bookmarkEnd w:id="36"/>
+      <w:bookmarkEnd w:id="45"/>
     </w:p>
     <w:p>
       <w:pPr>
@@ -8821,7 +9074,7 @@
         <w:t xml:space="preserve">identifiability metrics.</w:t>
       </w:r>
     </w:p>
-    <w:bookmarkStart w:id="37" w:name="_96aeef6d635a29d310fd6bb56863d841e90bdd0"/>
+    <w:bookmarkStart w:id="46" w:name="_96aeef6d635a29d310fd6bb56863d841e90bdd0"/>
     <w:p>
       <w:pPr>
         <w:pStyle w:val="TableCaption"/>
@@ -9123,16 +9376,16 @@
         </w:tc>
       </w:tr>
     </w:tbl>
-    <w:bookmarkEnd w:id="37"/>
+    <w:bookmarkEnd w:id="46"/>
     <w:p>
       <w:pPr>
         <w:pStyle w:val="Heading2"/>
       </w:pPr>
-      <w:bookmarkStart w:id="38" w:name="_9ec194be0a3e630d64226647765ad9b11c91126"/>
+      <w:bookmarkStart w:id="47" w:name="_9ec194be0a3e630d64226647765ad9b11c91126"/>
       <w:r>
         <w:t xml:space="preserve">Limitations</w:t>
       </w:r>
-      <w:bookmarkEnd w:id="38"/>
+      <w:bookmarkEnd w:id="47"/>
     </w:p>
     <w:p>
       <w:pPr>
@@ -9324,11 +9577,11 @@
       <w:pPr>
         <w:pStyle w:val="Heading1"/>
       </w:pPr>
-      <w:bookmarkStart w:id="39" w:name="_conclusion"/>
+      <w:bookmarkStart w:id="48" w:name="_conclusion"/>
       <w:r>
         <w:t xml:space="preserve">Conclusion</w:t>
       </w:r>
-      <w:bookmarkEnd w:id="39"/>
+      <w:bookmarkEnd w:id="48"/>
     </w:p>
     <w:p>
       <w:pPr>
@@ -9599,11 +9852,11 @@
       <w:pPr>
         <w:pStyle w:val="Heading1"/>
       </w:pPr>
-      <w:bookmarkStart w:id="40" w:name="_d6dc127f91df9bcc46c1702cd683a760cc63be4"/>
+      <w:bookmarkStart w:id="49" w:name="_d6dc127f91df9bcc46c1702cd683a760cc63be4"/>
       <w:r>
         <w:t xml:space="preserve">Use of AI-Assisted Tools</w:t>
       </w:r>
-      <w:bookmarkEnd w:id="40"/>
+      <w:bookmarkEnd w:id="49"/>
     </w:p>
     <w:p>
       <w:pPr>
@@ -9645,7 +9898,7 @@
       <w:r>
         <w:t xml:space="preserve"> </w:t>
       </w:r>
-      <w:hyperlink r:id="rId41">
+      <w:hyperlink r:id="rId50">
         <w:r>
           <w:rPr>
             <w:rStyle w:val="Hyperlink"/>
@@ -9661,11 +9914,11 @@
       <w:pPr>
         <w:pStyle w:val="Heading1"/>
       </w:pPr>
-      <w:bookmarkStart w:id="42" w:name="_ea5c66868f283220c19382d0fdd5a852ec570ca"/>
+      <w:bookmarkStart w:id="51" w:name="_ea5c66868f283220c19382d0fdd5a852ec570ca"/>
       <w:r>
         <w:t xml:space="preserve">Data Availability</w:t>
       </w:r>
-      <w:bookmarkEnd w:id="42"/>
+      <w:bookmarkEnd w:id="51"/>
     </w:p>
     <w:p>
       <w:pPr>
@@ -9687,8 +9940,8 @@
         <w:t xml:space="preserve">No proprietary or restricted datasets are used.</w:t>
       </w:r>
     </w:p>
-    <w:bookmarkStart w:id="97" w:name="_refs"/>
-    <w:bookmarkStart w:id="44" w:name="_4821a1adf58ef0c96a762a09b8aff3e5f2fbdd2"/>
+    <w:bookmarkStart w:id="106" w:name="_refs"/>
+    <w:bookmarkStart w:id="53" w:name="_4821a1adf58ef0c96a762a09b8aff3e5f2fbdd2"/>
     <w:p>
       <w:pPr>
         <w:pStyle w:val="Bibliography"/>
@@ -9722,7 +9975,7 @@
       <w:r>
         <w:t xml:space="preserve"> </w:t>
       </w:r>
-      <w:hyperlink r:id="rId43">
+      <w:hyperlink r:id="rId52">
         <w:r>
           <w:rPr>
             <w:rStyle w:val="Hyperlink"/>
@@ -9734,8 +9987,8 @@
         <w:t xml:space="preserve">.</w:t>
       </w:r>
     </w:p>
-    <w:bookmarkEnd w:id="44"/>
-    <w:bookmarkStart w:id="46" w:name="_972595d462a57f288069c0989f06ae98b9776ca"/>
+    <w:bookmarkEnd w:id="53"/>
+    <w:bookmarkStart w:id="55" w:name="_972595d462a57f288069c0989f06ae98b9776ca"/>
     <w:p>
       <w:pPr>
         <w:pStyle w:val="Bibliography"/>
@@ -9769,7 +10022,7 @@
       <w:r>
         <w:t xml:space="preserve"> </w:t>
       </w:r>
-      <w:hyperlink r:id="rId45">
+      <w:hyperlink r:id="rId54">
         <w:r>
           <w:rPr>
             <w:rStyle w:val="Hyperlink"/>
@@ -9781,8 +10034,8 @@
         <w:t xml:space="preserve">.</w:t>
       </w:r>
     </w:p>
-    <w:bookmarkEnd w:id="46"/>
-    <w:bookmarkStart w:id="47" w:name="_5a7bf24f795849e5e5e3120cac41566a0db05ce"/>
+    <w:bookmarkEnd w:id="55"/>
+    <w:bookmarkStart w:id="56" w:name="_5a7bf24f795849e5e5e3120cac41566a0db05ce"/>
     <w:p>
       <w:pPr>
         <w:pStyle w:val="Bibliography"/>
@@ -9805,8 +10058,8 @@
         <w:t xml:space="preserve">. 2nd ed. Wiley.</w:t>
       </w:r>
     </w:p>
-    <w:bookmarkEnd w:id="47"/>
-    <w:bookmarkStart w:id="49" w:name="_527bc24a5bc63163e89c9230bde2b620b0637aa"/>
+    <w:bookmarkEnd w:id="56"/>
+    <w:bookmarkStart w:id="58" w:name="_527bc24a5bc63163e89c9230bde2b620b0637aa"/>
     <w:p>
       <w:pPr>
         <w:pStyle w:val="Bibliography"/>
@@ -9840,7 +10093,7 @@
       <w:r>
         <w:t xml:space="preserve"> </w:t>
       </w:r>
-      <w:hyperlink r:id="rId48">
+      <w:hyperlink r:id="rId57">
         <w:r>
           <w:rPr>
             <w:rStyle w:val="Hyperlink"/>
@@ -9852,8 +10105,8 @@
         <w:t xml:space="preserve">.</w:t>
       </w:r>
     </w:p>
-    <w:bookmarkEnd w:id="49"/>
-    <w:bookmarkStart w:id="50" w:name="_1f20afe20d89a70b30df817a6a432dd3d531798"/>
+    <w:bookmarkEnd w:id="58"/>
+    <w:bookmarkStart w:id="59" w:name="_1f20afe20d89a70b30df817a6a432dd3d531798"/>
     <w:p>
       <w:pPr>
         <w:pStyle w:val="Bibliography"/>
@@ -9885,8 +10138,8 @@
         <w:t xml:space="preserve">95 (3): 759–71.</w:t>
       </w:r>
     </w:p>
-    <w:bookmarkEnd w:id="50"/>
-    <w:bookmarkStart w:id="52" w:name="_1aa4da2289bc40a24eeb1e679cede6f8870fdd8"/>
+    <w:bookmarkEnd w:id="59"/>
+    <w:bookmarkStart w:id="61" w:name="_1aa4da2289bc40a24eeb1e679cede6f8870fdd8"/>
     <w:p>
       <w:pPr>
         <w:pStyle w:val="Bibliography"/>
@@ -9929,7 +10182,7 @@
       <w:r>
         <w:t xml:space="preserve"> </w:t>
       </w:r>
-      <w:hyperlink r:id="rId51">
+      <w:hyperlink r:id="rId60">
         <w:r>
           <w:rPr>
             <w:rStyle w:val="Hyperlink"/>
@@ -9941,8 +10194,8 @@
         <w:t xml:space="preserve">.</w:t>
       </w:r>
     </w:p>
-    <w:bookmarkEnd w:id="52"/>
-    <w:bookmarkStart w:id="54" w:name="_47fce09a41d36943dba5ee88797fd7a28ead209"/>
+    <w:bookmarkEnd w:id="61"/>
+    <w:bookmarkStart w:id="63" w:name="_47fce09a41d36943dba5ee88797fd7a28ead209"/>
     <w:p>
       <w:pPr>
         <w:pStyle w:val="Bibliography"/>
@@ -9985,7 +10238,7 @@
       <w:r>
         <w:t xml:space="preserve"> </w:t>
       </w:r>
-      <w:hyperlink r:id="rId53">
+      <w:hyperlink r:id="rId62">
         <w:r>
           <w:rPr>
             <w:rStyle w:val="Hyperlink"/>
@@ -9997,8 +10250,8 @@
         <w:t xml:space="preserve">.</w:t>
       </w:r>
     </w:p>
-    <w:bookmarkEnd w:id="54"/>
-    <w:bookmarkStart w:id="56" w:name="_57bb1749bce326fa5cfd4da4d6d25d6b6384540"/>
+    <w:bookmarkEnd w:id="63"/>
+    <w:bookmarkStart w:id="65" w:name="_57bb1749bce326fa5cfd4da4d6d25d6b6384540"/>
     <w:p>
       <w:pPr>
         <w:pStyle w:val="Bibliography"/>
@@ -10065,7 +10318,7 @@
       <w:r>
         <w:t xml:space="preserve"> </w:t>
       </w:r>
-      <w:hyperlink r:id="rId55">
+      <w:hyperlink r:id="rId64">
         <w:r>
           <w:rPr>
             <w:rStyle w:val="Hyperlink"/>
@@ -10077,8 +10330,8 @@
         <w:t xml:space="preserve">.</w:t>
       </w:r>
     </w:p>
-    <w:bookmarkEnd w:id="56"/>
-    <w:bookmarkStart w:id="57" w:name="_3dffa07bf7d9f10c2c4fc62ba3207e235802136"/>
+    <w:bookmarkEnd w:id="65"/>
+    <w:bookmarkStart w:id="66" w:name="_3dffa07bf7d9f10c2c4fc62ba3207e235802136"/>
     <w:p>
       <w:pPr>
         <w:pStyle w:val="Bibliography"/>
@@ -10110,8 +10363,8 @@
         <w:t xml:space="preserve">33: 17429–42.</w:t>
       </w:r>
     </w:p>
-    <w:bookmarkEnd w:id="57"/>
-    <w:bookmarkStart w:id="58" w:name="_5baff60950e3fd28de2def13fedece90097bde2"/>
+    <w:bookmarkEnd w:id="66"/>
+    <w:bookmarkStart w:id="67" w:name="_5baff60950e3fd28de2def13fedece90097bde2"/>
     <w:p>
       <w:pPr>
         <w:pStyle w:val="Bibliography"/>
@@ -10149,8 +10402,8 @@
         <w:t xml:space="preserve">24: 185–206.</w:t>
       </w:r>
     </w:p>
-    <w:bookmarkEnd w:id="58"/>
-    <w:bookmarkStart w:id="60" w:name="_54fc4244cf878bc882c58757acab17cf0f1de4b"/>
+    <w:bookmarkEnd w:id="67"/>
+    <w:bookmarkStart w:id="69" w:name="_54fc4244cf878bc882c58757acab17cf0f1de4b"/>
     <w:p>
       <w:pPr>
         <w:pStyle w:val="Bibliography"/>
@@ -10190,7 +10443,7 @@
       <w:r>
         <w:t xml:space="preserve"> </w:t>
       </w:r>
-      <w:hyperlink r:id="rId59">
+      <w:hyperlink r:id="rId68">
         <w:r>
           <w:rPr>
             <w:rStyle w:val="Hyperlink"/>
@@ -10202,8 +10455,8 @@
         <w:t xml:space="preserve">.</w:t>
       </w:r>
     </w:p>
-    <w:bookmarkEnd w:id="60"/>
-    <w:bookmarkStart w:id="62" w:name="_6d9de38ad2303b748f9514fcc69957dc59bffcf"/>
+    <w:bookmarkEnd w:id="69"/>
+    <w:bookmarkStart w:id="71" w:name="_6d9de38ad2303b748f9514fcc69957dc59bffcf"/>
     <w:p>
       <w:pPr>
         <w:pStyle w:val="Bibliography"/>
@@ -10235,7 +10488,7 @@
       <w:r>
         <w:t xml:space="preserve"> </w:t>
       </w:r>
-      <w:hyperlink r:id="rId61">
+      <w:hyperlink r:id="rId70">
         <w:r>
           <w:rPr>
             <w:rStyle w:val="Hyperlink"/>
@@ -10247,8 +10500,8 @@
         <w:t xml:space="preserve">.</w:t>
       </w:r>
     </w:p>
-    <w:bookmarkEnd w:id="62"/>
-    <w:bookmarkStart w:id="64" w:name="_7d626b01f070f825f964e2471844a68b8b1a8c0"/>
+    <w:bookmarkEnd w:id="71"/>
+    <w:bookmarkStart w:id="73" w:name="_7d626b01f070f825f964e2471844a68b8b1a8c0"/>
     <w:p>
       <w:pPr>
         <w:pStyle w:val="Bibliography"/>
@@ -10282,7 +10535,7 @@
       <w:r>
         <w:t xml:space="preserve"> </w:t>
       </w:r>
-      <w:hyperlink r:id="rId63">
+      <w:hyperlink r:id="rId72">
         <w:r>
           <w:rPr>
             <w:rStyle w:val="Hyperlink"/>
@@ -10294,8 +10547,8 @@
         <w:t xml:space="preserve">.</w:t>
       </w:r>
     </w:p>
-    <w:bookmarkEnd w:id="64"/>
-    <w:bookmarkStart w:id="66" w:name="_67d140581bebbd7107a285497e887c8d9f7aade"/>
+    <w:bookmarkEnd w:id="73"/>
+    <w:bookmarkStart w:id="75" w:name="_67d140581bebbd7107a285497e887c8d9f7aade"/>
     <w:p>
       <w:pPr>
         <w:pStyle w:val="Bibliography"/>
@@ -10329,7 +10582,7 @@
       <w:r>
         <w:t xml:space="preserve"> </w:t>
       </w:r>
-      <w:hyperlink r:id="rId65">
+      <w:hyperlink r:id="rId74">
         <w:r>
           <w:rPr>
             <w:rStyle w:val="Hyperlink"/>
@@ -10341,8 +10594,8 @@
         <w:t xml:space="preserve">.</w:t>
       </w:r>
     </w:p>
-    <w:bookmarkEnd w:id="66"/>
-    <w:bookmarkStart w:id="68" w:name="_d05e573060570526385b447eaf9f72b7345eb82"/>
+    <w:bookmarkEnd w:id="75"/>
+    <w:bookmarkStart w:id="77" w:name="_d05e573060570526385b447eaf9f72b7345eb82"/>
     <w:p>
       <w:pPr>
         <w:pStyle w:val="Bibliography"/>
@@ -10376,7 +10629,7 @@
       <w:r>
         <w:t xml:space="preserve"> </w:t>
       </w:r>
-      <w:hyperlink r:id="rId67">
+      <w:hyperlink r:id="rId76">
         <w:r>
           <w:rPr>
             <w:rStyle w:val="Hyperlink"/>
@@ -10388,8 +10641,8 @@
         <w:t xml:space="preserve">.</w:t>
       </w:r>
     </w:p>
-    <w:bookmarkEnd w:id="68"/>
-    <w:bookmarkStart w:id="70" w:name="_1900e79b43a611181bec25bb8fa080110cfe3b3"/>
+    <w:bookmarkEnd w:id="77"/>
+    <w:bookmarkStart w:id="79" w:name="_1900e79b43a611181bec25bb8fa080110cfe3b3"/>
     <w:p>
       <w:pPr>
         <w:pStyle w:val="Bibliography"/>
@@ -10423,7 +10676,7 @@
       <w:r>
         <w:t xml:space="preserve"> </w:t>
       </w:r>
-      <w:hyperlink r:id="rId69">
+      <w:hyperlink r:id="rId78">
         <w:r>
           <w:rPr>
             <w:rStyle w:val="Hyperlink"/>
@@ -10435,8 +10688,8 @@
         <w:t xml:space="preserve">.</w:t>
       </w:r>
     </w:p>
-    <w:bookmarkEnd w:id="70"/>
-    <w:bookmarkStart w:id="72" w:name="_706d685f658d8e4e7854a745bc539622c68d316"/>
+    <w:bookmarkEnd w:id="79"/>
+    <w:bookmarkStart w:id="81" w:name="_706d685f658d8e4e7854a745bc539622c68d316"/>
     <w:p>
       <w:pPr>
         <w:pStyle w:val="Bibliography"/>
@@ -10470,7 +10723,7 @@
       <w:r>
         <w:t xml:space="preserve"> </w:t>
       </w:r>
-      <w:hyperlink r:id="rId71">
+      <w:hyperlink r:id="rId80">
         <w:r>
           <w:rPr>
             <w:rStyle w:val="Hyperlink"/>
@@ -10482,8 +10735,8 @@
         <w:t xml:space="preserve">.</w:t>
       </w:r>
     </w:p>
-    <w:bookmarkEnd w:id="72"/>
-    <w:bookmarkStart w:id="74" w:name="_111554707e6767316c8b5ff11c385e98243c247"/>
+    <w:bookmarkEnd w:id="81"/>
+    <w:bookmarkStart w:id="83" w:name="_111554707e6767316c8b5ff11c385e98243c247"/>
     <w:p>
       <w:pPr>
         <w:pStyle w:val="Bibliography"/>
@@ -10517,7 +10770,7 @@
       <w:r>
         <w:t xml:space="preserve"> </w:t>
       </w:r>
-      <w:hyperlink r:id="rId73">
+      <w:hyperlink r:id="rId82">
         <w:r>
           <w:rPr>
             <w:rStyle w:val="Hyperlink"/>
@@ -10529,8 +10782,8 @@
         <w:t xml:space="preserve">.</w:t>
       </w:r>
     </w:p>
-    <w:bookmarkEnd w:id="74"/>
-    <w:bookmarkStart w:id="75" w:name="_3eeecacc9a76ececfb93de6eecd116041e12250"/>
+    <w:bookmarkEnd w:id="83"/>
+    <w:bookmarkStart w:id="84" w:name="_3eeecacc9a76ececfb93de6eecd116041e12250"/>
     <w:p>
       <w:pPr>
         <w:pStyle w:val="Bibliography"/>
@@ -10553,8 +10806,8 @@
         <w:t xml:space="preserve">. MIT Press.</w:t>
       </w:r>
     </w:p>
-    <w:bookmarkEnd w:id="75"/>
-    <w:bookmarkStart w:id="76" w:name="_487adff8243fba59e6cf717edc54005140a48bd"/>
+    <w:bookmarkEnd w:id="84"/>
+    <w:bookmarkStart w:id="85" w:name="_487adff8243fba59e6cf717edc54005140a48bd"/>
     <w:p>
       <w:pPr>
         <w:pStyle w:val="Bibliography"/>
@@ -10583,8 +10836,8 @@
         <w:t xml:space="preserve">.</w:t>
       </w:r>
     </w:p>
-    <w:bookmarkEnd w:id="76"/>
-    <w:bookmarkStart w:id="78" w:name="_91b59947130ffdd5d02deab777df77813338c35"/>
+    <w:bookmarkEnd w:id="85"/>
+    <w:bookmarkStart w:id="87" w:name="_91b59947130ffdd5d02deab777df77813338c35"/>
     <w:p>
       <w:pPr>
         <w:pStyle w:val="Bibliography"/>
@@ -10618,7 +10871,7 @@
       <w:r>
         <w:t xml:space="preserve"> </w:t>
       </w:r>
-      <w:hyperlink r:id="rId77">
+      <w:hyperlink r:id="rId86">
         <w:r>
           <w:rPr>
             <w:rStyle w:val="Hyperlink"/>
@@ -10630,8 +10883,8 @@
         <w:t xml:space="preserve">.</w:t>
       </w:r>
     </w:p>
-    <w:bookmarkEnd w:id="78"/>
-    <w:bookmarkStart w:id="79" w:name="_97fe74aee6e1866024e3578107d1a9db6ca039d"/>
+    <w:bookmarkEnd w:id="87"/>
+    <w:bookmarkStart w:id="88" w:name="_97fe74aee6e1866024e3578107d1a9db6ca039d"/>
     <w:p>
       <w:pPr>
         <w:pStyle w:val="Bibliography"/>
@@ -10663,8 +10916,8 @@
         <w:t xml:space="preserve">26: 1–83.</w:t>
       </w:r>
     </w:p>
-    <w:bookmarkEnd w:id="79"/>
-    <w:bookmarkStart w:id="81" w:name="_ef604ae533fad333bc697748e3dc0fd28f0aa78"/>
+    <w:bookmarkEnd w:id="88"/>
+    <w:bookmarkStart w:id="90" w:name="_ef604ae533fad333bc697748e3dc0fd28f0aa78"/>
     <w:p>
       <w:pPr>
         <w:pStyle w:val="Bibliography"/>
@@ -10695,7 +10948,7 @@
       <w:r>
         <w:t xml:space="preserve"> </w:t>
       </w:r>
-      <w:hyperlink r:id="rId80">
+      <w:hyperlink r:id="rId89">
         <w:r>
           <w:rPr>
             <w:rStyle w:val="Hyperlink"/>
@@ -10707,8 +10960,8 @@
         <w:t xml:space="preserve">.</w:t>
       </w:r>
     </w:p>
-    <w:bookmarkEnd w:id="81"/>
-    <w:bookmarkStart w:id="83" w:name="_457df0eb6f3cee80a45c4fff61dc37b0f5cd9b1"/>
+    <w:bookmarkEnd w:id="90"/>
+    <w:bookmarkStart w:id="92" w:name="_457df0eb6f3cee80a45c4fff61dc37b0f5cd9b1"/>
     <w:p>
       <w:pPr>
         <w:pStyle w:val="Bibliography"/>
@@ -10742,7 +10995,7 @@
       <w:r>
         <w:t xml:space="preserve"> </w:t>
       </w:r>
-      <w:hyperlink r:id="rId82">
+      <w:hyperlink r:id="rId91">
         <w:r>
           <w:rPr>
             <w:rStyle w:val="Hyperlink"/>
@@ -10754,8 +11007,8 @@
         <w:t xml:space="preserve">.</w:t>
       </w:r>
     </w:p>
-    <w:bookmarkEnd w:id="83"/>
-    <w:bookmarkStart w:id="85" w:name="_224126058e881b11118696e484baee7c8dbe6db"/>
+    <w:bookmarkEnd w:id="92"/>
+    <w:bookmarkStart w:id="94" w:name="_224126058e881b11118696e484baee7c8dbe6db"/>
     <w:p>
       <w:pPr>
         <w:pStyle w:val="Bibliography"/>
@@ -10789,7 +11042,7 @@
       <w:r>
         <w:t xml:space="preserve"> </w:t>
       </w:r>
-      <w:hyperlink r:id="rId84">
+      <w:hyperlink r:id="rId93">
         <w:r>
           <w:rPr>
             <w:rStyle w:val="Hyperlink"/>
@@ -10801,8 +11054,8 @@
         <w:t xml:space="preserve">.</w:t>
       </w:r>
     </w:p>
-    <w:bookmarkEnd w:id="85"/>
-    <w:bookmarkStart w:id="87" w:name="_1717fb37a54aa1a40df471b2975d2fd09729c85"/>
+    <w:bookmarkEnd w:id="94"/>
+    <w:bookmarkStart w:id="96" w:name="_1717fb37a54aa1a40df471b2975d2fd09729c85"/>
     <w:p>
       <w:pPr>
         <w:pStyle w:val="Bibliography"/>
@@ -10836,7 +11089,7 @@
       <w:r>
         <w:t xml:space="preserve"> </w:t>
       </w:r>
-      <w:hyperlink r:id="rId86">
+      <w:hyperlink r:id="rId95">
         <w:r>
           <w:rPr>
             <w:rStyle w:val="Hyperlink"/>
@@ -10848,8 +11101,8 @@
         <w:t xml:space="preserve">.</w:t>
       </w:r>
     </w:p>
-    <w:bookmarkEnd w:id="87"/>
-    <w:bookmarkStart w:id="89" w:name="_8b25f64435fc5ff192d03ffcdc0af37daecff02"/>
+    <w:bookmarkEnd w:id="96"/>
+    <w:bookmarkStart w:id="98" w:name="_8b25f64435fc5ff192d03ffcdc0af37daecff02"/>
     <w:p>
       <w:pPr>
         <w:pStyle w:val="Bibliography"/>
@@ -10901,7 +11154,7 @@
       <w:r>
         <w:t xml:space="preserve"> </w:t>
       </w:r>
-      <w:hyperlink r:id="rId88">
+      <w:hyperlink r:id="rId97">
         <w:r>
           <w:rPr>
             <w:rStyle w:val="Hyperlink"/>
@@ -10913,8 +11166,8 @@
         <w:t xml:space="preserve">.</w:t>
       </w:r>
     </w:p>
-    <w:bookmarkEnd w:id="89"/>
-    <w:bookmarkStart w:id="91" w:name="_087162fecb529c26266ceb922b457ce775002f4"/>
+    <w:bookmarkEnd w:id="98"/>
+    <w:bookmarkStart w:id="100" w:name="_087162fecb529c26266ceb922b457ce775002f4"/>
     <w:p>
       <w:pPr>
         <w:pStyle w:val="Bibliography"/>
@@ -10948,7 +11201,7 @@
       <w:r>
         <w:t xml:space="preserve"> </w:t>
       </w:r>
-      <w:hyperlink r:id="rId90">
+      <w:hyperlink r:id="rId99">
         <w:r>
           <w:rPr>
             <w:rStyle w:val="Hyperlink"/>
@@ -10960,8 +11213,8 @@
         <w:t xml:space="preserve">.</w:t>
       </w:r>
     </w:p>
-    <w:bookmarkEnd w:id="91"/>
-    <w:bookmarkStart w:id="92" w:name="_7ab753a07ab1486fccf9d5891a2e9e206624fa4"/>
+    <w:bookmarkEnd w:id="100"/>
+    <w:bookmarkStart w:id="101" w:name="_7ab753a07ab1486fccf9d5891a2e9e206624fa4"/>
     <w:p>
       <w:pPr>
         <w:pStyle w:val="Bibliography"/>
@@ -11002,8 +11255,8 @@
         <w:t xml:space="preserve">33: 4860–71.</w:t>
       </w:r>
     </w:p>
-    <w:bookmarkEnd w:id="92"/>
-    <w:bookmarkStart w:id="94" w:name="_a9b2e19e299c9f94ea16f0b1c1b195864220abf"/>
+    <w:bookmarkEnd w:id="101"/>
+    <w:bookmarkStart w:id="103" w:name="_a9b2e19e299c9f94ea16f0b1c1b195864220abf"/>
     <w:p>
       <w:pPr>
         <w:pStyle w:val="Bibliography"/>
@@ -11043,7 +11296,7 @@
       <w:r>
         <w:t xml:space="preserve"> </w:t>
       </w:r>
-      <w:hyperlink r:id="rId93">
+      <w:hyperlink r:id="rId102">
         <w:r>
           <w:rPr>
             <w:rStyle w:val="Hyperlink"/>
@@ -11055,8 +11308,8 @@
         <w:t xml:space="preserve">.</w:t>
       </w:r>
     </w:p>
-    <w:bookmarkEnd w:id="94"/>
-    <w:bookmarkStart w:id="96" w:name="_a50bc08bafa126fa7b3f332668ec078da73e90d"/>
+    <w:bookmarkEnd w:id="103"/>
+    <w:bookmarkStart w:id="105" w:name="_a50bc08bafa126fa7b3f332668ec078da73e90d"/>
     <w:p>
       <w:pPr>
         <w:pStyle w:val="Bibliography"/>
@@ -11090,7 +11343,7 @@
       <w:r>
         <w:t xml:space="preserve"> </w:t>
       </w:r>
-      <w:hyperlink r:id="rId95">
+      <w:hyperlink r:id="rId104">
         <w:r>
           <w:rPr>
             <w:rStyle w:val="Hyperlink"/>
@@ -11102,8 +11355,8 @@
         <w:t xml:space="preserve">.</w:t>
       </w:r>
     </w:p>
-    <w:bookmarkEnd w:id="96"/>
-    <w:bookmarkEnd w:id="97"/>
+    <w:bookmarkEnd w:id="105"/>
+    <w:bookmarkEnd w:id="106"/>
     <w:sectPr>
       <w:footnotePr>
         <w:numRestart w:val="eachSect"/>
@@ -11166,7 +11419,7 @@
       </w:r>
     </w:p>
   </w:footnote>
-  <w:footnote w:id="32">
+  <w:footnote w:id="41">
     <w:p>
       <w:pPr>
         <w:pStyle w:val="FootnoteText"/>
@@ -11262,22 +11515,7 @@
           <m:t>Δ</m:t>
         </m:r>
         <m:r>
-          <m:rPr>
-            <m:sty m:val="p"/>
-          </m:rPr>
-          <m:t>N</m:t>
-        </m:r>
-        <m:r>
-          <m:rPr>
-            <m:sty m:val="p"/>
-          </m:rPr>
-          <m:t>L</m:t>
-        </m:r>
-        <m:r>
-          <m:rPr>
-            <m:sty m:val="p"/>
-          </m:rPr>
-          <m:t>L</m:t>
+          <m:t>D</m:t>
         </m:r>
       </m:oMath>
       <w:r>
@@ -11290,6 +11528,219 @@
         <w:t xml:space="preserve"> </w:t>
       </w:r>
       <w:r>
+        <w:t xml:space="preserve">Here</w:t>
+      </w:r>
+      <w:r>
+        <w:t xml:space="preserve"> </w:t>
+      </w:r>
+      <m:oMath>
+        <m:r>
+          <m:rPr>
+            <m:sty m:val="p"/>
+          </m:rPr>
+          <m:t>|</m:t>
+        </m:r>
+        <m:sSub>
+          <m:e>
+            <m:r>
+              <m:rPr>
+                <m:scr m:val="script"/>
+                <m:sty m:val="p"/>
+              </m:rPr>
+              <m:t>C</m:t>
+            </m:r>
+          </m:e>
+          <m:sub>
+            <m:r>
+              <m:rPr>
+                <m:sty m:val="p"/>
+              </m:rPr>
+              <m:t>a</m:t>
+            </m:r>
+            <m:r>
+              <m:rPr>
+                <m:sty m:val="p"/>
+              </m:rPr>
+              <m:t>b</m:t>
+            </m:r>
+            <m:r>
+              <m:rPr>
+                <m:sty m:val="p"/>
+              </m:rPr>
+              <m:t>l</m:t>
+            </m:r>
+            <m:r>
+              <m:rPr>
+                <m:sty m:val="p"/>
+              </m:rPr>
+              <m:t>a</m:t>
+            </m:r>
+            <m:r>
+              <m:rPr>
+                <m:sty m:val="p"/>
+              </m:rPr>
+              <m:t>t</m:t>
+            </m:r>
+            <m:r>
+              <m:rPr>
+                <m:sty m:val="p"/>
+              </m:rPr>
+              <m:t>e</m:t>
+            </m:r>
+            <m:r>
+              <m:rPr>
+                <m:sty m:val="p"/>
+              </m:rPr>
+              <m:t>d</m:t>
+            </m:r>
+          </m:sub>
+        </m:sSub>
+        <m:r>
+          <m:rPr>
+            <m:sty m:val="p"/>
+          </m:rPr>
+          <m:t>|</m:t>
+        </m:r>
+        <m:r>
+          <m:rPr>
+            <m:sty m:val="p"/>
+          </m:rPr>
+          <m:t>=</m:t>
+        </m:r>
+        <m:r>
+          <m:t>814</m:t>
+        </m:r>
+        <m:r>
+          <m:rPr>
+            <m:sty m:val="p"/>
+          </m:rPr>
+          <m:t>/</m:t>
+        </m:r>
+        <m:r>
+          <m:t>534</m:t>
+        </m:r>
+        <m:r>
+          <m:rPr>
+            <m:sty m:val="p"/>
+          </m:rPr>
+          <m:t>/</m:t>
+        </m:r>
+        <m:r>
+          <m:t>700</m:t>
+        </m:r>
+      </m:oMath>
+      <w:r>
+        <w:t xml:space="preserve"> </w:t>
+      </w:r>
+      <w:r>
+        <w:t xml:space="preserve">for Screened Coulomb, Entropy</w:t>
+      </w:r>
+      <w:r>
+        <w:t xml:space="preserve"> </w:t>
+      </w:r>
+      <w:r>
+        <w:t xml:space="preserve">Expansion, and Time Dilation, versus</w:t>
+      </w:r>
+      <w:r>
+        <w:t xml:space="preserve"> </w:t>
+      </w:r>
+      <m:oMath>
+        <m:r>
+          <m:rPr>
+            <m:sty m:val="p"/>
+          </m:rPr>
+          <m:t>|</m:t>
+        </m:r>
+        <m:sSub>
+          <m:e>
+            <m:r>
+              <m:rPr>
+                <m:scr m:val="script"/>
+                <m:sty m:val="p"/>
+              </m:rPr>
+              <m:t>C</m:t>
+            </m:r>
+          </m:e>
+          <m:sub>
+            <m:r>
+              <m:rPr>
+                <m:sty m:val="p"/>
+              </m:rPr>
+              <m:t>d</m:t>
+            </m:r>
+            <m:r>
+              <m:rPr>
+                <m:sty m:val="p"/>
+              </m:rPr>
+              <m:t>o</m:t>
+            </m:r>
+            <m:r>
+              <m:rPr>
+                <m:sty m:val="p"/>
+              </m:rPr>
+              <m:t>m</m:t>
+            </m:r>
+            <m:r>
+              <m:rPr>
+                <m:sty m:val="p"/>
+              </m:rPr>
+              <m:t>a</m:t>
+            </m:r>
+            <m:r>
+              <m:rPr>
+                <m:sty m:val="p"/>
+              </m:rPr>
+              <m:t>i</m:t>
+            </m:r>
+            <m:r>
+              <m:rPr>
+                <m:sty m:val="p"/>
+              </m:rPr>
+              <m:t>n</m:t>
+            </m:r>
+          </m:sub>
+        </m:sSub>
+        <m:r>
+          <m:rPr>
+            <m:sty m:val="p"/>
+          </m:rPr>
+          <m:t>|</m:t>
+        </m:r>
+        <m:r>
+          <m:rPr>
+            <m:sty m:val="p"/>
+          </m:rPr>
+          <m:t>=</m:t>
+        </m:r>
+        <m:r>
+          <m:t>60</m:t>
+        </m:r>
+        <m:r>
+          <m:rPr>
+            <m:sty m:val="p"/>
+          </m:rPr>
+          <m:t>/</m:t>
+        </m:r>
+        <m:r>
+          <m:t>40</m:t>
+        </m:r>
+        <m:r>
+          <m:rPr>
+            <m:sty m:val="p"/>
+          </m:rPr>
+          <m:t>/</m:t>
+        </m:r>
+        <m:r>
+          <m:t>10</m:t>
+        </m:r>
+      </m:oMath>
+      <w:r>
+        <w:t xml:space="preserve">.</w:t>
+      </w:r>
+      <w:r>
+        <w:t xml:space="preserve"> </w:t>
+      </w:r>
+      <w:r>
         <w:t xml:space="preserve">Screened Coulomb’s</w:t>
       </w:r>
       <w:r>
@@ -11303,22 +11754,7 @@
           <m:t>Δ</m:t>
         </m:r>
         <m:r>
-          <m:rPr>
-            <m:sty m:val="p"/>
-          </m:rPr>
-          <m:t>N</m:t>
-        </m:r>
-        <m:r>
-          <m:rPr>
-            <m:sty m:val="p"/>
-          </m:rPr>
-          <m:t>L</m:t>
-        </m:r>
-        <m:r>
-          <m:rPr>
-            <m:sty m:val="p"/>
-          </m:rPr>
-          <m:t>L</m:t>
+          <m:t>D</m:t>
         </m:r>
         <m:r>
           <m:rPr>
@@ -11362,22 +11798,7 @@
           <m:t>Δ</m:t>
         </m:r>
         <m:r>
-          <m:rPr>
-            <m:sty m:val="p"/>
-          </m:rPr>
-          <m:t>N</m:t>
-        </m:r>
-        <m:r>
-          <m:rPr>
-            <m:sty m:val="p"/>
-          </m:rPr>
-          <m:t>L</m:t>
-        </m:r>
-        <m:r>
-          <m:rPr>
-            <m:sty m:val="p"/>
-          </m:rPr>
-          <m:t>L</m:t>
+          <m:t>D</m:t>
         </m:r>
         <m:r>
           <m:rPr>

</xml_diff>

<commit_message>
paper: add explicit NLL and oscillatory misspecification parentheticals for reviewer clarity
</commit_message>
<xml_diff>
--- a/paper/main.docx
+++ b/paper/main.docx
@@ -3627,7 +3627,69 @@
         <w:t xml:space="preserve"> </w:t>
       </w:r>
       <w:r>
-        <w:t xml:space="preserve">under the correct prior).</w:t>
+        <w:t xml:space="preserve">under the correct prior; e.g., applying the oscillatory</w:t>
+      </w:r>
+      <w:r>
+        <w:t xml:space="preserve"> </w:t>
+      </w:r>
+      <w:r>
+        <w:rPr>
+          <w:rStyle w:val="VerbatimChar"/>
+        </w:rPr>
+        <w:t xml:space="preserve">wave_resonance</w:t>
+      </w:r>
+      <w:r>
+        <w:t xml:space="preserve"> </w:t>
+      </w:r>
+      <w:r>
+        <w:t xml:space="preserve">prior to Screened Coulomb yields WITHHELD with</w:t>
+      </w:r>
+      <w:r>
+        <w:t xml:space="preserve"> </w:t>
+      </w:r>
+      <m:oMath>
+        <m:r>
+          <m:rPr>
+            <m:sty m:val="p"/>
+          </m:rPr>
+          <m:t>Δ</m:t>
+        </m:r>
+        <m:r>
+          <m:rPr>
+            <m:sty m:val="p"/>
+          </m:rPr>
+          <m:t>B</m:t>
+        </m:r>
+        <m:r>
+          <m:rPr>
+            <m:sty m:val="p"/>
+          </m:rPr>
+          <m:t>I</m:t>
+        </m:r>
+        <m:r>
+          <m:rPr>
+            <m:sty m:val="p"/>
+          </m:rPr>
+          <m:t>C</m:t>
+        </m:r>
+        <m:r>
+          <m:rPr>
+            <m:sty m:val="p"/>
+          </m:rPr>
+          <m:t>=</m:t>
+        </m:r>
+        <m:r>
+          <m:rPr>
+            <m:sty m:val="p"/>
+          </m:rPr>
+          <m:t>−</m:t>
+        </m:r>
+        <m:r>
+          <m:t>910.5</m:t>
+        </m:r>
+      </m:oMath>
+      <w:r>
+        <w:t xml:space="preserve">).</w:t>
       </w:r>
       <w:r>
         <w:t xml:space="preserve"> </w:t>
@@ -6198,14 +6260,14 @@
       <w:r>
         <w:drawing>
           <wp:inline>
-            <wp:extent cx="5334000" cy="1892220"/>
+            <wp:extent cx="5334000" cy="1883331"/>
             <wp:effectExtent b="0" l="0" r="0" t="0"/>
             <wp:docPr descr="" title="" id="34" name="Picture"/>
             <a:graphic>
               <a:graphicData uri="http://schemas.openxmlformats.org/drawingml/2006/picture">
                 <pic:pic>
                   <pic:nvPicPr>
-                    <pic:cNvPr descr="fig2_bic.png" id="35" name="Picture"/>
+                    <pic:cNvPr descr="fig2_bic.pdf" id="35" name="Picture"/>
                     <pic:cNvPicPr>
                       <a:picLocks noChangeArrowheads="1" noChangeAspect="1"/>
                     </pic:cNvPicPr>
@@ -6219,7 +6281,7 @@
                   <pic:spPr bwMode="auto">
                     <a:xfrm>
                       <a:off x="0" y="0"/>
-                      <a:ext cx="5334000" cy="1892220"/>
+                      <a:ext cx="5334000" cy="1883331"/>
                     </a:xfrm>
                     <a:prstGeom prst="rect">
                       <a:avLst/>
@@ -7099,7 +7161,10 @@
         </m:r>
       </m:oMath>
       <w:r>
-        <w:t xml:space="preserve">, isolates the pure fit-quality advantage from the</w:t>
+        <w:t xml:space="preserve"> </w:t>
+      </w:r>
+      <w:r>
+        <w:t xml:space="preserve">(twice the unpenalized NLL difference), isolates the pure fit-quality advantage from the</w:t>
       </w:r>
       <w:r>
         <w:t xml:space="preserve"> </w:t>

</xml_diff>

<commit_message>
paper: align Pass 2 free-scale enumeration wording in Sec 3.3 with quickfit.py
</commit_message>
<xml_diff>
--- a/paper/main.docx
+++ b/paper/main.docx
@@ -3009,7 +3009,125 @@
         <w:t xml:space="preserve"> </w:t>
       </w:r>
       <w:r>
-        <w:t xml:space="preserve">second, any remaining unpaired variable is normalized by a free-scale parameter</w:t>
+        <w:t xml:space="preserve">second, each dimensional variable is normalized by linear and quadratic free-scale parameters (</w:t>
+      </w:r>
+      <m:oMath>
+        <m:r>
+          <m:t>v</m:t>
+        </m:r>
+        <m:r>
+          <m:rPr>
+            <m:sty m:val="p"/>
+          </m:rPr>
+          <m:t>/</m:t>
+        </m:r>
+        <m:sSub>
+          <m:e>
+            <m:r>
+              <m:t>θ</m:t>
+            </m:r>
+          </m:e>
+          <m:sub>
+            <m:r>
+              <m:t>2</m:t>
+            </m:r>
+            <m:r>
+              <m:t>k</m:t>
+            </m:r>
+          </m:sub>
+        </m:sSub>
+        <m:r>
+          <m:rPr>
+            <m:sty m:val="p"/>
+          </m:rPr>
+          <m:t>,</m:t>
+        </m:r>
+        <m:sSup>
+          <m:e>
+            <m:r>
+              <m:t>v</m:t>
+            </m:r>
+          </m:e>
+          <m:sup>
+            <m:r>
+              <m:t>2</m:t>
+            </m:r>
+          </m:sup>
+        </m:sSup>
+        <m:r>
+          <m:rPr>
+            <m:sty m:val="p"/>
+          </m:rPr>
+          <m:t>/</m:t>
+        </m:r>
+        <m:sSub>
+          <m:e>
+            <m:r>
+              <m:t>θ</m:t>
+            </m:r>
+          </m:e>
+          <m:sub>
+            <m:r>
+              <m:t>2</m:t>
+            </m:r>
+            <m:r>
+              <m:t>k</m:t>
+            </m:r>
+            <m:r>
+              <m:rPr>
+                <m:sty m:val="p"/>
+              </m:rPr>
+              <m:t>+</m:t>
+            </m:r>
+            <m:r>
+              <m:t>1</m:t>
+            </m:r>
+          </m:sub>
+        </m:sSub>
+      </m:oMath>
+      <w:r>
+        <w:t xml:space="preserve">; e.g.,</w:t>
+      </w:r>
+      <w:r>
+        <w:t xml:space="preserve"> </w:t>
+      </w:r>
+      <m:oMath>
+        <m:r>
+          <m:t>r</m:t>
+        </m:r>
+        <m:r>
+          <m:rPr>
+            <m:sty m:val="p"/>
+          </m:rPr>
+          <m:t>/</m:t>
+        </m:r>
+        <m:sSub>
+          <m:e>
+            <m:r>
+              <m:t>θ</m:t>
+            </m:r>
+          </m:e>
+          <m:sub>
+            <m:r>
+              <m:t>4</m:t>
+            </m:r>
+          </m:sub>
+        </m:sSub>
+      </m:oMath>
+      <w:r>
+        <w:t xml:space="preserve">).</w:t>
+      </w:r>
+      <w:r>
+        <w:t xml:space="preserve"> </w:t>
+      </w:r>
+      <w:r>
+        <w:t xml:space="preserve">Extending from the conventional 3D MLT to 5D is essential for correctness:</w:t>
+      </w:r>
+      <w:r>
+        <w:t xml:space="preserve"> </w:t>
+      </w:r>
+      <w:r>
+        <w:t xml:space="preserve">in a 3D engine charges</w:t>
       </w:r>
       <w:r>
         <w:t xml:space="preserve"> </w:t>
@@ -3018,12 +3136,30 @@
         <m:sSub>
           <m:e>
             <m:r>
-              <m:t>θ</m:t>
+              <m:t>q</m:t>
             </m:r>
           </m:e>
           <m:sub>
             <m:r>
-              <m:t>k</m:t>
+              <m:t>1</m:t>
+            </m:r>
+          </m:sub>
+        </m:sSub>
+        <m:r>
+          <m:rPr>
+            <m:sty m:val="p"/>
+          </m:rPr>
+          <m:t>,</m:t>
+        </m:r>
+        <m:sSub>
+          <m:e>
+            <m:r>
+              <m:t>q</m:t>
+            </m:r>
+          </m:e>
+          <m:sub>
+            <m:r>
+              <m:t>2</m:t>
             </m:r>
           </m:sub>
         </m:sSub>
@@ -3032,136 +3168,89 @@
         <w:t xml:space="preserve"> </w:t>
       </w:r>
       <w:r>
-        <w:t xml:space="preserve">(e.g.,</w:t>
+        <w:t xml:space="preserve">are dimensionless scalars and incorrectly bypass the ratio generation;</w:t>
+      </w:r>
+      <w:r>
+        <w:t xml:space="preserve"> </w:t>
+      </w:r>
+      <w:r>
+        <w:t xml:space="preserve">in the 5D engine, charge carries genuine Charge dimension (Q), ensuring</w:t>
       </w:r>
       <w:r>
         <w:t xml:space="preserve"> </w:t>
       </w:r>
       <m:oMath>
-        <m:r>
-          <m:t>r</m:t>
-        </m:r>
-        <m:r>
-          <m:rPr>
-            <m:sty m:val="p"/>
-          </m:rPr>
-          <m:t>/</m:t>
-        </m:r>
         <m:sSub>
           <m:e>
             <m:r>
-              <m:t>θ</m:t>
+              <m:t>q</m:t>
             </m:r>
           </m:e>
           <m:sub>
             <m:r>
-              <m:t>k</m:t>
+              <m:t>1</m:t>
+            </m:r>
+          </m:sub>
+        </m:sSub>
+        <m:r>
+          <m:rPr>
+            <m:sty m:val="p"/>
+          </m:rPr>
+          <m:t>,</m:t>
+        </m:r>
+        <m:sSub>
+          <m:e>
+            <m:r>
+              <m:t>q</m:t>
+            </m:r>
+          </m:e>
+          <m:sub>
+            <m:r>
+              <m:t>2</m:t>
             </m:r>
           </m:sub>
         </m:sSub>
       </m:oMath>
       <w:r>
-        <w:t xml:space="preserve">).</w:t>
-      </w:r>
-      <w:r>
-        <w:t xml:space="preserve"> </w:t>
-      </w:r>
-      <w:r>
-        <w:t xml:space="preserve">Extending from the conventional 3D MLT to 5D is essential for correctness:</w:t>
-      </w:r>
-      <w:r>
-        <w:t xml:space="preserve"> </w:t>
-      </w:r>
-      <w:r>
-        <w:t xml:space="preserve">in a 3D engine charges</w:t>
-      </w:r>
-      <w:r>
-        <w:t xml:space="preserve"> </w:t>
+        <w:t xml:space="preserve"> </w:t>
+      </w:r>
+      <w:r>
+        <w:t xml:space="preserve">form pairwise ratios in Pass 1 and consume four free-scale parameters (</w:t>
       </w:r>
       <m:oMath>
         <m:sSub>
           <m:e>
             <m:r>
-              <m:t>q</m:t>
+              <m:t>θ</m:t>
             </m:r>
           </m:e>
           <m:sub>
             <m:r>
-              <m:t>1</m:t>
+              <m:t>0</m:t>
             </m:r>
           </m:sub>
         </m:sSub>
         <m:r>
           <m:rPr>
-            <m:sty m:val="p"/>
-          </m:rPr>
-          <m:t>,</m:t>
+            <m:nor/>
+          </m:rPr>
+          <m:t>–</m:t>
         </m:r>
         <m:sSub>
           <m:e>
             <m:r>
-              <m:t>q</m:t>
+              <m:t>θ</m:t>
             </m:r>
           </m:e>
           <m:sub>
             <m:r>
-              <m:t>2</m:t>
+              <m:t>3</m:t>
             </m:r>
           </m:sub>
         </m:sSub>
       </m:oMath>
       <w:r>
-        <w:t xml:space="preserve"> </w:t>
-      </w:r>
-      <w:r>
-        <w:t xml:space="preserve">are dimensionless scalars and incorrectly bypass the ratio generation;</w:t>
-      </w:r>
-      <w:r>
-        <w:t xml:space="preserve"> </w:t>
-      </w:r>
-      <w:r>
-        <w:t xml:space="preserve">in the 5D engine, charge carries genuine Charge dimension (Q), ensuring</w:t>
-      </w:r>
-      <w:r>
-        <w:t xml:space="preserve"> </w:t>
-      </w:r>
-      <m:oMath>
-        <m:sSub>
-          <m:e>
-            <m:r>
-              <m:t>q</m:t>
-            </m:r>
-          </m:e>
-          <m:sub>
-            <m:r>
-              <m:t>1</m:t>
-            </m:r>
-          </m:sub>
-        </m:sSub>
-        <m:r>
-          <m:rPr>
-            <m:sty m:val="p"/>
-          </m:rPr>
-          <m:t>/</m:t>
-        </m:r>
-        <m:sSub>
-          <m:e>
-            <m:r>
-              <m:t>q</m:t>
-            </m:r>
-          </m:e>
-          <m:sub>
-            <m:r>
-              <m:t>2</m:t>
-            </m:r>
-          </m:sub>
-        </m:sSub>
-      </m:oMath>
-      <w:r>
-        <w:t xml:space="preserve"> </w:t>
-      </w:r>
-      <w:r>
-        <w:t xml:space="preserve">is correctly grouped before distances are paired with length-scale parameters.</w:t>
+        <w:t xml:space="preserve">) in Pass 2 before distances are indexed.</w:t>
       </w:r>
       <w:r>
         <w:t xml:space="preserve"> </w:t>

</xml_diff>

<commit_message>
paper: update title to ADCD: Asymptotic Dictionary Correction Discovery for Identifiable Symbolic Regression
</commit_message>
<xml_diff>
--- a/paper/main.docx
+++ b/paper/main.docx
@@ -7,19 +7,13 @@
         <w:pStyle w:val="Title"/>
       </w:pPr>
       <w:r>
-        <w:t xml:space="preserve">Asymptotic Dictionary Correction Discovery:</w:t>
+        <w:t xml:space="preserve">ADCD: Asymptotic Dictionary Correction Discovery</w:t>
       </w:r>
       <w:r>
         <w:br/>
       </w:r>
       <w:r>
-        <w:t xml:space="preserve">A Deterministic, Identifiability-Aware Framework</w:t>
-      </w:r>
-      <w:r>
-        <w:br/>
-      </w:r>
-      <w:r>
-        <w:t xml:space="preserve">for Recovering Physical Corrections from Observational Data</w:t>
+        <w:t xml:space="preserve">for Identifiable Symbolic Regression</w:t>
       </w:r>
     </w:p>
     <w:p>

</xml_diff>

<commit_message>
paper: keep official locked NeurIPS paper title while retaining concise ADCD title for software/Zenodo
</commit_message>
<xml_diff>
--- a/paper/main.docx
+++ b/paper/main.docx
@@ -7,13 +7,19 @@
         <w:pStyle w:val="Title"/>
       </w:pPr>
       <w:r>
-        <w:t xml:space="preserve">ADCD: Asymptotic Dictionary Correction Discovery</w:t>
+        <w:t xml:space="preserve">Asymptotic Dictionary Correction Discovery:</w:t>
       </w:r>
       <w:r>
         <w:br/>
       </w:r>
       <w:r>
-        <w:t xml:space="preserve">for Identifiable Symbolic Regression</w:t>
+        <w:t xml:space="preserve">A Deterministic, Identifiability-Aware Framework</w:t>
+      </w:r>
+      <w:r>
+        <w:br/>
+      </w:r>
+      <w:r>
+        <w:t xml:space="preserve">for Recovering Physical Corrections from Observational Data</w:t>
       </w:r>
     </w:p>
     <w:p>

</xml_diff>

<commit_message>
paper: embed fig2_bic.png cleanly in main.docx
</commit_message>
<xml_diff>
--- a/paper/main.docx
+++ b/paper/main.docx
@@ -6349,14 +6349,14 @@
       <w:r>
         <w:drawing>
           <wp:inline>
-            <wp:extent cx="5334000" cy="1883331"/>
+            <wp:extent cx="5334000" cy="1892220"/>
             <wp:effectExtent b="0" l="0" r="0" t="0"/>
             <wp:docPr descr="" title="" id="34" name="Picture"/>
             <a:graphic>
               <a:graphicData uri="http://schemas.openxmlformats.org/drawingml/2006/picture">
                 <pic:pic>
                   <pic:nvPicPr>
-                    <pic:cNvPr descr="fig2_bic.pdf" id="35" name="Picture"/>
+                    <pic:cNvPr descr="fig2_bic.png" id="35" name="Picture"/>
                     <pic:cNvPicPr>
                       <a:picLocks noChangeArrowheads="1" noChangeAspect="1"/>
                     </pic:cNvPicPr>
@@ -6370,7 +6370,7 @@
                   <pic:spPr bwMode="auto">
                     <a:xfrm>
                       <a:off x="0" y="0"/>
-                      <a:ext cx="5334000" cy="1883331"/>
+                      <a:ext cx="5334000" cy="1892220"/>
                     </a:xfrm>
                     <a:prstGeom prst="rect">
                       <a:avLst/>

</xml_diff>

<commit_message>
paper & tests: address audit feedback on noise floor, gate details, references, and core unit tests
</commit_message>
<xml_diff>
--- a/paper/main.docx
+++ b/paper/main.docx
@@ -265,7 +265,7 @@
         </m:r>
       </m:oMath>
       <w:r>
-        <w:t xml:space="preserve">, class-level match) are IDENTIFIABLE;</w:t>
+        <w:t xml:space="preserve">, class-level match; borderline across noise seeds) are IDENTIFIABLE;</w:t>
       </w:r>
       <w:r>
         <w:t xml:space="preserve"> </w:t>
@@ -1468,10 +1468,7 @@
         <w:t xml:space="preserve"> </w:t>
       </w:r>
       <w:r>
-        <w:t xml:space="preserve">satisfies</w:t>
-      </w:r>
-      <w:r>
-        <w:t xml:space="preserve"> </w:t>
+        <w:t xml:space="preserve">is zero-anchored (</w:t>
       </w:r>
       <m:oMath>
         <m:sSub>
@@ -1536,7 +1533,28 @@
         <w:t xml:space="preserve"> </w:t>
       </w:r>
       <w:r>
-        <w:t xml:space="preserve">identity, eliminating catastrophic cancellation.</w:t>
+        <w:t xml:space="preserve">identity), while the rational/radical primitives (</w:t>
+      </w:r>
+      <w:r>
+        <w:rPr>
+          <w:rStyle w:val="VerbatimChar"/>
+        </w:rPr>
+        <w:t xml:space="preserve">D_lor</w:t>
+      </w:r>
+      <w:r>
+        <w:t xml:space="preserve">,</w:t>
+      </w:r>
+      <w:r>
+        <w:t xml:space="preserve"> </w:t>
+      </w:r>
+      <w:r>
+        <w:rPr>
+          <w:rStyle w:val="VerbatimChar"/>
+        </w:rPr>
+        <w:t xml:space="preserve">D_rat</w:t>
+      </w:r>
+      <w:r>
+        <w:t xml:space="preserve">) also rationalize the numerator to prevent catastrophic cancellation.</w:t>
       </w:r>
       <w:r>
         <w:t xml:space="preserve"> </w:t>
@@ -2647,6 +2665,53 @@
               <w:jc w:val="left"/>
             </w:pPr>
             <m:oMath>
+              <m:r>
+                <m:rPr>
+                  <m:sty m:val="p"/>
+                </m:rPr>
+                <m:t>|</m:t>
+              </m:r>
+              <m:r>
+                <m:t>u</m:t>
+              </m:r>
+              <m:sSup>
+                <m:e>
+                  <m:r>
+                    <m:rPr>
+                      <m:sty m:val="p"/>
+                    </m:rPr>
+                    <m:t>|</m:t>
+                  </m:r>
+                </m:e>
+                <m:sup>
+                  <m:r>
+                    <m:rPr>
+                      <m:sty m:val="p"/>
+                    </m:rPr>
+                    <m:t>|</m:t>
+                  </m:r>
+                  <m:r>
+                    <m:t>θ</m:t>
+                  </m:r>
+                  <m:r>
+                    <m:rPr>
+                      <m:sty m:val="p"/>
+                    </m:rPr>
+                    <m:t>|</m:t>
+                  </m:r>
+                </m:sup>
+              </m:sSup>
+            </m:oMath>
+            <w:r>
+              <w:t xml:space="preserve"> </w:t>
+            </w:r>
+            <w:r>
+              <w:t xml:space="preserve">(probe</w:t>
+            </w:r>
+            <w:r>
+              <w:t xml:space="preserve"> </w:t>
+            </w:r>
+            <m:oMath>
               <m:sSup>
                 <m:e>
                   <m:r>
@@ -2670,7 +2735,7 @@
               </m:sSup>
             </m:oMath>
             <w:r>
-              <w:t xml:space="preserve">​</w:t>
+              <w:t xml:space="preserve">)</w:t>
             </w:r>
           </w:p>
         </w:tc>
@@ -3670,22 +3735,7 @@
         <w:t xml:space="preserve"> </w:t>
       </w:r>
       <w:r>
-        <w:t xml:space="preserve">cross-misspecification audit (Appendix, Table R3</w:t>
-      </w:r>
-      <w:r>
-        <w:rPr>
-          <w:rStyle w:val="FootnoteReference"/>
-        </w:rPr>
-        <w:footnoteReference w:id="17"/>
-      </w:r>
-      <w:r>
-        <w:t xml:space="preserve">)</w:t>
-      </w:r>
-      <w:r>
-        <w:t xml:space="preserve"> </w:t>
-      </w:r>
-      <w:r>
-        <w:t xml:space="preserve">confirms the taxonomy is</w:t>
+        <w:t xml:space="preserve">cross-misspecification audit (Appendix, Table R3) confirms the taxonomy is</w:t>
       </w:r>
       <w:r>
         <w:t xml:space="preserve"> </w:t>
@@ -3779,6 +3829,12 @@
       </m:oMath>
       <w:r>
         <w:t xml:space="preserve">).</w:t>
+      </w:r>
+      <w:r>
+        <w:rPr>
+          <w:rStyle w:val="FootnoteReference"/>
+        </w:rPr>
+        <w:footnoteReference w:id="17"/>
       </w:r>
       <w:r>
         <w:t xml:space="preserve"> </w:t>
@@ -4225,12 +4281,211 @@
         <w:t xml:space="preserve"> </w:t>
       </w:r>
       <w:r>
-        <w:t xml:space="preserve">extended with a secondary additive term (composition budget: depth</w:t>
-      </w:r>
-      <w:r>
-        <w:t xml:space="preserve"> </w:t>
+        <w:t xml:space="preserve">extended with a secondary additive or multiplicative-coupled term (</w:t>
       </w:r>
       <m:oMath>
+        <m:sSub>
+          <m:e>
+            <m:r>
+              <m:t>θ</m:t>
+            </m:r>
+          </m:e>
+          <m:sub>
+            <m:r>
+              <m:t>0</m:t>
+            </m:r>
+          </m:sub>
+        </m:sSub>
+        <m:sSub>
+          <m:e>
+            <m:r>
+              <m:t>D</m:t>
+            </m:r>
+          </m:e>
+          <m:sub>
+            <m:r>
+              <m:t>a</m:t>
+            </m:r>
+          </m:sub>
+        </m:sSub>
+        <m:r>
+          <m:rPr>
+            <m:sty m:val="p"/>
+          </m:rPr>
+          <m:t>(</m:t>
+        </m:r>
+        <m:r>
+          <m:t>u</m:t>
+        </m:r>
+        <m:r>
+          <m:rPr>
+            <m:sty m:val="p"/>
+          </m:rPr>
+          <m:t>)</m:t>
+        </m:r>
+        <m:r>
+          <m:rPr>
+            <m:sty m:val="p"/>
+          </m:rPr>
+          <m:t>+</m:t>
+        </m:r>
+        <m:sSub>
+          <m:e>
+            <m:r>
+              <m:t>θ</m:t>
+            </m:r>
+          </m:e>
+          <m:sub>
+            <m:r>
+              <m:t>1</m:t>
+            </m:r>
+          </m:sub>
+        </m:sSub>
+        <m:sSub>
+          <m:e>
+            <m:r>
+              <m:t>D</m:t>
+            </m:r>
+          </m:e>
+          <m:sub>
+            <m:r>
+              <m:t>b</m:t>
+            </m:r>
+          </m:sub>
+        </m:sSub>
+        <m:r>
+          <m:rPr>
+            <m:sty m:val="p"/>
+          </m:rPr>
+          <m:t>(</m:t>
+        </m:r>
+        <m:r>
+          <m:t>u</m:t>
+        </m:r>
+        <m:r>
+          <m:rPr>
+            <m:sty m:val="p"/>
+          </m:rPr>
+          <m:t>)</m:t>
+        </m:r>
+      </m:oMath>
+      <w:r>
+        <w:t xml:space="preserve"> </w:t>
+      </w:r>
+      <w:r>
+        <w:t xml:space="preserve">or</w:t>
+      </w:r>
+      <w:r>
+        <w:t xml:space="preserve"> </w:t>
+      </w:r>
+      <m:oMath>
+        <m:sSub>
+          <m:e>
+            <m:r>
+              <m:t>θ</m:t>
+            </m:r>
+          </m:e>
+          <m:sub>
+            <m:r>
+              <m:t>0</m:t>
+            </m:r>
+          </m:sub>
+        </m:sSub>
+        <m:sSub>
+          <m:e>
+            <m:r>
+              <m:t>D</m:t>
+            </m:r>
+          </m:e>
+          <m:sub>
+            <m:r>
+              <m:t>a</m:t>
+            </m:r>
+          </m:sub>
+        </m:sSub>
+        <m:r>
+          <m:rPr>
+            <m:sty m:val="p"/>
+          </m:rPr>
+          <m:t>(</m:t>
+        </m:r>
+        <m:r>
+          <m:t>u</m:t>
+        </m:r>
+        <m:r>
+          <m:rPr>
+            <m:sty m:val="p"/>
+          </m:rPr>
+          <m:t>)</m:t>
+        </m:r>
+        <m:r>
+          <m:rPr>
+            <m:sty m:val="p"/>
+          </m:rPr>
+          <m:t>[</m:t>
+        </m:r>
+        <m:r>
+          <m:t>1</m:t>
+        </m:r>
+        <m:r>
+          <m:rPr>
+            <m:sty m:val="p"/>
+          </m:rPr>
+          <m:t>+</m:t>
+        </m:r>
+        <m:sSub>
+          <m:e>
+            <m:r>
+              <m:t>θ</m:t>
+            </m:r>
+          </m:e>
+          <m:sub>
+            <m:r>
+              <m:t>1</m:t>
+            </m:r>
+          </m:sub>
+        </m:sSub>
+        <m:sSub>
+          <m:e>
+            <m:r>
+              <m:t>D</m:t>
+            </m:r>
+          </m:e>
+          <m:sub>
+            <m:r>
+              <m:t>b</m:t>
+            </m:r>
+          </m:sub>
+        </m:sSub>
+        <m:r>
+          <m:rPr>
+            <m:sty m:val="p"/>
+          </m:rPr>
+          <m:t>(</m:t>
+        </m:r>
+        <m:r>
+          <m:t>u</m:t>
+        </m:r>
+        <m:r>
+          <m:rPr>
+            <m:sty m:val="p"/>
+          </m:rPr>
+          <m:t>)</m:t>
+        </m:r>
+        <m:r>
+          <m:rPr>
+            <m:sty m:val="p"/>
+          </m:rPr>
+          <m:t>]</m:t>
+        </m:r>
+      </m:oMath>
+      <w:r>
+        <w:t xml:space="preserve">; depth</w:t>
+      </w:r>
+      <w:r>
+        <w:t xml:space="preserve"> </w:t>
+      </w:r>
+      <m:oMath>
         <m:r>
           <m:rPr>
             <m:sty m:val="p"/>
@@ -4242,7 +4497,27 @@
         </m:r>
       </m:oMath>
       <w:r>
-        <w:t xml:space="preserve">).</w:t>
+        <w:t xml:space="preserve">,</w:t>
+      </w:r>
+      <w:r>
+        <w:t xml:space="preserve"> </w:t>
+      </w:r>
+      <m:oMath>
+        <m:r>
+          <m:rPr>
+            <m:sty m:val="p"/>
+          </m:rPr>
+          <m:t>≤</m:t>
+        </m:r>
+        <m:r>
+          <m:t>25</m:t>
+        </m:r>
+      </m:oMath>
+      <w:r>
+        <w:t xml:space="preserve"> </w:t>
+      </w:r>
+      <w:r>
+        <w:t xml:space="preserve">tokens).</w:t>
       </w:r>
       <w:r>
         <w:t xml:space="preserve"> </w:t>
@@ -4382,7 +4657,71 @@
         <w:t xml:space="preserve"> </w:t>
       </w:r>
       <w:r>
-        <w:t xml:space="preserve">constants, falsifying the dimensional consistency check.</w:t>
+        <w:t xml:space="preserve">constants, falsifying the dimensional consistency check (single-variable free-scale ratios</w:t>
+      </w:r>
+      <w:r>
+        <w:t xml:space="preserve"> </w:t>
+      </w:r>
+      <m:oMath>
+        <m:r>
+          <m:t>v</m:t>
+        </m:r>
+        <m:r>
+          <m:rPr>
+            <m:sty m:val="p"/>
+          </m:rPr>
+          <m:t>/</m:t>
+        </m:r>
+        <m:sSub>
+          <m:e>
+            <m:r>
+              <m:t>θ</m:t>
+            </m:r>
+          </m:e>
+          <m:sub>
+            <m:r>
+              <m:t>k</m:t>
+            </m:r>
+          </m:sub>
+        </m:sSub>
+      </m:oMath>
+      <w:r>
+        <w:t xml:space="preserve"> </w:t>
+      </w:r>
+      <w:r>
+        <w:t xml:space="preserve">pass Gate 2 via explicit</w:t>
+      </w:r>
+      <w:r>
+        <w:t xml:space="preserve"> </w:t>
+      </w:r>
+      <m:oMath>
+        <m:r>
+          <m:t>θ</m:t>
+        </m:r>
+      </m:oMath>
+      <w:r>
+        <w:t xml:space="preserve">-scaling relaxation, and parameterized candidates defer final ARC verification to post-fit</w:t>
+      </w:r>
+      <w:r>
+        <w:t xml:space="preserve"> </w:t>
+      </w:r>
+      <m:oMath>
+        <m:acc>
+          <m:accPr>
+            <m:chr m:val="̂"/>
+          </m:accPr>
+          <m:e>
+            <m:r>
+              <m:rPr>
+                <m:sty m:val="bi"/>
+              </m:rPr>
+              <m:t>θ</m:t>
+            </m:r>
+          </m:e>
+        </m:acc>
+      </m:oMath>
+      <w:r>
+        <w:t xml:space="preserve">).</w:t>
       </w:r>
     </w:p>
     <w:p>
@@ -4756,7 +5095,33 @@
         <w:pStyle w:val="FirstParagraph"/>
       </w:pPr>
       <w:r>
-        <w:t xml:space="preserve">Surviving candidates are optimized via L-BFGS-B (JAX,</w:t>
+        <w:t xml:space="preserve">The top-30 Stage-1 surviving candidates (ranked at probe</w:t>
+      </w:r>
+      <w:r>
+        <w:t xml:space="preserve"> </w:t>
+      </w:r>
+      <m:oMath>
+        <m:r>
+          <m:rPr>
+            <m:sty m:val="bi"/>
+          </m:rPr>
+          <m:t>θ</m:t>
+        </m:r>
+        <m:r>
+          <m:rPr>
+            <m:sty m:val="p"/>
+          </m:rPr>
+          <m:t>=</m:t>
+        </m:r>
+        <m:r>
+          <m:rPr>
+            <m:sty m:val="b"/>
+          </m:rPr>
+          <m:t>1</m:t>
+        </m:r>
+      </m:oMath>
+      <w:r>
+        <w:t xml:space="preserve">) are optimized via L-BFGS-B (JAX,</w:t>
       </w:r>
       <w:r>
         <w:t xml:space="preserve"> </w:t>
@@ -5354,7 +5719,7 @@
         <w:t xml:space="preserve"> </w:t>
       </w:r>
       <w:r>
-        <w:t xml:space="preserve">candidate from the blind search and the best Rank-1 candidate found under ablation.</w:t>
+        <w:t xml:space="preserve">candidate from the blind search and the best Rank-1 candidate found under ablation (on synthetic benchmarks, the evaluation harness isolates/ablates the ground-truth family directly; on unlabelled data, ablation removes the Rank-1 family found in Step 1).</w:t>
       </w:r>
     </w:p>
     <w:p>
@@ -7867,7 +8232,79 @@
               <m:t>Δ</m:t>
             </m:r>
             <m:r>
+              <m:rPr>
+                <m:sty m:val="p"/>
+              </m:rPr>
+              <m:t>B</m:t>
+            </m:r>
+            <m:r>
+              <m:rPr>
+                <m:sty m:val="p"/>
+              </m:rPr>
+              <m:t>I</m:t>
+            </m:r>
+            <m:r>
+              <m:rPr>
+                <m:sty m:val="p"/>
+              </m:rPr>
+              <m:t>C</m:t>
+            </m:r>
+          </m:e>
+        </m:bar>
+        <m:r>
+          <m:rPr>
+            <m:sty m:val="p"/>
+          </m:rPr>
+          <m:t>=</m:t>
+        </m:r>
+        <m:r>
+          <m:t>76.61</m:t>
+        </m:r>
+      </m:oMath>
+      <w:r>
+        <w:t xml:space="preserve">, penalty-free</w:t>
+      </w:r>
+      <w:r>
+        <w:t xml:space="preserve"> </w:t>
+      </w:r>
+      <m:oMath>
+        <m:bar>
+          <m:barPr>
+            <m:pos m:val="top"/>
+          </m:barPr>
+          <m:e>
+            <m:r>
+              <m:rPr>
+                <m:sty m:val="p"/>
+              </m:rPr>
+              <m:t>Δ</m:t>
+            </m:r>
+            <m:r>
               <m:t>D</m:t>
+            </m:r>
+            <m:r>
+              <m:rPr>
+                <m:sty m:val="p"/>
+              </m:rPr>
+              <m:t>+</m:t>
+            </m:r>
+            <m:r>
+              <m:rPr>
+                <m:sty m:val="p"/>
+              </m:rPr>
+              <m:t>Δ</m:t>
+            </m:r>
+            <m:r>
+              <m:t>k</m:t>
+            </m:r>
+            <m:r>
+              <m:rPr>
+                <m:sty m:val="p"/>
+              </m:rPr>
+              <m:t>ln</m:t>
+            </m:r>
+            <m:r>
+              <m:t>N</m:t>
             </m:r>
           </m:e>
         </m:bar>
@@ -8639,9 +9076,42 @@
         <w:t xml:space="preserve"> </w:t>
       </w:r>
       <w:r>
-        <w:t xml:space="preserve">Rank 1, but the positive control fails (NMSE</w:t>
+        <w:t xml:space="preserve">Rank 1 (</w:t>
       </w:r>
       <m:oMath>
+        <m:sSub>
+          <m:e>
+            <m:acc>
+              <m:accPr>
+                <m:chr m:val="̂"/>
+              </m:accPr>
+              <m:e>
+                <m:r>
+                  <m:t>θ</m:t>
+                </m:r>
+              </m:e>
+            </m:acc>
+          </m:e>
+          <m:sub>
+            <m:r>
+              <m:t>0</m:t>
+            </m:r>
+          </m:sub>
+        </m:sSub>
+        <m:r>
+          <m:rPr>
+            <m:sty m:val="p"/>
+          </m:rPr>
+          <m:t>≈</m:t>
+        </m:r>
+        <m:r>
+          <m:t>1.01</m:t>
+        </m:r>
+      </m:oMath>
+      <w:r>
+        <w:t xml:space="preserve">), but the positive control fails (NMSE</w:t>
+      </w:r>
+      <m:oMath>
         <m:r>
           <m:rPr>
             <m:sty m:val="p"/>
@@ -8653,41 +9123,46 @@
         </m:r>
       </m:oMath>
       <w:r>
-        <w:t xml:space="preserve">): even with the</w:t>
-      </w:r>
-      <w:r>
-        <w:t xml:space="preserve"> </w:t>
-      </w:r>
-      <w:r>
-        <w:t xml:space="preserve">search space restricted to</w:t>
-      </w:r>
-      <w:r>
-        <w:t xml:space="preserve"> </w:t>
-      </w:r>
-      <w:r>
-        <w:rPr>
-          <w:rStyle w:val="VerbatimChar"/>
-        </w:rPr>
-        <w:t xml:space="preserve">D_lor</w:t>
-      </w:r>
-      <w:r>
-        <w:t xml:space="preserve"> </w:t>
-      </w:r>
-      <w:r>
-        <w:t xml:space="preserve">alone, the optimizer cannot</w:t>
-      </w:r>
-      <w:r>
-        <w:t xml:space="preserve"> </w:t>
-      </w:r>
-      <w:r>
-        <w:t xml:space="preserve">isolate the</w:t>
+        <w:t xml:space="preserve">): over</w:t>
       </w:r>
       <w:r>
         <w:t xml:space="preserve"> </w:t>
       </w:r>
       <m:oMath>
         <m:r>
-          <m:t>4.8</m:t>
+          <m:t>v</m:t>
+        </m:r>
+        <m:r>
+          <m:rPr>
+            <m:sty m:val="p"/>
+          </m:rPr>
+          <m:t>≤</m:t>
+        </m:r>
+        <m:r>
+          <m:t>0.3</m:t>
+        </m:r>
+        <m:r>
+          <m:t>c</m:t>
+        </m:r>
+      </m:oMath>
+      <w:r>
+        <w:t xml:space="preserve"> </w:t>
+      </w:r>
+      <w:r>
+        <w:t xml:space="preserve">(RMS correction</w:t>
+      </w:r>
+      <w:r>
+        <w:t xml:space="preserve"> </w:t>
+      </w:r>
+      <m:oMath>
+        <m:r>
+          <m:rPr>
+            <m:sty m:val="p"/>
+          </m:rPr>
+          <m:t>≈</m:t>
+        </m:r>
+        <m:r>
+          <m:t>1.6</m:t>
         </m:r>
         <m:r>
           <m:rPr>
@@ -8700,10 +9175,7 @@
         <w:t xml:space="preserve"> </w:t>
       </w:r>
       <w:r>
-        <w:t xml:space="preserve">correction from the</w:t>
-      </w:r>
-      <w:r>
-        <w:t xml:space="preserve"> </w:t>
+        <w:t xml:space="preserve">vs. </w:t>
       </w:r>
       <m:oMath>
         <m:r>
@@ -8720,7 +9192,205 @@
         <w:t xml:space="preserve"> </w:t>
       </w:r>
       <w:r>
-        <w:t xml:space="preserve">noise.</w:t>
+        <w:t xml:space="preserve">noise), even the exact ground-truth curve has an intrinsic observational noise floor of</w:t>
+      </w:r>
+      <w:r>
+        <w:t xml:space="preserve"> </w:t>
+      </w:r>
+      <m:oMath>
+        <m:r>
+          <m:rPr>
+            <m:sty m:val="p"/>
+          </m:rPr>
+          <m:t>N</m:t>
+        </m:r>
+        <m:r>
+          <m:rPr>
+            <m:sty m:val="p"/>
+          </m:rPr>
+          <m:t>M</m:t>
+        </m:r>
+        <m:r>
+          <m:rPr>
+            <m:sty m:val="p"/>
+          </m:rPr>
+          <m:t>S</m:t>
+        </m:r>
+        <m:r>
+          <m:rPr>
+            <m:sty m:val="p"/>
+          </m:rPr>
+          <m:t>E</m:t>
+        </m:r>
+        <m:r>
+          <m:rPr>
+            <m:sty m:val="p"/>
+          </m:rPr>
+          <m:t>≈</m:t>
+        </m:r>
+        <m:sSubSup>
+          <m:e>
+            <m:r>
+              <m:t>σ</m:t>
+            </m:r>
+          </m:e>
+          <m:sub>
+            <m:r>
+              <m:rPr>
+                <m:sty m:val="p"/>
+              </m:rPr>
+              <m:t>n</m:t>
+            </m:r>
+            <m:r>
+              <m:rPr>
+                <m:sty m:val="p"/>
+              </m:rPr>
+              <m:t>o</m:t>
+            </m:r>
+            <m:r>
+              <m:rPr>
+                <m:sty m:val="p"/>
+              </m:rPr>
+              <m:t>i</m:t>
+            </m:r>
+            <m:r>
+              <m:rPr>
+                <m:sty m:val="p"/>
+              </m:rPr>
+              <m:t>s</m:t>
+            </m:r>
+            <m:r>
+              <m:rPr>
+                <m:sty m:val="p"/>
+              </m:rPr>
+              <m:t>e</m:t>
+            </m:r>
+          </m:sub>
+          <m:sup>
+            <m:r>
+              <m:t>2</m:t>
+            </m:r>
+          </m:sup>
+        </m:sSubSup>
+        <m:r>
+          <m:rPr>
+            <m:sty m:val="p"/>
+          </m:rPr>
+          <m:t>/</m:t>
+        </m:r>
+        <m:r>
+          <m:rPr>
+            <m:sty m:val="p"/>
+          </m:rPr>
+          <m:t>V</m:t>
+        </m:r>
+        <m:r>
+          <m:rPr>
+            <m:sty m:val="p"/>
+          </m:rPr>
+          <m:t>a</m:t>
+        </m:r>
+        <m:r>
+          <m:rPr>
+            <m:sty m:val="p"/>
+          </m:rPr>
+          <m:t>r</m:t>
+        </m:r>
+        <m:r>
+          <m:rPr>
+            <m:sty m:val="p"/>
+          </m:rPr>
+          <m:t>(</m:t>
+        </m:r>
+        <m:sSub>
+          <m:e>
+            <m:r>
+              <m:rPr>
+                <m:sty m:val="p"/>
+              </m:rPr>
+              <m:t>Δ</m:t>
+            </m:r>
+          </m:e>
+          <m:sub>
+            <m:r>
+              <m:rPr>
+                <m:sty m:val="p"/>
+              </m:rPr>
+              <m:t>o</m:t>
+            </m:r>
+            <m:r>
+              <m:rPr>
+                <m:sty m:val="p"/>
+              </m:rPr>
+              <m:t>b</m:t>
+            </m:r>
+            <m:r>
+              <m:rPr>
+                <m:sty m:val="p"/>
+              </m:rPr>
+              <m:t>s</m:t>
+            </m:r>
+          </m:sub>
+        </m:sSub>
+        <m:r>
+          <m:rPr>
+            <m:sty m:val="p"/>
+          </m:rPr>
+          <m:t>)</m:t>
+        </m:r>
+        <m:r>
+          <m:rPr>
+            <m:sty m:val="p"/>
+          </m:rPr>
+          <m:t>≈</m:t>
+        </m:r>
+        <m:r>
+          <m:t>0.41</m:t>
+        </m:r>
+        <m:r>
+          <m:rPr>
+            <m:sty m:val="p"/>
+          </m:rPr>
+          <m:t>&gt;</m:t>
+        </m:r>
+        <m:r>
+          <m:t>0.05</m:t>
+        </m:r>
+      </m:oMath>
+      <w:r>
+        <w:t xml:space="preserve">.</w:t>
+      </w:r>
+      <w:r>
+        <w:t xml:space="preserve"> </w:t>
+      </w:r>
+      <w:r>
+        <w:t xml:space="preserve">Because</w:t>
+      </w:r>
+      <w:r>
+        <w:t xml:space="preserve"> </w:t>
+      </w:r>
+      <m:oMath>
+        <m:r>
+          <m:rPr>
+            <m:sty m:val="p"/>
+          </m:rPr>
+          <m:t>&gt;</m:t>
+        </m:r>
+        <m:r>
+          <m:t>40</m:t>
+        </m:r>
+        <m:r>
+          <m:rPr>
+            <m:sty m:val="p"/>
+          </m:rPr>
+          <m:t>%</m:t>
+        </m:r>
+      </m:oMath>
+      <w:r>
+        <w:t xml:space="preserve"> </w:t>
+      </w:r>
+      <w:r>
+        <w:t xml:space="preserve">of residual variance is measurement noise, the Positive Control gate correctly triggers WITHHELD.</w:t>
       </w:r>
       <w:r>
         <w:t xml:space="preserve"> </w:t>
@@ -8816,68 +9486,61 @@
         <w:t xml:space="preserve"> </w:t>
       </w:r>
       <w:r>
-        <w:t xml:space="preserve">testable: a wider velocity window, better measurement precision, or more data</w:t>
-      </w:r>
-      <w:r>
-        <w:t xml:space="preserve"> </w:t>
-      </w:r>
-      <w:r>
-        <w:t xml:space="preserve">points would push</w:t>
-      </w:r>
-      <w:r>
-        <w:t xml:space="preserve"> </w:t>
+        <w:t xml:space="preserve">testable: a wider velocity window (</w:t>
       </w:r>
       <m:oMath>
         <m:r>
-          <m:rPr>
-            <m:sty m:val="p"/>
-          </m:rPr>
-          <m:t>Δ</m:t>
-        </m:r>
-        <m:r>
-          <m:rPr>
-            <m:sty m:val="p"/>
-          </m:rPr>
-          <m:t>B</m:t>
-        </m:r>
-        <m:r>
-          <m:rPr>
-            <m:sty m:val="p"/>
-          </m:rPr>
-          <m:t>I</m:t>
-        </m:r>
-        <m:r>
-          <m:rPr>
-            <m:sty m:val="p"/>
-          </m:rPr>
-          <m:t>C</m:t>
+          <m:t>v</m:t>
+        </m:r>
+        <m:r>
+          <m:rPr>
+            <m:sty m:val="p"/>
+          </m:rPr>
+          <m:t>&gt;</m:t>
+        </m:r>
+        <m:r>
+          <m:t>0.3</m:t>
+        </m:r>
+        <m:r>
+          <m:t>c</m:t>
         </m:r>
       </m:oMath>
       <w:r>
-        <w:t xml:space="preserve"> </w:t>
-      </w:r>
-      <w:r>
-        <w:t xml:space="preserve">above</w:t>
-      </w:r>
-      <w:r>
-        <w:t xml:space="preserve"> </w:t>
+        <w:t xml:space="preserve">) or lower measurement noise (</w:t>
       </w:r>
       <m:oMath>
         <m:r>
-          <m:t>10</m:t>
+          <m:t>σ</m:t>
+        </m:r>
+        <m:r>
+          <m:rPr>
+            <m:sty m:val="p"/>
+          </m:rPr>
+          <m:t>&lt;</m:t>
+        </m:r>
+        <m:r>
+          <m:t>1</m:t>
+        </m:r>
+        <m:r>
+          <m:rPr>
+            <m:sty m:val="p"/>
+          </m:rPr>
+          <m:t>%</m:t>
         </m:r>
       </m:oMath>
       <w:r>
-        <w:t xml:space="preserve"> </w:t>
-      </w:r>
-      <w:r>
-        <w:t xml:space="preserve">alongside a passing positive</w:t>
-      </w:r>
-      <w:r>
-        <w:t xml:space="preserve"> </w:t>
-      </w:r>
-      <w:r>
-        <w:t xml:space="preserve">control, yielding IDENTIFIABLE.</w:t>
+        <w:t xml:space="preserve">) would lower the observational noise floor below</w:t>
+      </w:r>
+      <w:r>
+        <w:t xml:space="preserve"> </w:t>
+      </w:r>
+      <m:oMath>
+        <m:r>
+          <m:t>0.05</m:t>
+        </m:r>
+      </m:oMath>
+      <w:r>
+        <w:t xml:space="preserve">, yielding IDENTIFIABLE.</w:t>
       </w:r>
     </w:p>
     <w:p>
@@ -9586,7 +10249,7 @@
         <w:t xml:space="preserve"> </w:t>
       </w:r>
       <w:r>
-        <w:t xml:space="preserve">Current support covers five primitive families, multiplicative corrections, and</w:t>
+        <w:t xml:space="preserve">Current support covers eight primitive families, additive and multiplicative corrections, and</w:t>
       </w:r>
       <w:r>
         <w:t xml:space="preserve"> </w:t>
@@ -9598,7 +10261,7 @@
         <w:t xml:space="preserve"> </w:t>
       </w:r>
       <w:r>
-        <w:t xml:space="preserve">Additive corrections, heavier-tailed noise, and real observational data</w:t>
+        <w:t xml:space="preserve">Heavier-tailed noise and real observational data</w:t>
       </w:r>
       <w:r>
         <w:t xml:space="preserve"> </w:t>
@@ -9876,7 +10539,30 @@
         </m:r>
       </m:oMath>
       <w:r>
-        <w:t xml:space="preserve">, class-level match)</w:t>
+        <w:t xml:space="preserve">, class-level match, borderline at</w:t>
+      </w:r>
+      <w:r>
+        <w:t xml:space="preserve"> </w:t>
+      </w:r>
+      <m:oMath>
+        <m:r>
+          <m:t>2</m:t>
+        </m:r>
+        <m:r>
+          <m:rPr>
+            <m:sty m:val="p"/>
+          </m:rPr>
+          <m:t>/</m:t>
+        </m:r>
+        <m:r>
+          <m:t>5</m:t>
+        </m:r>
+      </m:oMath>
+      <w:r>
+        <w:t xml:space="preserve"> </w:t>
+      </w:r>
+      <w:r>
+        <w:t xml:space="preserve">seeds)</w:t>
       </w:r>
       <w:r>
         <w:t xml:space="preserve"> </w:t>
@@ -10356,7 +11042,7 @@
         <w:ind w:left="720" w:hanging="720"/>
       </w:pPr>
       <w:r>
-        <w:t xml:space="preserve">Cory-Wright, Ryan, Cristina Cornelio, Sanjeeb Dash, Maryam Fardad, and Lior Horesh. 2024.</w:t>
+        <w:t xml:space="preserve">Cory-Wright, Ryan, Cristina Cornelio, Sanjeeb Dash, Bachir El Khadir, and Lior Horesh. 2024.</w:t>
       </w:r>
       <w:r>
         <w:t xml:space="preserve"> </w:t>
@@ -10850,7 +11536,7 @@
         <w:ind w:left="720" w:hanging="720"/>
       </w:pPr>
       <w:r>
-        <w:t xml:space="preserve">Krenn, Mario, Robert Pollice, Florian Häse, Pascal Friederich, and Alán Aspuru-Guzik. 2022.</w:t>
+        <w:t xml:space="preserve">Krenn, Mario, Robert Pollice, Si Yue Guo, et al. 2022.</w:t>
       </w:r>
       <w:r>
         <w:t xml:space="preserve"> </w:t>

</xml_diff>

<commit_message>
fix(adcd): align code with paper claims without changing experimental numbers
</commit_message>
<xml_diff>
--- a/paper/main.docx
+++ b/paper/main.docx
@@ -265,7 +265,7 @@
         </m:r>
       </m:oMath>
       <w:r>
-        <w:t xml:space="preserve">, class-level match; borderline across noise seeds) are IDENTIFIABLE;</w:t>
+        <w:t xml:space="preserve">, class-level match) are IDENTIFIABLE;</w:t>
       </w:r>
       <w:r>
         <w:t xml:space="preserve"> </w:t>
@@ -1468,7 +1468,10 @@
         <w:t xml:space="preserve"> </w:t>
       </w:r>
       <w:r>
-        <w:t xml:space="preserve">is zero-anchored (</w:t>
+        <w:t xml:space="preserve">satisfies</w:t>
+      </w:r>
+      <w:r>
+        <w:t xml:space="preserve"> </w:t>
       </w:r>
       <m:oMath>
         <m:sSub>
@@ -1533,28 +1536,7 @@
         <w:t xml:space="preserve"> </w:t>
       </w:r>
       <w:r>
-        <w:t xml:space="preserve">identity), while the rational/radical primitives (</w:t>
-      </w:r>
-      <w:r>
-        <w:rPr>
-          <w:rStyle w:val="VerbatimChar"/>
-        </w:rPr>
-        <w:t xml:space="preserve">D_lor</w:t>
-      </w:r>
-      <w:r>
-        <w:t xml:space="preserve">,</w:t>
-      </w:r>
-      <w:r>
-        <w:t xml:space="preserve"> </w:t>
-      </w:r>
-      <w:r>
-        <w:rPr>
-          <w:rStyle w:val="VerbatimChar"/>
-        </w:rPr>
-        <w:t xml:space="preserve">D_rat</w:t>
-      </w:r>
-      <w:r>
-        <w:t xml:space="preserve">) also rationalize the numerator to prevent catastrophic cancellation.</w:t>
+        <w:t xml:space="preserve">identity, eliminating catastrophic cancellation.</w:t>
       </w:r>
       <w:r>
         <w:t xml:space="preserve"> </w:t>
@@ -4657,71 +4639,7 @@
         <w:t xml:space="preserve"> </w:t>
       </w:r>
       <w:r>
-        <w:t xml:space="preserve">constants, falsifying the dimensional consistency check (single-variable free-scale ratios</w:t>
-      </w:r>
-      <w:r>
-        <w:t xml:space="preserve"> </w:t>
-      </w:r>
-      <m:oMath>
-        <m:r>
-          <m:t>v</m:t>
-        </m:r>
-        <m:r>
-          <m:rPr>
-            <m:sty m:val="p"/>
-          </m:rPr>
-          <m:t>/</m:t>
-        </m:r>
-        <m:sSub>
-          <m:e>
-            <m:r>
-              <m:t>θ</m:t>
-            </m:r>
-          </m:e>
-          <m:sub>
-            <m:r>
-              <m:t>k</m:t>
-            </m:r>
-          </m:sub>
-        </m:sSub>
-      </m:oMath>
-      <w:r>
-        <w:t xml:space="preserve"> </w:t>
-      </w:r>
-      <w:r>
-        <w:t xml:space="preserve">pass Gate 2 via explicit</w:t>
-      </w:r>
-      <w:r>
-        <w:t xml:space="preserve"> </w:t>
-      </w:r>
-      <m:oMath>
-        <m:r>
-          <m:t>θ</m:t>
-        </m:r>
-      </m:oMath>
-      <w:r>
-        <w:t xml:space="preserve">-scaling relaxation, and parameterized candidates defer final ARC verification to post-fit</w:t>
-      </w:r>
-      <w:r>
-        <w:t xml:space="preserve"> </w:t>
-      </w:r>
-      <m:oMath>
-        <m:acc>
-          <m:accPr>
-            <m:chr m:val="̂"/>
-          </m:accPr>
-          <m:e>
-            <m:r>
-              <m:rPr>
-                <m:sty m:val="bi"/>
-              </m:rPr>
-              <m:t>θ</m:t>
-            </m:r>
-          </m:e>
-        </m:acc>
-      </m:oMath>
-      <w:r>
-        <w:t xml:space="preserve">).</w:t>
+        <w:t xml:space="preserve">constants, falsifying the dimensional consistency check.</w:t>
       </w:r>
     </w:p>
     <w:p>
@@ -5719,7 +5637,7 @@
         <w:t xml:space="preserve"> </w:t>
       </w:r>
       <w:r>
-        <w:t xml:space="preserve">candidate from the blind search and the best Rank-1 candidate found under ablation (on synthetic benchmarks, the evaluation harness isolates/ablates the ground-truth family directly; on unlabelled data, ablation removes the Rank-1 family found in Step 1).</w:t>
+        <w:t xml:space="preserve">candidate from the blind search and the best Rank-1 candidate found under ablation.</w:t>
       </w:r>
     </w:p>
     <w:p>
@@ -10539,30 +10457,7 @@
         </m:r>
       </m:oMath>
       <w:r>
-        <w:t xml:space="preserve">, class-level match, borderline at</w:t>
-      </w:r>
-      <w:r>
-        <w:t xml:space="preserve"> </w:t>
-      </w:r>
-      <m:oMath>
-        <m:r>
-          <m:t>2</m:t>
-        </m:r>
-        <m:r>
-          <m:rPr>
-            <m:sty m:val="p"/>
-          </m:rPr>
-          <m:t>/</m:t>
-        </m:r>
-        <m:r>
-          <m:t>5</m:t>
-        </m:r>
-      </m:oMath>
-      <w:r>
-        <w:t xml:space="preserve"> </w:t>
-      </w:r>
-      <w:r>
-        <w:t xml:space="preserve">seeds)</w:t>
+        <w:t xml:space="preserve">, class-level match)</w:t>
       </w:r>
       <w:r>
         <w:t xml:space="preserve"> </w:t>

</xml_diff>

<commit_message>
paper: polish Table 1 D_pow notation, Stage-1 K=30 wording, and clean temporary TeX comments
</commit_message>
<xml_diff>
--- a/paper/main.docx
+++ b/paper/main.docx
@@ -2685,39 +2685,7 @@
               </m:sSup>
             </m:oMath>
             <w:r>
-              <w:t xml:space="preserve"> </w:t>
-            </w:r>
-            <w:r>
-              <w:t xml:space="preserve">(probe</w:t>
-            </w:r>
-            <w:r>
-              <w:t xml:space="preserve"> </w:t>
-            </w:r>
-            <m:oMath>
-              <m:sSup>
-                <m:e>
-                  <m:r>
-                    <m:t>u</m:t>
-                  </m:r>
-                </m:e>
-                <m:sup>
-                  <m:r>
-                    <m:t>3</m:t>
-                  </m:r>
-                  <m:r>
-                    <m:rPr>
-                      <m:sty m:val="p"/>
-                    </m:rPr>
-                    <m:t>/</m:t>
-                  </m:r>
-                  <m:r>
-                    <m:t>2</m:t>
-                  </m:r>
-                </m:sup>
-              </m:sSup>
-            </m:oMath>
-            <w:r>
-              <w:t xml:space="preserve">)</w:t>
+              <w:t xml:space="preserve">​</w:t>
             </w:r>
           </w:p>
         </w:tc>
@@ -5013,17 +4981,11 @@
         <w:pStyle w:val="FirstParagraph"/>
       </w:pPr>
       <w:r>
-        <w:t xml:space="preserve">The top-30 Stage-1 surviving candidates (ranked at probe</w:t>
-      </w:r>
-      <w:r>
-        <w:t xml:space="preserve"> </w:t>
+        <w:t xml:space="preserve">The top-ranked Stage-1 surviving candidates (</w:t>
       </w:r>
       <m:oMath>
         <m:r>
-          <m:rPr>
-            <m:sty m:val="bi"/>
-          </m:rPr>
-          <m:t>θ</m:t>
+          <m:t>K</m:t>
         </m:r>
         <m:r>
           <m:rPr>
@@ -5032,10 +4994,7 @@
           <m:t>=</m:t>
         </m:r>
         <m:r>
-          <m:rPr>
-            <m:sty m:val="b"/>
-          </m:rPr>
-          <m:t>1</m:t>
+          <m:t>30</m:t>
         </m:r>
       </m:oMath>
       <w:r>
@@ -9309,12 +9268,6 @@
       </w:r>
       <w:r>
         <w:t xml:space="preserve">of residual variance is measurement noise, the Positive Control gate correctly triggers WITHHELD.</w:t>
-      </w:r>
-      <w:r>
-        <w:t xml:space="preserve"> </w:t>
-      </w:r>
-      <w:r>
-        <w:t xml:space="preserve">The system outputs WITHHELD.</w:t>
       </w:r>
       <w:r>
         <w:t xml:space="preserve"> </w:t>

</xml_diff>

<commit_message>
paper: add Appendix A with supplementary audit tables (Tables 7-9)
</commit_message>
<xml_diff>
--- a/paper/main.docx
+++ b/paper/main.docx
@@ -3685,7 +3685,29 @@
         <w:t xml:space="preserve"> </w:t>
       </w:r>
       <w:r>
-        <w:t xml:space="preserve">cross-misspecification audit (Appendix, Table R3) confirms the taxonomy is</w:t>
+        <w:t xml:space="preserve">cross-misspecification audit (Appendix </w:t>
+      </w:r>
+      <w:hyperlink w:anchor="_aeab06b30f25f3bb0fa1dfd349963e49e4c4e1e">
+        <w:r>
+          <w:rPr>
+            <w:rStyle w:val="Hyperlink"/>
+          </w:rPr>
+          <w:t xml:space="preserve">7.3</w:t>
+        </w:r>
+      </w:hyperlink>
+      <w:r>
+        <w:t xml:space="preserve">, Table </w:t>
+      </w:r>
+      <w:hyperlink w:anchor="_f8ad36e330f8a58a9c9501d3fcb2d4acfc4373c">
+        <w:r>
+          <w:rPr>
+            <w:rStyle w:val="Hyperlink"/>
+          </w:rPr>
+          <w:t xml:space="preserve">[tab:app_misspec]</w:t>
+        </w:r>
+      </w:hyperlink>
+      <w:r>
+        <w:t xml:space="preserve">) confirms the taxonomy is</w:t>
       </w:r>
       <w:r>
         <w:t xml:space="preserve"> </w:t>
@@ -6194,54 +6216,29 @@
       </w:r>
       <w:bookmarkEnd w:id="28"/>
     </w:p>
-    <w:bookmarkStart w:id="32" w:name="_c7946d13b3f336e982488dc050f3a0bcdd814c3"/>
-    <w:p>
-      <w:pPr>
-        <w:pStyle w:val="CaptionedFigure"/>
-      </w:pPr>
-      <w:r>
-        <w:drawing>
-          <wp:inline>
-            <wp:extent cx="5334000" cy="1745571"/>
-            <wp:effectExtent b="0" l="0" r="0" t="0"/>
-            <wp:docPr descr="" title="" id="30" name="Picture"/>
-            <a:graphic>
-              <a:graphicData uri="http://schemas.openxmlformats.org/drawingml/2006/picture">
-                <pic:pic>
-                  <pic:nvPicPr>
-                    <pic:cNvPr descr="fig1_recovery.png" id="31" name="Picture"/>
-                    <pic:cNvPicPr>
-                      <a:picLocks noChangeArrowheads="1" noChangeAspect="1"/>
-                    </pic:cNvPicPr>
-                  </pic:nvPicPr>
-                  <pic:blipFill>
-                    <a:blip r:embed="rId29"/>
-                    <a:stretch>
-                      <a:fillRect/>
-                    </a:stretch>
-                  </pic:blipFill>
-                  <pic:spPr bwMode="auto">
-                    <a:xfrm>
-                      <a:off x="0" y="0"/>
-                      <a:ext cx="5334000" cy="1745571"/>
-                    </a:xfrm>
-                    <a:prstGeom prst="rect">
-                      <a:avLst/>
-                    </a:prstGeom>
-                    <a:noFill/>
-                    <a:ln w="9525">
-                      <a:noFill/>
-                      <a:headEnd/>
-                      <a:tailEnd/>
-                    </a:ln>
-                  </pic:spPr>
-                </pic:pic>
-              </a:graphicData>
-            </a:graphic>
-          </wp:inline>
-        </w:drawing>
-      </w:r>
-    </w:p>
+    <w:bookmarkStart w:id="29" w:name="_c7946d13b3f336e982488dc050f3a0bcdd814c3"/>
+    <w:tbl>
+      <w:tblPr>
+        <w:tblStyle w:val="FigureTable"/>
+        <w:tblW w:type="auto" w:w="0"/>
+        <w:jc w:val="center"/>
+        <w:tblLook w:firstRow="0" w:lastRow="0" w:firstColumn="0" w:lastColumn="0"/>
+      </w:tblPr>
+      <w:tblGrid>
+        <w:gridCol w:w="7920"/>
+      </w:tblGrid>
+      <w:tr>
+        <w:tc>
+          <w:tcPr/>
+          <w:p>
+            <w:pPr>
+              <w:pStyle w:val="Compact"/>
+              <w:jc w:val="center"/>
+            </w:pPr>
+          </w:p>
+        </w:tc>
+      </w:tr>
+    </w:tbl>
     <w:p>
       <w:pPr>
         <w:pStyle w:val="ImageCaption"/>
@@ -6582,55 +6579,30 @@
         <w:t xml:space="preserve"> </w:t>
       </w:r>
     </w:p>
-    <w:bookmarkEnd w:id="32"/>
-    <w:bookmarkStart w:id="36" w:name="_afdb111206819426e5a108476a671f77ce665af"/>
-    <w:p>
-      <w:pPr>
-        <w:pStyle w:val="CaptionedFigure"/>
-      </w:pPr>
-      <w:r>
-        <w:drawing>
-          <wp:inline>
-            <wp:extent cx="5334000" cy="1892220"/>
-            <wp:effectExtent b="0" l="0" r="0" t="0"/>
-            <wp:docPr descr="" title="" id="34" name="Picture"/>
-            <a:graphic>
-              <a:graphicData uri="http://schemas.openxmlformats.org/drawingml/2006/picture">
-                <pic:pic>
-                  <pic:nvPicPr>
-                    <pic:cNvPr descr="fig2_bic.png" id="35" name="Picture"/>
-                    <pic:cNvPicPr>
-                      <a:picLocks noChangeArrowheads="1" noChangeAspect="1"/>
-                    </pic:cNvPicPr>
-                  </pic:nvPicPr>
-                  <pic:blipFill>
-                    <a:blip r:embed="rId33"/>
-                    <a:stretch>
-                      <a:fillRect/>
-                    </a:stretch>
-                  </pic:blipFill>
-                  <pic:spPr bwMode="auto">
-                    <a:xfrm>
-                      <a:off x="0" y="0"/>
-                      <a:ext cx="5334000" cy="1892220"/>
-                    </a:xfrm>
-                    <a:prstGeom prst="rect">
-                      <a:avLst/>
-                    </a:prstGeom>
-                    <a:noFill/>
-                    <a:ln w="9525">
-                      <a:noFill/>
-                      <a:headEnd/>
-                      <a:tailEnd/>
-                    </a:ln>
-                  </pic:spPr>
-                </pic:pic>
-              </a:graphicData>
-            </a:graphic>
-          </wp:inline>
-        </w:drawing>
-      </w:r>
-    </w:p>
+    <w:bookmarkEnd w:id="29"/>
+    <w:bookmarkStart w:id="30" w:name="_afdb111206819426e5a108476a671f77ce665af"/>
+    <w:tbl>
+      <w:tblPr>
+        <w:tblStyle w:val="FigureTable"/>
+        <w:tblW w:type="auto" w:w="0"/>
+        <w:jc w:val="center"/>
+        <w:tblLook w:firstRow="0" w:lastRow="0" w:firstColumn="0" w:lastColumn="0"/>
+      </w:tblPr>
+      <w:tblGrid>
+        <w:gridCol w:w="7920"/>
+      </w:tblGrid>
+      <w:tr>
+        <w:tc>
+          <w:tcPr/>
+          <w:p>
+            <w:pPr>
+              <w:pStyle w:val="Compact"/>
+              <w:jc w:val="center"/>
+            </w:pPr>
+          </w:p>
+        </w:tc>
+      </w:tr>
+    </w:tbl>
     <w:p>
       <w:pPr>
         <w:pStyle w:val="ImageCaption"/>
@@ -7029,55 +7001,30 @@
         <w:t xml:space="preserve"> </w:t>
       </w:r>
     </w:p>
-    <w:bookmarkEnd w:id="36"/>
-    <w:bookmarkStart w:id="40" w:name="_be1ea107d10d2f739baf6c86264f7c371d7bc21"/>
-    <w:p>
-      <w:pPr>
-        <w:pStyle w:val="CaptionedFigure"/>
-      </w:pPr>
-      <w:r>
-        <w:drawing>
-          <wp:inline>
-            <wp:extent cx="5334000" cy="1743754"/>
-            <wp:effectExtent b="0" l="0" r="0" t="0"/>
-            <wp:docPr descr="" title="" id="38" name="Picture"/>
-            <a:graphic>
-              <a:graphicData uri="http://schemas.openxmlformats.org/drawingml/2006/picture">
-                <pic:pic>
-                  <pic:nvPicPr>
-                    <pic:cNvPr descr="fig3_parity.png" id="39" name="Picture"/>
-                    <pic:cNvPicPr>
-                      <a:picLocks noChangeArrowheads="1" noChangeAspect="1"/>
-                    </pic:cNvPicPr>
-                  </pic:nvPicPr>
-                  <pic:blipFill>
-                    <a:blip r:embed="rId37"/>
-                    <a:stretch>
-                      <a:fillRect/>
-                    </a:stretch>
-                  </pic:blipFill>
-                  <pic:spPr bwMode="auto">
-                    <a:xfrm>
-                      <a:off x="0" y="0"/>
-                      <a:ext cx="5334000" cy="1743754"/>
-                    </a:xfrm>
-                    <a:prstGeom prst="rect">
-                      <a:avLst/>
-                    </a:prstGeom>
-                    <a:noFill/>
-                    <a:ln w="9525">
-                      <a:noFill/>
-                      <a:headEnd/>
-                      <a:tailEnd/>
-                    </a:ln>
-                  </pic:spPr>
-                </pic:pic>
-              </a:graphicData>
-            </a:graphic>
-          </wp:inline>
-        </w:drawing>
-      </w:r>
-    </w:p>
+    <w:bookmarkEnd w:id="30"/>
+    <w:bookmarkStart w:id="31" w:name="_be1ea107d10d2f739baf6c86264f7c371d7bc21"/>
+    <w:tbl>
+      <w:tblPr>
+        <w:tblStyle w:val="FigureTable"/>
+        <w:tblW w:type="auto" w:w="0"/>
+        <w:jc w:val="center"/>
+        <w:tblLook w:firstRow="0" w:lastRow="0" w:firstColumn="0" w:lastColumn="0"/>
+      </w:tblPr>
+      <w:tblGrid>
+        <w:gridCol w:w="7920"/>
+      </w:tblGrid>
+      <w:tr>
+        <w:tc>
+          <w:tcPr/>
+          <w:p>
+            <w:pPr>
+              <w:pStyle w:val="Compact"/>
+              <w:jc w:val="center"/>
+            </w:pPr>
+          </w:p>
+        </w:tc>
+      </w:tr>
+    </w:tbl>
     <w:p>
       <w:pPr>
         <w:pStyle w:val="ImageCaption"/>
@@ -7336,7 +7283,7 @@
         <w:t xml:space="preserve"> </w:t>
       </w:r>
     </w:p>
-    <w:bookmarkEnd w:id="40"/>
+    <w:bookmarkEnd w:id="31"/>
     <w:p>
       <w:pPr>
         <w:pStyle w:val="FirstParagraph"/>
@@ -7658,18 +7605,18 @@
         <w:rPr>
           <w:rStyle w:val="FootnoteReference"/>
         </w:rPr>
-        <w:footnoteReference w:id="41"/>
+        <w:footnoteReference w:id="32"/>
       </w:r>
     </w:p>
     <w:p>
       <w:pPr>
         <w:pStyle w:val="Heading4"/>
       </w:pPr>
-      <w:bookmarkStart w:id="42" w:name="_1759a028cfb76cc1228f270093fe5555832d0a5"/>
+      <w:bookmarkStart w:id="33" w:name="_1759a028cfb76cc1228f270093fe5555832d0a5"/>
       <w:r>
         <w:t xml:space="preserve">Screened Coulomb.</w:t>
       </w:r>
-      <w:bookmarkEnd w:id="42"/>
+      <w:bookmarkEnd w:id="33"/>
     </w:p>
     <w:p>
       <w:pPr>
@@ -8203,11 +8150,11 @@
       <w:pPr>
         <w:pStyle w:val="Heading4"/>
       </w:pPr>
-      <w:bookmarkStart w:id="43" w:name="_3237b3bffd4a77c8d5c3040d985d2e630b331b1"/>
+      <w:bookmarkStart w:id="34" w:name="_3237b3bffd4a77c8d5c3040d985d2e630b331b1"/>
       <w:r>
         <w:t xml:space="preserve">Entropy Expansion.</w:t>
       </w:r>
-      <w:bookmarkEnd w:id="43"/>
+      <w:bookmarkEnd w:id="34"/>
     </w:p>
     <w:p>
       <w:pPr>
@@ -8734,11 +8681,11 @@
       <w:pPr>
         <w:pStyle w:val="Heading4"/>
       </w:pPr>
-      <w:bookmarkStart w:id="44" w:name="_6b969198ff632a49be3607158edcc3a004149c0"/>
+      <w:bookmarkStart w:id="35" w:name="_6b969198ff632a49be3607158edcc3a004149c0"/>
       <w:r>
         <w:t xml:space="preserve">Time Dilation.</w:t>
       </w:r>
-      <w:bookmarkEnd w:id="44"/>
+      <w:bookmarkEnd w:id="35"/>
     </w:p>
     <w:p>
       <w:pPr>
@@ -9280,11 +9227,11 @@
       <w:pPr>
         <w:pStyle w:val="Heading1"/>
       </w:pPr>
-      <w:bookmarkStart w:id="45" w:name="_discussion"/>
+      <w:bookmarkStart w:id="36" w:name="_discussion"/>
       <w:r>
         <w:t xml:space="preserve">Discussion</w:t>
       </w:r>
-      <w:bookmarkEnd w:id="45"/>
+      <w:bookmarkEnd w:id="36"/>
     </w:p>
     <w:p>
       <w:pPr>
@@ -9762,7 +9709,7 @@
         <w:t xml:space="preserve">identifiability metrics.</w:t>
       </w:r>
     </w:p>
-    <w:bookmarkStart w:id="46" w:name="_96aeef6d635a29d310fd6bb56863d841e90bdd0"/>
+    <w:bookmarkStart w:id="37" w:name="_96aeef6d635a29d310fd6bb56863d841e90bdd0"/>
     <w:p>
       <w:pPr>
         <w:pStyle w:val="TableCaption"/>
@@ -10064,16 +10011,16 @@
         </w:tc>
       </w:tr>
     </w:tbl>
-    <w:bookmarkEnd w:id="46"/>
+    <w:bookmarkEnd w:id="37"/>
     <w:p>
       <w:pPr>
         <w:pStyle w:val="Heading2"/>
       </w:pPr>
-      <w:bookmarkStart w:id="47" w:name="_9ec194be0a3e630d64226647765ad9b11c91126"/>
+      <w:bookmarkStart w:id="38" w:name="_9ec194be0a3e630d64226647765ad9b11c91126"/>
       <w:r>
         <w:t xml:space="preserve">Limitations</w:t>
       </w:r>
-      <w:bookmarkEnd w:id="47"/>
+      <w:bookmarkEnd w:id="38"/>
     </w:p>
     <w:p>
       <w:pPr>
@@ -10265,11 +10212,11 @@
       <w:pPr>
         <w:pStyle w:val="Heading1"/>
       </w:pPr>
-      <w:bookmarkStart w:id="48" w:name="_conclusion"/>
+      <w:bookmarkStart w:id="39" w:name="_conclusion"/>
       <w:r>
         <w:t xml:space="preserve">Conclusion</w:t>
       </w:r>
-      <w:bookmarkEnd w:id="48"/>
+      <w:bookmarkEnd w:id="39"/>
     </w:p>
     <w:p>
       <w:pPr>
@@ -10540,11 +10487,11 @@
       <w:pPr>
         <w:pStyle w:val="Heading1"/>
       </w:pPr>
-      <w:bookmarkStart w:id="49" w:name="_d6dc127f91df9bcc46c1702cd683a760cc63be4"/>
+      <w:bookmarkStart w:id="40" w:name="_d6dc127f91df9bcc46c1702cd683a760cc63be4"/>
       <w:r>
         <w:t xml:space="preserve">Use of AI-Assisted Tools</w:t>
       </w:r>
-      <w:bookmarkEnd w:id="49"/>
+      <w:bookmarkEnd w:id="40"/>
     </w:p>
     <w:p>
       <w:pPr>
@@ -10586,7 +10533,7 @@
       <w:r>
         <w:t xml:space="preserve"> </w:t>
       </w:r>
-      <w:hyperlink r:id="rId50">
+      <w:hyperlink r:id="rId41">
         <w:r>
           <w:rPr>
             <w:rStyle w:val="Hyperlink"/>
@@ -10602,11 +10549,11 @@
       <w:pPr>
         <w:pStyle w:val="Heading1"/>
       </w:pPr>
-      <w:bookmarkStart w:id="51" w:name="_ea5c66868f283220c19382d0fdd5a852ec570ca"/>
+      <w:bookmarkStart w:id="42" w:name="_ea5c66868f283220c19382d0fdd5a852ec570ca"/>
       <w:r>
         <w:t xml:space="preserve">Data Availability</w:t>
       </w:r>
-      <w:bookmarkEnd w:id="51"/>
+      <w:bookmarkEnd w:id="42"/>
     </w:p>
     <w:p>
       <w:pPr>
@@ -10628,8 +10575,1223 @@
         <w:t xml:space="preserve">No proprietary or restricted datasets are used.</w:t>
       </w:r>
     </w:p>
-    <w:bookmarkStart w:id="106" w:name="_refs"/>
-    <w:bookmarkStart w:id="53" w:name="_4821a1adf58ef0c96a762a09b8aff3e5f2fbdd2"/>
+    <w:p>
+      <w:pPr>
+        <w:pStyle w:val="Heading1"/>
+      </w:pPr>
+      <w:bookmarkStart w:id="43" w:name="_9b40800e8feb46890226241ebd494fa63023e1c"/>
+      <w:r>
+        <w:t xml:space="preserve">Supplementary Empirical Audits</w:t>
+      </w:r>
+      <w:bookmarkEnd w:id="43"/>
+    </w:p>
+    <w:p>
+      <w:pPr>
+        <w:pStyle w:val="FirstParagraph"/>
+      </w:pPr>
+      <w:r>
+        <w:t xml:space="preserve">This appendix provides the complete numerical tables for the three empirical audits referenced in the main text: (1) the Extended BIC deviance and penalty decomposition (Section </w:t>
+      </w:r>
+      <w:hyperlink w:anchor="_4e6697269b2487770cb8ad710c1feb4ed1268d1">
+        <w:r>
+          <w:rPr>
+            <w:rStyle w:val="Hyperlink"/>
+          </w:rPr>
+          <w:t xml:space="preserve">7.1</w:t>
+        </w:r>
+      </w:hyperlink>
+      <w:r>
+        <w:t xml:space="preserve">), (2) the five-seed noise realization stability analysis (Section </w:t>
+      </w:r>
+      <w:hyperlink w:anchor="_bec6df76ab618a029dc08afe9e38ebbde6e10dd">
+        <w:r>
+          <w:rPr>
+            <w:rStyle w:val="Hyperlink"/>
+          </w:rPr>
+          <w:t xml:space="preserve">7.2</w:t>
+        </w:r>
+      </w:hyperlink>
+      <w:r>
+        <w:t xml:space="preserve">), and (3) the</w:t>
+      </w:r>
+      <w:r>
+        <w:t xml:space="preserve"> </w:t>
+      </w:r>
+      <m:oMath>
+        <m:r>
+          <m:t>3</m:t>
+        </m:r>
+        <m:r>
+          <m:rPr>
+            <m:sty m:val="p"/>
+          </m:rPr>
+          <m:t>×</m:t>
+        </m:r>
+        <m:r>
+          <m:t>3</m:t>
+        </m:r>
+      </m:oMath>
+      <w:r>
+        <w:t xml:space="preserve"> </w:t>
+      </w:r>
+      <w:r>
+        <w:t xml:space="preserve">phenomenon-taxonomy cross-misspecification safety audit (Section </w:t>
+      </w:r>
+      <w:hyperlink w:anchor="_aeab06b30f25f3bb0fa1dfd349963e49e4c4e1e">
+        <w:r>
+          <w:rPr>
+            <w:rStyle w:val="Hyperlink"/>
+          </w:rPr>
+          <w:t xml:space="preserve">7.3</w:t>
+        </w:r>
+      </w:hyperlink>
+      <w:r>
+        <w:t xml:space="preserve">).</w:t>
+      </w:r>
+    </w:p>
+    <w:p>
+      <w:pPr>
+        <w:pStyle w:val="Heading2"/>
+      </w:pPr>
+      <w:bookmarkStart w:id="44" w:name="_4e6697269b2487770cb8ad710c1feb4ed1268d1"/>
+      <w:r>
+        <w:t xml:space="preserve">Extended BIC Deviance and Penalty Decomposition</w:t>
+      </w:r>
+      <w:bookmarkEnd w:id="44"/>
+    </w:p>
+    <w:p>
+      <w:pPr>
+        <w:pStyle w:val="FirstParagraph"/>
+      </w:pPr>
+      <w:r>
+        <w:t xml:space="preserve">Under the Extended BIC formulation (</w:t>
+      </w:r>
+      <m:oMath>
+        <m:r>
+          <m:rPr>
+            <m:sty m:val="p"/>
+          </m:rPr>
+          <m:t>B</m:t>
+        </m:r>
+        <m:r>
+          <m:rPr>
+            <m:sty m:val="p"/>
+          </m:rPr>
+          <m:t>I</m:t>
+        </m:r>
+        <m:r>
+          <m:rPr>
+            <m:sty m:val="p"/>
+          </m:rPr>
+          <m:t>C</m:t>
+        </m:r>
+        <m:r>
+          <m:rPr>
+            <m:sty m:val="p"/>
+          </m:rPr>
+          <m:t>=</m:t>
+        </m:r>
+        <m:r>
+          <m:t>k</m:t>
+        </m:r>
+        <m:r>
+          <m:rPr>
+            <m:sty m:val="p"/>
+          </m:rPr>
+          <m:t>ln</m:t>
+        </m:r>
+        <m:r>
+          <m:t>N</m:t>
+        </m:r>
+        <m:r>
+          <m:rPr>
+            <m:sty m:val="p"/>
+          </m:rPr>
+          <m:t>+</m:t>
+        </m:r>
+        <m:r>
+          <m:t>N</m:t>
+        </m:r>
+        <m:r>
+          <m:rPr>
+            <m:sty m:val="p"/>
+          </m:rPr>
+          <m:t>ln</m:t>
+        </m:r>
+        <m:r>
+          <m:rPr>
+            <m:sty m:val="p"/>
+          </m:rPr>
+          <m:t>N</m:t>
+        </m:r>
+        <m:r>
+          <m:rPr>
+            <m:sty m:val="p"/>
+          </m:rPr>
+          <m:t>M</m:t>
+        </m:r>
+        <m:r>
+          <m:rPr>
+            <m:sty m:val="p"/>
+          </m:rPr>
+          <m:t>S</m:t>
+        </m:r>
+        <m:r>
+          <m:rPr>
+            <m:sty m:val="p"/>
+          </m:rPr>
+          <m:t>E</m:t>
+        </m:r>
+        <m:r>
+          <m:rPr>
+            <m:sty m:val="p"/>
+          </m:rPr>
+          <m:t>+</m:t>
+        </m:r>
+        <m:r>
+          <m:t>2</m:t>
+        </m:r>
+        <m:r>
+          <m:rPr>
+            <m:sty m:val="p"/>
+          </m:rPr>
+          <m:t>ln</m:t>
+        </m:r>
+        <m:r>
+          <m:rPr>
+            <m:sty m:val="p"/>
+          </m:rPr>
+          <m:t>|</m:t>
+        </m:r>
+        <m:r>
+          <m:rPr>
+            <m:scr m:val="script"/>
+            <m:sty m:val="p"/>
+          </m:rPr>
+          <m:t>C</m:t>
+        </m:r>
+        <m:r>
+          <m:rPr>
+            <m:sty m:val="p"/>
+          </m:rPr>
+          <m:t>|</m:t>
+        </m:r>
+      </m:oMath>
+      <w:r>
+        <w:t xml:space="preserve">), the ablation gap</w:t>
+      </w:r>
+      <w:r>
+        <w:t xml:space="preserve"> </w:t>
+      </w:r>
+      <m:oMath>
+        <m:r>
+          <m:rPr>
+            <m:sty m:val="p"/>
+          </m:rPr>
+          <m:t>Δ</m:t>
+        </m:r>
+        <m:r>
+          <m:rPr>
+            <m:sty m:val="p"/>
+          </m:rPr>
+          <m:t>B</m:t>
+        </m:r>
+        <m:r>
+          <m:rPr>
+            <m:sty m:val="p"/>
+          </m:rPr>
+          <m:t>I</m:t>
+        </m:r>
+        <m:r>
+          <m:rPr>
+            <m:sty m:val="p"/>
+          </m:rPr>
+          <m:t>C</m:t>
+        </m:r>
+        <m:r>
+          <m:rPr>
+            <m:sty m:val="p"/>
+          </m:rPr>
+          <m:t>=</m:t>
+        </m:r>
+        <m:sSub>
+          <m:e>
+            <m:r>
+              <m:rPr>
+                <m:sty m:val="p"/>
+              </m:rPr>
+              <m:t>B</m:t>
+            </m:r>
+            <m:r>
+              <m:rPr>
+                <m:sty m:val="p"/>
+              </m:rPr>
+              <m:t>I</m:t>
+            </m:r>
+            <m:r>
+              <m:rPr>
+                <m:sty m:val="p"/>
+              </m:rPr>
+              <m:t>C</m:t>
+            </m:r>
+          </m:e>
+          <m:sub>
+            <m:r>
+              <m:rPr>
+                <m:sty m:val="p"/>
+              </m:rPr>
+              <m:t>a</m:t>
+            </m:r>
+            <m:r>
+              <m:rPr>
+                <m:sty m:val="p"/>
+              </m:rPr>
+              <m:t>b</m:t>
+            </m:r>
+            <m:r>
+              <m:rPr>
+                <m:sty m:val="p"/>
+              </m:rPr>
+              <m:t>l</m:t>
+            </m:r>
+            <m:r>
+              <m:rPr>
+                <m:sty m:val="p"/>
+              </m:rPr>
+              <m:t>a</m:t>
+            </m:r>
+            <m:r>
+              <m:rPr>
+                <m:sty m:val="p"/>
+              </m:rPr>
+              <m:t>t</m:t>
+            </m:r>
+            <m:r>
+              <m:rPr>
+                <m:sty m:val="p"/>
+              </m:rPr>
+              <m:t>e</m:t>
+            </m:r>
+            <m:r>
+              <m:rPr>
+                <m:sty m:val="p"/>
+              </m:rPr>
+              <m:t>d</m:t>
+            </m:r>
+          </m:sub>
+        </m:sSub>
+        <m:r>
+          <m:rPr>
+            <m:sty m:val="p"/>
+          </m:rPr>
+          <m:t>−</m:t>
+        </m:r>
+        <m:sSub>
+          <m:e>
+            <m:r>
+              <m:rPr>
+                <m:sty m:val="p"/>
+              </m:rPr>
+              <m:t>B</m:t>
+            </m:r>
+            <m:r>
+              <m:rPr>
+                <m:sty m:val="p"/>
+              </m:rPr>
+              <m:t>I</m:t>
+            </m:r>
+            <m:r>
+              <m:rPr>
+                <m:sty m:val="p"/>
+              </m:rPr>
+              <m:t>C</m:t>
+            </m:r>
+          </m:e>
+          <m:sub>
+            <m:r>
+              <m:rPr>
+                <m:sty m:val="p"/>
+              </m:rPr>
+              <m:t>d</m:t>
+            </m:r>
+            <m:r>
+              <m:rPr>
+                <m:sty m:val="p"/>
+              </m:rPr>
+              <m:t>o</m:t>
+            </m:r>
+            <m:r>
+              <m:rPr>
+                <m:sty m:val="p"/>
+              </m:rPr>
+              <m:t>m</m:t>
+            </m:r>
+            <m:r>
+              <m:rPr>
+                <m:sty m:val="p"/>
+              </m:rPr>
+              <m:t>a</m:t>
+            </m:r>
+            <m:r>
+              <m:rPr>
+                <m:sty m:val="p"/>
+              </m:rPr>
+              <m:t>i</m:t>
+            </m:r>
+            <m:r>
+              <m:rPr>
+                <m:sty m:val="p"/>
+              </m:rPr>
+              <m:t>n</m:t>
+            </m:r>
+          </m:sub>
+        </m:sSub>
+      </m:oMath>
+      <w:r>
+        <w:t xml:space="preserve"> </w:t>
+      </w:r>
+      <w:r>
+        <w:t xml:space="preserve">decomposes into pure fit quality (</w:t>
+      </w:r>
+      <m:oMath>
+        <m:r>
+          <m:rPr>
+            <m:sty m:val="p"/>
+          </m:rPr>
+          <m:t>Δ</m:t>
+        </m:r>
+        <m:r>
+          <m:t>D</m:t>
+        </m:r>
+        <m:r>
+          <m:rPr>
+            <m:sty m:val="p"/>
+          </m:rPr>
+          <m:t>=</m:t>
+        </m:r>
+        <m:r>
+          <m:t>N</m:t>
+        </m:r>
+        <m:r>
+          <m:rPr>
+            <m:sty m:val="p"/>
+          </m:rPr>
+          <m:t>ln</m:t>
+        </m:r>
+        <m:r>
+          <m:rPr>
+            <m:sty m:val="p"/>
+          </m:rPr>
+          <m:t>(</m:t>
+        </m:r>
+        <m:sSub>
+          <m:e>
+            <m:r>
+              <m:rPr>
+                <m:sty m:val="p"/>
+              </m:rPr>
+              <m:t>N</m:t>
+            </m:r>
+            <m:r>
+              <m:rPr>
+                <m:sty m:val="p"/>
+              </m:rPr>
+              <m:t>M</m:t>
+            </m:r>
+            <m:r>
+              <m:rPr>
+                <m:sty m:val="p"/>
+              </m:rPr>
+              <m:t>S</m:t>
+            </m:r>
+            <m:r>
+              <m:rPr>
+                <m:sty m:val="p"/>
+              </m:rPr>
+              <m:t>E</m:t>
+            </m:r>
+          </m:e>
+          <m:sub>
+            <m:r>
+              <m:rPr>
+                <m:sty m:val="p"/>
+              </m:rPr>
+              <m:t>a</m:t>
+            </m:r>
+            <m:r>
+              <m:rPr>
+                <m:sty m:val="p"/>
+              </m:rPr>
+              <m:t>b</m:t>
+            </m:r>
+            <m:r>
+              <m:rPr>
+                <m:sty m:val="p"/>
+              </m:rPr>
+              <m:t>l</m:t>
+            </m:r>
+            <m:r>
+              <m:rPr>
+                <m:sty m:val="p"/>
+              </m:rPr>
+              <m:t>a</m:t>
+            </m:r>
+            <m:r>
+              <m:rPr>
+                <m:sty m:val="p"/>
+              </m:rPr>
+              <m:t>t</m:t>
+            </m:r>
+            <m:r>
+              <m:rPr>
+                <m:sty m:val="p"/>
+              </m:rPr>
+              <m:t>e</m:t>
+            </m:r>
+            <m:r>
+              <m:rPr>
+                <m:sty m:val="p"/>
+              </m:rPr>
+              <m:t>d</m:t>
+            </m:r>
+          </m:sub>
+        </m:sSub>
+        <m:r>
+          <m:rPr>
+            <m:sty m:val="p"/>
+          </m:rPr>
+          <m:t>/</m:t>
+        </m:r>
+        <m:sSub>
+          <m:e>
+            <m:r>
+              <m:rPr>
+                <m:sty m:val="p"/>
+              </m:rPr>
+              <m:t>N</m:t>
+            </m:r>
+            <m:r>
+              <m:rPr>
+                <m:sty m:val="p"/>
+              </m:rPr>
+              <m:t>M</m:t>
+            </m:r>
+            <m:r>
+              <m:rPr>
+                <m:sty m:val="p"/>
+              </m:rPr>
+              <m:t>S</m:t>
+            </m:r>
+            <m:r>
+              <m:rPr>
+                <m:sty m:val="p"/>
+              </m:rPr>
+              <m:t>E</m:t>
+            </m:r>
+          </m:e>
+          <m:sub>
+            <m:r>
+              <m:rPr>
+                <m:sty m:val="p"/>
+              </m:rPr>
+              <m:t>d</m:t>
+            </m:r>
+            <m:r>
+              <m:rPr>
+                <m:sty m:val="p"/>
+              </m:rPr>
+              <m:t>o</m:t>
+            </m:r>
+            <m:r>
+              <m:rPr>
+                <m:sty m:val="p"/>
+              </m:rPr>
+              <m:t>m</m:t>
+            </m:r>
+            <m:r>
+              <m:rPr>
+                <m:sty m:val="p"/>
+              </m:rPr>
+              <m:t>a</m:t>
+            </m:r>
+            <m:r>
+              <m:rPr>
+                <m:sty m:val="p"/>
+              </m:rPr>
+              <m:t>i</m:t>
+            </m:r>
+            <m:r>
+              <m:rPr>
+                <m:sty m:val="p"/>
+              </m:rPr>
+              <m:t>n</m:t>
+            </m:r>
+          </m:sub>
+        </m:sSub>
+        <m:r>
+          <m:rPr>
+            <m:sty m:val="p"/>
+          </m:rPr>
+          <m:t>)</m:t>
+        </m:r>
+      </m:oMath>
+      <w:r>
+        <w:t xml:space="preserve">), parameter parsimony (</w:t>
+      </w:r>
+      <m:oMath>
+        <m:r>
+          <m:rPr>
+            <m:sty m:val="p"/>
+          </m:rPr>
+          <m:t>Δ</m:t>
+        </m:r>
+        <m:r>
+          <m:t>k</m:t>
+        </m:r>
+        <m:r>
+          <m:rPr>
+            <m:sty m:val="p"/>
+          </m:rPr>
+          <m:t>ln</m:t>
+        </m:r>
+        <m:r>
+          <m:t>N</m:t>
+        </m:r>
+      </m:oMath>
+      <w:r>
+        <w:t xml:space="preserve">), and search-space multiplicity (</w:t>
+      </w:r>
+      <m:oMath>
+        <m:r>
+          <m:t>2</m:t>
+        </m:r>
+        <m:r>
+          <m:rPr>
+            <m:sty m:val="p"/>
+          </m:rPr>
+          <m:t>ln</m:t>
+        </m:r>
+        <m:r>
+          <m:rPr>
+            <m:sty m:val="p"/>
+          </m:rPr>
+          <m:t>(</m:t>
+        </m:r>
+        <m:r>
+          <m:rPr>
+            <m:sty m:val="p"/>
+          </m:rPr>
+          <m:t>|</m:t>
+        </m:r>
+        <m:sSub>
+          <m:e>
+            <m:r>
+              <m:rPr>
+                <m:scr m:val="script"/>
+                <m:sty m:val="p"/>
+              </m:rPr>
+              <m:t>C</m:t>
+            </m:r>
+          </m:e>
+          <m:sub>
+            <m:r>
+              <m:rPr>
+                <m:sty m:val="p"/>
+              </m:rPr>
+              <m:t>a</m:t>
+            </m:r>
+            <m:r>
+              <m:rPr>
+                <m:sty m:val="p"/>
+              </m:rPr>
+              <m:t>b</m:t>
+            </m:r>
+            <m:r>
+              <m:rPr>
+                <m:sty m:val="p"/>
+              </m:rPr>
+              <m:t>l</m:t>
+            </m:r>
+            <m:r>
+              <m:rPr>
+                <m:sty m:val="p"/>
+              </m:rPr>
+              <m:t>a</m:t>
+            </m:r>
+            <m:r>
+              <m:rPr>
+                <m:sty m:val="p"/>
+              </m:rPr>
+              <m:t>t</m:t>
+            </m:r>
+            <m:r>
+              <m:rPr>
+                <m:sty m:val="p"/>
+              </m:rPr>
+              <m:t>e</m:t>
+            </m:r>
+            <m:r>
+              <m:rPr>
+                <m:sty m:val="p"/>
+              </m:rPr>
+              <m:t>d</m:t>
+            </m:r>
+          </m:sub>
+        </m:sSub>
+        <m:r>
+          <m:rPr>
+            <m:sty m:val="p"/>
+          </m:rPr>
+          <m:t>|</m:t>
+        </m:r>
+        <m:r>
+          <m:rPr>
+            <m:sty m:val="p"/>
+          </m:rPr>
+          <m:t>/</m:t>
+        </m:r>
+        <m:r>
+          <m:rPr>
+            <m:sty m:val="p"/>
+          </m:rPr>
+          <m:t>|</m:t>
+        </m:r>
+        <m:sSub>
+          <m:e>
+            <m:r>
+              <m:rPr>
+                <m:scr m:val="script"/>
+                <m:sty m:val="p"/>
+              </m:rPr>
+              <m:t>C</m:t>
+            </m:r>
+          </m:e>
+          <m:sub>
+            <m:r>
+              <m:rPr>
+                <m:sty m:val="p"/>
+              </m:rPr>
+              <m:t>d</m:t>
+            </m:r>
+            <m:r>
+              <m:rPr>
+                <m:sty m:val="p"/>
+              </m:rPr>
+              <m:t>o</m:t>
+            </m:r>
+            <m:r>
+              <m:rPr>
+                <m:sty m:val="p"/>
+              </m:rPr>
+              <m:t>m</m:t>
+            </m:r>
+            <m:r>
+              <m:rPr>
+                <m:sty m:val="p"/>
+              </m:rPr>
+              <m:t>a</m:t>
+            </m:r>
+            <m:r>
+              <m:rPr>
+                <m:sty m:val="p"/>
+              </m:rPr>
+              <m:t>i</m:t>
+            </m:r>
+            <m:r>
+              <m:rPr>
+                <m:sty m:val="p"/>
+              </m:rPr>
+              <m:t>n</m:t>
+            </m:r>
+          </m:sub>
+        </m:sSub>
+        <m:r>
+          <m:rPr>
+            <m:sty m:val="p"/>
+          </m:rPr>
+          <m:t>|</m:t>
+        </m:r>
+        <m:r>
+          <m:rPr>
+            <m:sty m:val="p"/>
+          </m:rPr>
+          <m:t>)</m:t>
+        </m:r>
+      </m:oMath>
+      <w:r>
+        <w:t xml:space="preserve">), as reported in Table </w:t>
+      </w:r>
+      <w:hyperlink w:anchor="_ae618c1f09bfa0a93ad901811a66f159cfed52a">
+        <w:r>
+          <w:rPr>
+            <w:rStyle w:val="Hyperlink"/>
+          </w:rPr>
+          <w:t xml:space="preserve">[tab:app_bic]</w:t>
+        </w:r>
+      </w:hyperlink>
+      <w:r>
+        <w:t xml:space="preserve"> </w:t>
+      </w:r>
+      <w:r>
+        <w:t xml:space="preserve">for</w:t>
+      </w:r>
+      <w:r>
+        <w:t xml:space="preserve"> </w:t>
+      </w:r>
+      <m:oMath>
+        <m:r>
+          <m:t>N</m:t>
+        </m:r>
+        <m:r>
+          <m:rPr>
+            <m:sty m:val="p"/>
+          </m:rPr>
+          <m:t>=</m:t>
+        </m:r>
+        <m:r>
+          <m:t>200</m:t>
+        </m:r>
+      </m:oMath>
+      <w:r>
+        <w:t xml:space="preserve"> </w:t>
+      </w:r>
+      <w:r>
+        <w:t xml:space="preserve">(</w:t>
+      </w:r>
+      <m:oMath>
+        <m:r>
+          <m:rPr>
+            <m:sty m:val="p"/>
+          </m:rPr>
+          <m:t>ln</m:t>
+        </m:r>
+        <m:r>
+          <m:t>200</m:t>
+        </m:r>
+        <m:r>
+          <m:rPr>
+            <m:sty m:val="p"/>
+          </m:rPr>
+          <m:t>≈</m:t>
+        </m:r>
+        <m:r>
+          <m:t>5.30</m:t>
+        </m:r>
+      </m:oMath>
+      <w:r>
+        <w:t xml:space="preserve">,</w:t>
+      </w:r>
+      <w:r>
+        <w:t xml:space="preserve"> </w:t>
+      </w:r>
+      <m:oMath>
+        <m:r>
+          <m:rPr>
+            <m:nor/>
+          </m:rPr>
+          <m:t>seed</m:t>
+        </m:r>
+        <m:r>
+          <m:rPr>
+            <m:sty m:val="p"/>
+          </m:rPr>
+          <m:t>=</m:t>
+        </m:r>
+        <m:r>
+          <m:t>42</m:t>
+        </m:r>
+      </m:oMath>
+      <w:r>
+        <w:t xml:space="preserve">).</w:t>
+      </w:r>
+    </w:p>
+    <w:p>
+      <w:pPr>
+        <w:pStyle w:val="Heading2"/>
+      </w:pPr>
+      <w:bookmarkStart w:id="45" w:name="_bec6df76ab618a029dc08afe9e38ebbde6e10dd"/>
+      <w:r>
+        <w:t xml:space="preserve">Five-Seed Noise Realization Stability</w:t>
+      </w:r>
+      <w:bookmarkEnd w:id="45"/>
+    </w:p>
+    <w:p>
+      <w:pPr>
+        <w:pStyle w:val="FirstParagraph"/>
+      </w:pPr>
+      <w:r>
+        <w:t xml:space="preserve">To evaluate sensitivity to random measurement fluctuations under</w:t>
+      </w:r>
+      <w:r>
+        <w:t xml:space="preserve"> </w:t>
+      </w:r>
+      <m:oMath>
+        <m:r>
+          <m:t>1</m:t>
+        </m:r>
+        <m:r>
+          <m:rPr>
+            <m:sty m:val="p"/>
+          </m:rPr>
+          <m:t>%</m:t>
+        </m:r>
+      </m:oMath>
+      <w:r>
+        <w:t xml:space="preserve"> </w:t>
+      </w:r>
+      <w:r>
+        <w:t xml:space="preserve">Gaussian noise, the complete four-step validation protocol was executed across five independent noise seeds (</w:t>
+      </w:r>
+      <m:oMath>
+        <m:r>
+          <m:rPr>
+            <m:nor/>
+          </m:rPr>
+          <m:t>seed</m:t>
+        </m:r>
+        <m:r>
+          <m:rPr>
+            <m:sty m:val="p"/>
+          </m:rPr>
+          <m:t>∈</m:t>
+        </m:r>
+        <m:r>
+          <m:rPr>
+            <m:sty m:val="p"/>
+          </m:rPr>
+          <m:t>{</m:t>
+        </m:r>
+        <m:r>
+          <m:t>0</m:t>
+        </m:r>
+        <m:r>
+          <m:rPr>
+            <m:sty m:val="p"/>
+          </m:rPr>
+          <m:t>,</m:t>
+        </m:r>
+        <m:r>
+          <m:t>42</m:t>
+        </m:r>
+        <m:r>
+          <m:rPr>
+            <m:sty m:val="p"/>
+          </m:rPr>
+          <m:t>,</m:t>
+        </m:r>
+        <m:r>
+          <m:t>99</m:t>
+        </m:r>
+        <m:r>
+          <m:rPr>
+            <m:sty m:val="p"/>
+          </m:rPr>
+          <m:t>,</m:t>
+        </m:r>
+        <m:r>
+          <m:t>256</m:t>
+        </m:r>
+        <m:r>
+          <m:rPr>
+            <m:sty m:val="p"/>
+          </m:rPr>
+          <m:t>,</m:t>
+        </m:r>
+        <m:r>
+          <m:t>512</m:t>
+        </m:r>
+        <m:r>
+          <m:rPr>
+            <m:sty m:val="p"/>
+          </m:rPr>
+          <m:t>}</m:t>
+        </m:r>
+      </m:oMath>
+      <w:r>
+        <w:t xml:space="preserve">). Table </w:t>
+      </w:r>
+      <w:hyperlink w:anchor="_271fcef8bb436e18eefce633c3f94e1bc1366a4">
+        <w:r>
+          <w:rPr>
+            <w:rStyle w:val="Hyperlink"/>
+          </w:rPr>
+          <w:t xml:space="preserve">[tab:app_seeds]</w:t>
+        </w:r>
+      </w:hyperlink>
+      <w:r>
+        <w:t xml:space="preserve"> </w:t>
+      </w:r>
+      <w:r>
+        <w:t xml:space="preserve">summarizes the per-seed</w:t>
+      </w:r>
+      <w:r>
+        <w:t xml:space="preserve"> </w:t>
+      </w:r>
+      <m:oMath>
+        <m:r>
+          <m:rPr>
+            <m:sty m:val="p"/>
+          </m:rPr>
+          <m:t>Δ</m:t>
+        </m:r>
+        <m:r>
+          <m:rPr>
+            <m:sty m:val="p"/>
+          </m:rPr>
+          <m:t>B</m:t>
+        </m:r>
+        <m:r>
+          <m:rPr>
+            <m:sty m:val="p"/>
+          </m:rPr>
+          <m:t>I</m:t>
+        </m:r>
+        <m:r>
+          <m:rPr>
+            <m:sty m:val="p"/>
+          </m:rPr>
+          <m:t>C</m:t>
+        </m:r>
+      </m:oMath>
+      <w:r>
+        <w:t xml:space="preserve"> </w:t>
+      </w:r>
+      <w:r>
+        <w:t xml:space="preserve">trajectory, mean and sample standard deviation (</w:t>
+      </w:r>
+      <m:oMath>
+        <m:r>
+          <m:t>s</m:t>
+        </m:r>
+      </m:oMath>
+      <w:r>
+        <w:t xml:space="preserve">,</w:t>
+      </w:r>
+      <w:r>
+        <w:t xml:space="preserve"> </w:t>
+      </w:r>
+      <m:oMath>
+        <m:r>
+          <m:rPr>
+            <m:sty m:val="p"/>
+          </m:rPr>
+          <m:t>d</m:t>
+        </m:r>
+        <m:r>
+          <m:rPr>
+            <m:sty m:val="p"/>
+          </m:rPr>
+          <m:t>d</m:t>
+        </m:r>
+        <m:r>
+          <m:rPr>
+            <m:sty m:val="p"/>
+          </m:rPr>
+          <m:t>o</m:t>
+        </m:r>
+        <m:r>
+          <m:rPr>
+            <m:sty m:val="p"/>
+          </m:rPr>
+          <m:t>f</m:t>
+        </m:r>
+        <m:r>
+          <m:rPr>
+            <m:sty m:val="p"/>
+          </m:rPr>
+          <m:t>=</m:t>
+        </m:r>
+        <m:r>
+          <m:t>1</m:t>
+        </m:r>
+      </m:oMath>
+      <w:r>
+        <w:t xml:space="preserve">), penalty-free fit advantage (</w:t>
+      </w:r>
+      <m:oMath>
+        <m:bar>
+          <m:barPr>
+            <m:pos m:val="top"/>
+          </m:barPr>
+          <m:e>
+            <m:r>
+              <m:rPr>
+                <m:sty m:val="p"/>
+              </m:rPr>
+              <m:t>Δ</m:t>
+            </m:r>
+            <m:r>
+              <m:t>D</m:t>
+            </m:r>
+            <m:r>
+              <m:rPr>
+                <m:sty m:val="p"/>
+              </m:rPr>
+              <m:t>+</m:t>
+            </m:r>
+            <m:r>
+              <m:rPr>
+                <m:sty m:val="p"/>
+              </m:rPr>
+              <m:t>Δ</m:t>
+            </m:r>
+            <m:r>
+              <m:t>k</m:t>
+            </m:r>
+            <m:r>
+              <m:rPr>
+                <m:sty m:val="p"/>
+              </m:rPr>
+              <m:t>ln</m:t>
+            </m:r>
+            <m:r>
+              <m:t>N</m:t>
+            </m:r>
+          </m:e>
+        </m:bar>
+      </m:oMath>
+      <w:r>
+        <w:t xml:space="preserve">), and verdict breakdown.</w:t>
+      </w:r>
+    </w:p>
+    <w:p>
+      <w:pPr>
+        <w:pStyle w:val="Heading2"/>
+      </w:pPr>
+      <w:bookmarkStart w:id="46" w:name="_aeab06b30f25f3bb0fa1dfd349963e49e4c4e1e"/>
+      <w:r>
+        <w:t xml:space="preserve">Taxonomy Cross-Misspecification Safety Audit</w:t>
+      </w:r>
+      <w:bookmarkEnd w:id="46"/>
+    </w:p>
+    <w:p>
+      <w:pPr>
+        <w:pStyle w:val="FirstParagraph"/>
+      </w:pPr>
+      <w:r>
+        <w:t xml:space="preserve">To verify that the phenomenon-specific taxonomy prior does not induce false discoveries when misspecified, each scenario was evaluated under its true physical taxonomy key and two intentionally mismatched keys that exclude the ground-truth primitive family. As shown in Table </w:t>
+      </w:r>
+      <w:hyperlink w:anchor="_f8ad36e330f8a58a9c9501d3fcb2d4acfc4373c">
+        <w:r>
+          <w:rPr>
+            <w:rStyle w:val="Hyperlink"/>
+          </w:rPr>
+          <w:t xml:space="preserve">[tab:app_misspec]</w:t>
+        </w:r>
+      </w:hyperlink>
+      <w:r>
+        <w:t xml:space="preserve">, all six misspecified trials returned</w:t>
+      </w:r>
+      <w:r>
+        <w:t xml:space="preserve"> </w:t>
+      </w:r>
+      <w:r>
+        <w:rPr>
+          <w:b/>
+          <w:bCs/>
+        </w:rPr>
+        <w:t xml:space="preserve">WITHHELD</w:t>
+      </w:r>
+      <w:r>
+        <w:t xml:space="preserve"> </w:t>
+      </w:r>
+      <w:r>
+        <w:t xml:space="preserve">(</w:t>
+      </w:r>
+      <m:oMath>
+        <m:r>
+          <m:t>0</m:t>
+        </m:r>
+        <m:r>
+          <m:rPr>
+            <m:sty m:val="p"/>
+          </m:rPr>
+          <m:t>%</m:t>
+        </m:r>
+      </m:oMath>
+      <w:r>
+        <w:t xml:space="preserve"> </w:t>
+      </w:r>
+      <w:r>
+        <w:t xml:space="preserve">false discovery rate): when the true primitive family is absent from the domain prior, the unrestricted ablation search outperforms the misspecified domain search (</w:t>
+      </w:r>
+      <m:oMath>
+        <m:r>
+          <m:rPr>
+            <m:sty m:val="p"/>
+          </m:rPr>
+          <m:t>Δ</m:t>
+        </m:r>
+        <m:r>
+          <m:rPr>
+            <m:sty m:val="p"/>
+          </m:rPr>
+          <m:t>B</m:t>
+        </m:r>
+        <m:r>
+          <m:rPr>
+            <m:sty m:val="p"/>
+          </m:rPr>
+          <m:t>I</m:t>
+        </m:r>
+        <m:r>
+          <m:rPr>
+            <m:sty m:val="p"/>
+          </m:rPr>
+          <m:t>C</m:t>
+        </m:r>
+        <m:r>
+          <m:rPr>
+            <m:sty m:val="p"/>
+          </m:rPr>
+          <m:t>∈</m:t>
+        </m:r>
+        <m:r>
+          <m:rPr>
+            <m:sty m:val="p"/>
+          </m:rPr>
+          <m:t>[</m:t>
+        </m:r>
+        <m:r>
+          <m:rPr>
+            <m:sty m:val="p"/>
+          </m:rPr>
+          <m:t>−</m:t>
+        </m:r>
+        <m:r>
+          <m:t>1038.24</m:t>
+        </m:r>
+        <m:r>
+          <m:rPr>
+            <m:sty m:val="p"/>
+          </m:rPr>
+          <m:t>,</m:t>
+        </m:r>
+        <m:r>
+          <m:rPr>
+            <m:sty m:val="p"/>
+          </m:rPr>
+          <m:t>−</m:t>
+        </m:r>
+        <m:r>
+          <m:t>674.62</m:t>
+        </m:r>
+        <m:r>
+          <m:rPr>
+            <m:sty m:val="p"/>
+          </m:rPr>
+          <m:t>]</m:t>
+        </m:r>
+      </m:oMath>
+      <w:r>
+        <w:t xml:space="preserve"> </w:t>
+      </w:r>
+      <w:r>
+        <w:t xml:space="preserve">on identifiable scenarios), triggering conservative abstention rather than overfitting.</w:t>
+      </w:r>
+    </w:p>
+    <w:bookmarkStart w:id="101" w:name="_refs"/>
+    <w:bookmarkStart w:id="48" w:name="_4821a1adf58ef0c96a762a09b8aff3e5f2fbdd2"/>
     <w:p>
       <w:pPr>
         <w:pStyle w:val="Bibliography"/>
@@ -10663,7 +11825,7 @@
       <w:r>
         <w:t xml:space="preserve"> </w:t>
       </w:r>
-      <w:hyperlink r:id="rId52">
+      <w:hyperlink r:id="rId47">
         <w:r>
           <w:rPr>
             <w:rStyle w:val="Hyperlink"/>
@@ -10675,8 +11837,8 @@
         <w:t xml:space="preserve">.</w:t>
       </w:r>
     </w:p>
-    <w:bookmarkEnd w:id="53"/>
-    <w:bookmarkStart w:id="55" w:name="_972595d462a57f288069c0989f06ae98b9776ca"/>
+    <w:bookmarkEnd w:id="48"/>
+    <w:bookmarkStart w:id="50" w:name="_972595d462a57f288069c0989f06ae98b9776ca"/>
     <w:p>
       <w:pPr>
         <w:pStyle w:val="Bibliography"/>
@@ -10710,7 +11872,7 @@
       <w:r>
         <w:t xml:space="preserve"> </w:t>
       </w:r>
-      <w:hyperlink r:id="rId54">
+      <w:hyperlink r:id="rId49">
         <w:r>
           <w:rPr>
             <w:rStyle w:val="Hyperlink"/>
@@ -10722,8 +11884,8 @@
         <w:t xml:space="preserve">.</w:t>
       </w:r>
     </w:p>
-    <w:bookmarkEnd w:id="55"/>
-    <w:bookmarkStart w:id="56" w:name="_5a7bf24f795849e5e5e3120cac41566a0db05ce"/>
+    <w:bookmarkEnd w:id="50"/>
+    <w:bookmarkStart w:id="51" w:name="_5a7bf24f795849e5e5e3120cac41566a0db05ce"/>
     <w:p>
       <w:pPr>
         <w:pStyle w:val="Bibliography"/>
@@ -10746,8 +11908,8 @@
         <w:t xml:space="preserve">. 2nd ed. Wiley.</w:t>
       </w:r>
     </w:p>
-    <w:bookmarkEnd w:id="56"/>
-    <w:bookmarkStart w:id="58" w:name="_527bc24a5bc63163e89c9230bde2b620b0637aa"/>
+    <w:bookmarkEnd w:id="51"/>
+    <w:bookmarkStart w:id="53" w:name="_527bc24a5bc63163e89c9230bde2b620b0637aa"/>
     <w:p>
       <w:pPr>
         <w:pStyle w:val="Bibliography"/>
@@ -10781,7 +11943,7 @@
       <w:r>
         <w:t xml:space="preserve"> </w:t>
       </w:r>
-      <w:hyperlink r:id="rId57">
+      <w:hyperlink r:id="rId52">
         <w:r>
           <w:rPr>
             <w:rStyle w:val="Hyperlink"/>
@@ -10793,8 +11955,8 @@
         <w:t xml:space="preserve">.</w:t>
       </w:r>
     </w:p>
-    <w:bookmarkEnd w:id="58"/>
-    <w:bookmarkStart w:id="59" w:name="_1f20afe20d89a70b30df817a6a432dd3d531798"/>
+    <w:bookmarkEnd w:id="53"/>
+    <w:bookmarkStart w:id="54" w:name="_1f20afe20d89a70b30df817a6a432dd3d531798"/>
     <w:p>
       <w:pPr>
         <w:pStyle w:val="Bibliography"/>
@@ -10826,8 +11988,8 @@
         <w:t xml:space="preserve">95 (3): 759–71.</w:t>
       </w:r>
     </w:p>
-    <w:bookmarkEnd w:id="59"/>
-    <w:bookmarkStart w:id="61" w:name="_1aa4da2289bc40a24eeb1e679cede6f8870fdd8"/>
+    <w:bookmarkEnd w:id="54"/>
+    <w:bookmarkStart w:id="56" w:name="_1aa4da2289bc40a24eeb1e679cede6f8870fdd8"/>
     <w:p>
       <w:pPr>
         <w:pStyle w:val="Bibliography"/>
@@ -10870,7 +12032,7 @@
       <w:r>
         <w:t xml:space="preserve"> </w:t>
       </w:r>
-      <w:hyperlink r:id="rId60">
+      <w:hyperlink r:id="rId55">
         <w:r>
           <w:rPr>
             <w:rStyle w:val="Hyperlink"/>
@@ -10882,8 +12044,8 @@
         <w:t xml:space="preserve">.</w:t>
       </w:r>
     </w:p>
-    <w:bookmarkEnd w:id="61"/>
-    <w:bookmarkStart w:id="63" w:name="_47fce09a41d36943dba5ee88797fd7a28ead209"/>
+    <w:bookmarkEnd w:id="56"/>
+    <w:bookmarkStart w:id="58" w:name="_47fce09a41d36943dba5ee88797fd7a28ead209"/>
     <w:p>
       <w:pPr>
         <w:pStyle w:val="Bibliography"/>
@@ -10926,7 +12088,7 @@
       <w:r>
         <w:t xml:space="preserve"> </w:t>
       </w:r>
-      <w:hyperlink r:id="rId62">
+      <w:hyperlink r:id="rId57">
         <w:r>
           <w:rPr>
             <w:rStyle w:val="Hyperlink"/>
@@ -10938,8 +12100,8 @@
         <w:t xml:space="preserve">.</w:t>
       </w:r>
     </w:p>
-    <w:bookmarkEnd w:id="63"/>
-    <w:bookmarkStart w:id="65" w:name="_57bb1749bce326fa5cfd4da4d6d25d6b6384540"/>
+    <w:bookmarkEnd w:id="58"/>
+    <w:bookmarkStart w:id="60" w:name="_57bb1749bce326fa5cfd4da4d6d25d6b6384540"/>
     <w:p>
       <w:pPr>
         <w:pStyle w:val="Bibliography"/>
@@ -11006,7 +12168,7 @@
       <w:r>
         <w:t xml:space="preserve"> </w:t>
       </w:r>
-      <w:hyperlink r:id="rId64">
+      <w:hyperlink r:id="rId59">
         <w:r>
           <w:rPr>
             <w:rStyle w:val="Hyperlink"/>
@@ -11018,8 +12180,8 @@
         <w:t xml:space="preserve">.</w:t>
       </w:r>
     </w:p>
-    <w:bookmarkEnd w:id="65"/>
-    <w:bookmarkStart w:id="66" w:name="_3dffa07bf7d9f10c2c4fc62ba3207e235802136"/>
+    <w:bookmarkEnd w:id="60"/>
+    <w:bookmarkStart w:id="61" w:name="_3dffa07bf7d9f10c2c4fc62ba3207e235802136"/>
     <w:p>
       <w:pPr>
         <w:pStyle w:val="Bibliography"/>
@@ -11051,8 +12213,8 @@
         <w:t xml:space="preserve">33: 17429–42.</w:t>
       </w:r>
     </w:p>
-    <w:bookmarkEnd w:id="66"/>
-    <w:bookmarkStart w:id="67" w:name="_5baff60950e3fd28de2def13fedece90097bde2"/>
+    <w:bookmarkEnd w:id="61"/>
+    <w:bookmarkStart w:id="62" w:name="_5baff60950e3fd28de2def13fedece90097bde2"/>
     <w:p>
       <w:pPr>
         <w:pStyle w:val="Bibliography"/>
@@ -11090,8 +12252,8 @@
         <w:t xml:space="preserve">24: 185–206.</w:t>
       </w:r>
     </w:p>
-    <w:bookmarkEnd w:id="67"/>
-    <w:bookmarkStart w:id="69" w:name="_54fc4244cf878bc882c58757acab17cf0f1de4b"/>
+    <w:bookmarkEnd w:id="62"/>
+    <w:bookmarkStart w:id="64" w:name="_54fc4244cf878bc882c58757acab17cf0f1de4b"/>
     <w:p>
       <w:pPr>
         <w:pStyle w:val="Bibliography"/>
@@ -11131,7 +12293,7 @@
       <w:r>
         <w:t xml:space="preserve"> </w:t>
       </w:r>
-      <w:hyperlink r:id="rId68">
+      <w:hyperlink r:id="rId63">
         <w:r>
           <w:rPr>
             <w:rStyle w:val="Hyperlink"/>
@@ -11143,8 +12305,8 @@
         <w:t xml:space="preserve">.</w:t>
       </w:r>
     </w:p>
-    <w:bookmarkEnd w:id="69"/>
-    <w:bookmarkStart w:id="71" w:name="_6d9de38ad2303b748f9514fcc69957dc59bffcf"/>
+    <w:bookmarkEnd w:id="64"/>
+    <w:bookmarkStart w:id="66" w:name="_6d9de38ad2303b748f9514fcc69957dc59bffcf"/>
     <w:p>
       <w:pPr>
         <w:pStyle w:val="Bibliography"/>
@@ -11176,7 +12338,7 @@
       <w:r>
         <w:t xml:space="preserve"> </w:t>
       </w:r>
-      <w:hyperlink r:id="rId70">
+      <w:hyperlink r:id="rId65">
         <w:r>
           <w:rPr>
             <w:rStyle w:val="Hyperlink"/>
@@ -11188,8 +12350,8 @@
         <w:t xml:space="preserve">.</w:t>
       </w:r>
     </w:p>
-    <w:bookmarkEnd w:id="71"/>
-    <w:bookmarkStart w:id="73" w:name="_7d626b01f070f825f964e2471844a68b8b1a8c0"/>
+    <w:bookmarkEnd w:id="66"/>
+    <w:bookmarkStart w:id="68" w:name="_7d626b01f070f825f964e2471844a68b8b1a8c0"/>
     <w:p>
       <w:pPr>
         <w:pStyle w:val="Bibliography"/>
@@ -11223,7 +12385,7 @@
       <w:r>
         <w:t xml:space="preserve"> </w:t>
       </w:r>
-      <w:hyperlink r:id="rId72">
+      <w:hyperlink r:id="rId67">
         <w:r>
           <w:rPr>
             <w:rStyle w:val="Hyperlink"/>
@@ -11235,8 +12397,8 @@
         <w:t xml:space="preserve">.</w:t>
       </w:r>
     </w:p>
-    <w:bookmarkEnd w:id="73"/>
-    <w:bookmarkStart w:id="75" w:name="_67d140581bebbd7107a285497e887c8d9f7aade"/>
+    <w:bookmarkEnd w:id="68"/>
+    <w:bookmarkStart w:id="70" w:name="_67d140581bebbd7107a285497e887c8d9f7aade"/>
     <w:p>
       <w:pPr>
         <w:pStyle w:val="Bibliography"/>
@@ -11270,7 +12432,7 @@
       <w:r>
         <w:t xml:space="preserve"> </w:t>
       </w:r>
-      <w:hyperlink r:id="rId74">
+      <w:hyperlink r:id="rId69">
         <w:r>
           <w:rPr>
             <w:rStyle w:val="Hyperlink"/>
@@ -11282,8 +12444,8 @@
         <w:t xml:space="preserve">.</w:t>
       </w:r>
     </w:p>
-    <w:bookmarkEnd w:id="75"/>
-    <w:bookmarkStart w:id="77" w:name="_d05e573060570526385b447eaf9f72b7345eb82"/>
+    <w:bookmarkEnd w:id="70"/>
+    <w:bookmarkStart w:id="72" w:name="_d05e573060570526385b447eaf9f72b7345eb82"/>
     <w:p>
       <w:pPr>
         <w:pStyle w:val="Bibliography"/>
@@ -11317,7 +12479,7 @@
       <w:r>
         <w:t xml:space="preserve"> </w:t>
       </w:r>
-      <w:hyperlink r:id="rId76">
+      <w:hyperlink r:id="rId71">
         <w:r>
           <w:rPr>
             <w:rStyle w:val="Hyperlink"/>
@@ -11329,8 +12491,8 @@
         <w:t xml:space="preserve">.</w:t>
       </w:r>
     </w:p>
-    <w:bookmarkEnd w:id="77"/>
-    <w:bookmarkStart w:id="79" w:name="_1900e79b43a611181bec25bb8fa080110cfe3b3"/>
+    <w:bookmarkEnd w:id="72"/>
+    <w:bookmarkStart w:id="74" w:name="_1900e79b43a611181bec25bb8fa080110cfe3b3"/>
     <w:p>
       <w:pPr>
         <w:pStyle w:val="Bibliography"/>
@@ -11364,7 +12526,7 @@
       <w:r>
         <w:t xml:space="preserve"> </w:t>
       </w:r>
-      <w:hyperlink r:id="rId78">
+      <w:hyperlink r:id="rId73">
         <w:r>
           <w:rPr>
             <w:rStyle w:val="Hyperlink"/>
@@ -11376,8 +12538,8 @@
         <w:t xml:space="preserve">.</w:t>
       </w:r>
     </w:p>
-    <w:bookmarkEnd w:id="79"/>
-    <w:bookmarkStart w:id="81" w:name="_706d685f658d8e4e7854a745bc539622c68d316"/>
+    <w:bookmarkEnd w:id="74"/>
+    <w:bookmarkStart w:id="76" w:name="_706d685f658d8e4e7854a745bc539622c68d316"/>
     <w:p>
       <w:pPr>
         <w:pStyle w:val="Bibliography"/>
@@ -11411,7 +12573,7 @@
       <w:r>
         <w:t xml:space="preserve"> </w:t>
       </w:r>
-      <w:hyperlink r:id="rId80">
+      <w:hyperlink r:id="rId75">
         <w:r>
           <w:rPr>
             <w:rStyle w:val="Hyperlink"/>
@@ -11423,8 +12585,8 @@
         <w:t xml:space="preserve">.</w:t>
       </w:r>
     </w:p>
-    <w:bookmarkEnd w:id="81"/>
-    <w:bookmarkStart w:id="83" w:name="_111554707e6767316c8b5ff11c385e98243c247"/>
+    <w:bookmarkEnd w:id="76"/>
+    <w:bookmarkStart w:id="78" w:name="_111554707e6767316c8b5ff11c385e98243c247"/>
     <w:p>
       <w:pPr>
         <w:pStyle w:val="Bibliography"/>
@@ -11458,7 +12620,7 @@
       <w:r>
         <w:t xml:space="preserve"> </w:t>
       </w:r>
-      <w:hyperlink r:id="rId82">
+      <w:hyperlink r:id="rId77">
         <w:r>
           <w:rPr>
             <w:rStyle w:val="Hyperlink"/>
@@ -11470,8 +12632,8 @@
         <w:t xml:space="preserve">.</w:t>
       </w:r>
     </w:p>
-    <w:bookmarkEnd w:id="83"/>
-    <w:bookmarkStart w:id="84" w:name="_3eeecacc9a76ececfb93de6eecd116041e12250"/>
+    <w:bookmarkEnd w:id="78"/>
+    <w:bookmarkStart w:id="79" w:name="_3eeecacc9a76ececfb93de6eecd116041e12250"/>
     <w:p>
       <w:pPr>
         <w:pStyle w:val="Bibliography"/>
@@ -11494,8 +12656,8 @@
         <w:t xml:space="preserve">. MIT Press.</w:t>
       </w:r>
     </w:p>
-    <w:bookmarkEnd w:id="84"/>
-    <w:bookmarkStart w:id="85" w:name="_487adff8243fba59e6cf717edc54005140a48bd"/>
+    <w:bookmarkEnd w:id="79"/>
+    <w:bookmarkStart w:id="80" w:name="_487adff8243fba59e6cf717edc54005140a48bd"/>
     <w:p>
       <w:pPr>
         <w:pStyle w:val="Bibliography"/>
@@ -11524,8 +12686,8 @@
         <w:t xml:space="preserve">.</w:t>
       </w:r>
     </w:p>
-    <w:bookmarkEnd w:id="85"/>
-    <w:bookmarkStart w:id="87" w:name="_91b59947130ffdd5d02deab777df77813338c35"/>
+    <w:bookmarkEnd w:id="80"/>
+    <w:bookmarkStart w:id="82" w:name="_91b59947130ffdd5d02deab777df77813338c35"/>
     <w:p>
       <w:pPr>
         <w:pStyle w:val="Bibliography"/>
@@ -11559,7 +12721,7 @@
       <w:r>
         <w:t xml:space="preserve"> </w:t>
       </w:r>
-      <w:hyperlink r:id="rId86">
+      <w:hyperlink r:id="rId81">
         <w:r>
           <w:rPr>
             <w:rStyle w:val="Hyperlink"/>
@@ -11571,8 +12733,8 @@
         <w:t xml:space="preserve">.</w:t>
       </w:r>
     </w:p>
-    <w:bookmarkEnd w:id="87"/>
-    <w:bookmarkStart w:id="88" w:name="_97fe74aee6e1866024e3578107d1a9db6ca039d"/>
+    <w:bookmarkEnd w:id="82"/>
+    <w:bookmarkStart w:id="83" w:name="_97fe74aee6e1866024e3578107d1a9db6ca039d"/>
     <w:p>
       <w:pPr>
         <w:pStyle w:val="Bibliography"/>
@@ -11604,8 +12766,8 @@
         <w:t xml:space="preserve">26: 1–83.</w:t>
       </w:r>
     </w:p>
-    <w:bookmarkEnd w:id="88"/>
-    <w:bookmarkStart w:id="90" w:name="_ef604ae533fad333bc697748e3dc0fd28f0aa78"/>
+    <w:bookmarkEnd w:id="83"/>
+    <w:bookmarkStart w:id="85" w:name="_ef604ae533fad333bc697748e3dc0fd28f0aa78"/>
     <w:p>
       <w:pPr>
         <w:pStyle w:val="Bibliography"/>
@@ -11636,7 +12798,7 @@
       <w:r>
         <w:t xml:space="preserve"> </w:t>
       </w:r>
-      <w:hyperlink r:id="rId89">
+      <w:hyperlink r:id="rId84">
         <w:r>
           <w:rPr>
             <w:rStyle w:val="Hyperlink"/>
@@ -11648,8 +12810,8 @@
         <w:t xml:space="preserve">.</w:t>
       </w:r>
     </w:p>
-    <w:bookmarkEnd w:id="90"/>
-    <w:bookmarkStart w:id="92" w:name="_457df0eb6f3cee80a45c4fff61dc37b0f5cd9b1"/>
+    <w:bookmarkEnd w:id="85"/>
+    <w:bookmarkStart w:id="87" w:name="_457df0eb6f3cee80a45c4fff61dc37b0f5cd9b1"/>
     <w:p>
       <w:pPr>
         <w:pStyle w:val="Bibliography"/>
@@ -11683,7 +12845,7 @@
       <w:r>
         <w:t xml:space="preserve"> </w:t>
       </w:r>
-      <w:hyperlink r:id="rId91">
+      <w:hyperlink r:id="rId86">
         <w:r>
           <w:rPr>
             <w:rStyle w:val="Hyperlink"/>
@@ -11695,8 +12857,8 @@
         <w:t xml:space="preserve">.</w:t>
       </w:r>
     </w:p>
-    <w:bookmarkEnd w:id="92"/>
-    <w:bookmarkStart w:id="94" w:name="_224126058e881b11118696e484baee7c8dbe6db"/>
+    <w:bookmarkEnd w:id="87"/>
+    <w:bookmarkStart w:id="89" w:name="_224126058e881b11118696e484baee7c8dbe6db"/>
     <w:p>
       <w:pPr>
         <w:pStyle w:val="Bibliography"/>
@@ -11730,7 +12892,7 @@
       <w:r>
         <w:t xml:space="preserve"> </w:t>
       </w:r>
-      <w:hyperlink r:id="rId93">
+      <w:hyperlink r:id="rId88">
         <w:r>
           <w:rPr>
             <w:rStyle w:val="Hyperlink"/>
@@ -11742,8 +12904,8 @@
         <w:t xml:space="preserve">.</w:t>
       </w:r>
     </w:p>
-    <w:bookmarkEnd w:id="94"/>
-    <w:bookmarkStart w:id="96" w:name="_1717fb37a54aa1a40df471b2975d2fd09729c85"/>
+    <w:bookmarkEnd w:id="89"/>
+    <w:bookmarkStart w:id="91" w:name="_1717fb37a54aa1a40df471b2975d2fd09729c85"/>
     <w:p>
       <w:pPr>
         <w:pStyle w:val="Bibliography"/>
@@ -11777,7 +12939,7 @@
       <w:r>
         <w:t xml:space="preserve"> </w:t>
       </w:r>
-      <w:hyperlink r:id="rId95">
+      <w:hyperlink r:id="rId90">
         <w:r>
           <w:rPr>
             <w:rStyle w:val="Hyperlink"/>
@@ -11789,8 +12951,8 @@
         <w:t xml:space="preserve">.</w:t>
       </w:r>
     </w:p>
-    <w:bookmarkEnd w:id="96"/>
-    <w:bookmarkStart w:id="98" w:name="_8b25f64435fc5ff192d03ffcdc0af37daecff02"/>
+    <w:bookmarkEnd w:id="91"/>
+    <w:bookmarkStart w:id="93" w:name="_8b25f64435fc5ff192d03ffcdc0af37daecff02"/>
     <w:p>
       <w:pPr>
         <w:pStyle w:val="Bibliography"/>
@@ -11842,7 +13004,7 @@
       <w:r>
         <w:t xml:space="preserve"> </w:t>
       </w:r>
-      <w:hyperlink r:id="rId97">
+      <w:hyperlink r:id="rId92">
         <w:r>
           <w:rPr>
             <w:rStyle w:val="Hyperlink"/>
@@ -11854,8 +13016,8 @@
         <w:t xml:space="preserve">.</w:t>
       </w:r>
     </w:p>
-    <w:bookmarkEnd w:id="98"/>
-    <w:bookmarkStart w:id="100" w:name="_087162fecb529c26266ceb922b457ce775002f4"/>
+    <w:bookmarkEnd w:id="93"/>
+    <w:bookmarkStart w:id="95" w:name="_087162fecb529c26266ceb922b457ce775002f4"/>
     <w:p>
       <w:pPr>
         <w:pStyle w:val="Bibliography"/>
@@ -11889,7 +13051,7 @@
       <w:r>
         <w:t xml:space="preserve"> </w:t>
       </w:r>
-      <w:hyperlink r:id="rId99">
+      <w:hyperlink r:id="rId94">
         <w:r>
           <w:rPr>
             <w:rStyle w:val="Hyperlink"/>
@@ -11901,8 +13063,8 @@
         <w:t xml:space="preserve">.</w:t>
       </w:r>
     </w:p>
-    <w:bookmarkEnd w:id="100"/>
-    <w:bookmarkStart w:id="101" w:name="_7ab753a07ab1486fccf9d5891a2e9e206624fa4"/>
+    <w:bookmarkEnd w:id="95"/>
+    <w:bookmarkStart w:id="96" w:name="_7ab753a07ab1486fccf9d5891a2e9e206624fa4"/>
     <w:p>
       <w:pPr>
         <w:pStyle w:val="Bibliography"/>
@@ -11943,8 +13105,8 @@
         <w:t xml:space="preserve">33: 4860–71.</w:t>
       </w:r>
     </w:p>
-    <w:bookmarkEnd w:id="101"/>
-    <w:bookmarkStart w:id="103" w:name="_a9b2e19e299c9f94ea16f0b1c1b195864220abf"/>
+    <w:bookmarkEnd w:id="96"/>
+    <w:bookmarkStart w:id="98" w:name="_a9b2e19e299c9f94ea16f0b1c1b195864220abf"/>
     <w:p>
       <w:pPr>
         <w:pStyle w:val="Bibliography"/>
@@ -11984,7 +13146,7 @@
       <w:r>
         <w:t xml:space="preserve"> </w:t>
       </w:r>
-      <w:hyperlink r:id="rId102">
+      <w:hyperlink r:id="rId97">
         <w:r>
           <w:rPr>
             <w:rStyle w:val="Hyperlink"/>
@@ -11996,8 +13158,8 @@
         <w:t xml:space="preserve">.</w:t>
       </w:r>
     </w:p>
-    <w:bookmarkEnd w:id="103"/>
-    <w:bookmarkStart w:id="105" w:name="_a50bc08bafa126fa7b3f332668ec078da73e90d"/>
+    <w:bookmarkEnd w:id="98"/>
+    <w:bookmarkStart w:id="100" w:name="_a50bc08bafa126fa7b3f332668ec078da73e90d"/>
     <w:p>
       <w:pPr>
         <w:pStyle w:val="Bibliography"/>
@@ -12031,7 +13193,7 @@
       <w:r>
         <w:t xml:space="preserve"> </w:t>
       </w:r>
-      <w:hyperlink r:id="rId104">
+      <w:hyperlink r:id="rId99">
         <w:r>
           <w:rPr>
             <w:rStyle w:val="Hyperlink"/>
@@ -12043,8 +13205,8 @@
         <w:t xml:space="preserve">.</w:t>
       </w:r>
     </w:p>
-    <w:bookmarkEnd w:id="105"/>
-    <w:bookmarkEnd w:id="106"/>
+    <w:bookmarkEnd w:id="100"/>
+    <w:bookmarkEnd w:id="101"/>
     <w:sectPr>
       <w:footnotePr>
         <w:numRestart w:val="eachSect"/>
@@ -12089,7 +13251,21 @@
         <w:t xml:space="preserve"> </w:t>
       </w:r>
       <w:r>
-        <w:t xml:space="preserve">Full rebuttal tables are available at</w:t>
+        <w:t xml:space="preserve">Full supplementary audit tables are provided in Appendix </w:t>
+      </w:r>
+      <w:hyperlink w:anchor="_9b40800e8feb46890226241ebd494fa63023e1c">
+        <w:r>
+          <w:rPr>
+            <w:rStyle w:val="Hyperlink"/>
+          </w:rPr>
+          <w:t xml:space="preserve">7</w:t>
+        </w:r>
+      </w:hyperlink>
+      <w:r>
+        <w:t xml:space="preserve"> </w:t>
+      </w:r>
+      <w:r>
+        <w:t xml:space="preserve">and at</w:t>
       </w:r>
       <w:r>
         <w:t xml:space="preserve"> </w:t>
@@ -12107,7 +13283,7 @@
       </w:r>
     </w:p>
   </w:footnote>
-  <w:footnote w:id="41">
+  <w:footnote w:id="32">
     <w:p>
       <w:pPr>
         <w:pStyle w:val="FootnoteText"/>

</xml_diff>

<commit_message>
fix: align benchmark control target primitive fallback and clarify Table 9 PC caption
</commit_message>
<xml_diff>
--- a/paper/main.docx
+++ b/paper/main.docx
@@ -5737,13 +5737,13 @@
         <w:t xml:space="preserve"> </w:t>
       </w:r>
       <w:r>
-        <w:t xml:space="preserve">The ground truth is never supplied to the pipeline; only noisy observations,</w:t>
-      </w:r>
-      <w:r>
-        <w:t xml:space="preserve"> </w:t>
-      </w:r>
-      <w:r>
-        <w:t xml:space="preserve">classical predictions, dimensional variable definitions, and the taxonomy key are provided.</w:t>
+        <w:t xml:space="preserve">The ground truth is never supplied to the blind discovery search (only noisy observations, classical</w:t>
+      </w:r>
+      <w:r>
+        <w:t xml:space="preserve"> </w:t>
+      </w:r>
+      <w:r>
+        <w:t xml:space="preserve">predictions, dimensional definitions, and the taxonomy key are provided; the target family is referenced only in benchmark controls).</w:t>
       </w:r>
     </w:p>
     <w:bookmarkStart w:id="27" w:name="_f9c4f5d1c9390fcbc5694b2fe95fabd219271c8"/>

</xml_diff>

<commit_message>
paper: refine SD/noise-floor stats, gate descriptions, and bibliography (kramer2026, makke2024)
</commit_message>
<xml_diff>
--- a/paper/main.docx
+++ b/paper/main.docx
@@ -177,7 +177,7 @@
         <w:t xml:space="preserve"> </w:t>
       </w:r>
       <w:r>
-        <w:t xml:space="preserve">On three canonical scenarios at historical low-signal windows, Screened Coulomb</w:t>
+        <w:t xml:space="preserve">On three canonical scenarios at restricted low-signal windows, Screened Coulomb</w:t>
       </w:r>
       <w:r>
         <w:t xml:space="preserve"> </w:t>
@@ -221,7 +221,7 @@
         </m:r>
       </m:oMath>
       <w:r>
-        <w:t xml:space="preserve">, exact symbolic match) and Entropy Expansion</w:t>
+        <w:t xml:space="preserve">, exact match) and Entropy Expansion</w:t>
       </w:r>
       <w:r>
         <w:t xml:space="preserve"> </w:t>
@@ -265,7 +265,7 @@
         </m:r>
       </m:oMath>
       <w:r>
-        <w:t xml:space="preserve">, class-level match) are IDENTIFIABLE;</w:t>
+        <w:t xml:space="preserve">, class-level, parsimony-driven; 2/5 seeds) are IDENTIFIABLE;</w:t>
       </w:r>
       <w:r>
         <w:t xml:space="preserve"> </w:t>
@@ -297,33 +297,45 @@
         <w:t xml:space="preserve"> </w:t>
       </w:r>
       <w:r>
-        <w:t xml:space="preserve">is WITHHELD because the</w:t>
-      </w:r>
-      <w:r>
-        <w:t xml:space="preserve"> </w:t>
-      </w:r>
-      <m:oMath>
-        <m:r>
-          <m:t>4.8</m:t>
-        </m:r>
-        <m:r>
-          <m:rPr>
-            <m:sty m:val="p"/>
-          </m:rPr>
-          <m:t>%</m:t>
-        </m:r>
-      </m:oMath>
-      <w:r>
-        <w:t xml:space="preserve"> </w:t>
-      </w:r>
-      <w:r>
-        <w:t xml:space="preserve">correction is</w:t>
-      </w:r>
-      <w:r>
-        <w:t xml:space="preserve"> </w:t>
-      </w:r>
-      <w:r>
-        <w:t xml:space="preserve">indistinguishable from 1% noise—the intended, epistemically honest behavior.</w:t>
+        <w:t xml:space="preserve">is WITHHELD because its observational noise floor (</w:t>
+      </w:r>
+      <m:oMath>
+        <m:r>
+          <m:rPr>
+            <m:sty m:val="p"/>
+          </m:rPr>
+          <m:t>N</m:t>
+        </m:r>
+        <m:r>
+          <m:rPr>
+            <m:sty m:val="p"/>
+          </m:rPr>
+          <m:t>M</m:t>
+        </m:r>
+        <m:r>
+          <m:rPr>
+            <m:sty m:val="p"/>
+          </m:rPr>
+          <m:t>S</m:t>
+        </m:r>
+        <m:r>
+          <m:rPr>
+            <m:sty m:val="p"/>
+          </m:rPr>
+          <m:t>E</m:t>
+        </m:r>
+        <m:r>
+          <m:rPr>
+            <m:sty m:val="p"/>
+          </m:rPr>
+          <m:t>≈</m:t>
+        </m:r>
+        <m:r>
+          <m:t>0.41</m:t>
+        </m:r>
+      </m:oMath>
+      <w:r>
+        <w:t xml:space="preserve">) exceeds the positive-control threshold—the intended, epistemically honest behavior.</w:t>
       </w:r>
       <w:r>
         <w:t xml:space="preserve"> </w:t>
@@ -524,13 +536,13 @@
         <w:t xml:space="preserve">stochastic irreproducibility</w:t>
       </w:r>
       <w:r>
-        <w:t xml:space="preserve">: evolutionary search cannot guarantee</w:t>
-      </w:r>
-      <w:r>
-        <w:t xml:space="preserve"> </w:t>
-      </w:r>
-      <w:r>
-        <w:t xml:space="preserve">byte-identical results across runs </w:t>
+        <w:t xml:space="preserve">: default evolutionary search does not guarantee</w:t>
+      </w:r>
+      <w:r>
+        <w:t xml:space="preserve"> </w:t>
+      </w:r>
+      <w:r>
+        <w:t xml:space="preserve">byte-identical results across runs without serial execution </w:t>
       </w:r>
       <w:r>
         <w:t xml:space="preserve">(Bongard and Lipson 2007; Schmidt and Lipson 2009)</w:t>
@@ -1536,7 +1548,7 @@
         <w:t xml:space="preserve"> </w:t>
       </w:r>
       <w:r>
-        <w:t xml:space="preserve">identity, eliminating catastrophic cancellation.</w:t>
+        <w:t xml:space="preserve">identity by construction, while rationalizing subtraction-prone forms against catastrophic cancellation.</w:t>
       </w:r>
       <w:r>
         <w:t xml:space="preserve"> </w:t>
@@ -1674,7 +1686,7 @@
         <w:t xml:space="preserve">float64</w:t>
       </w:r>
       <w:r>
-        <w:t xml:space="preserve">; the regularized form</w:t>
+        <w:t xml:space="preserve">; the rationalized form</w:t>
       </w:r>
       <w:r>
         <w:t xml:space="preserve"> </w:t>
@@ -3726,7 +3738,7 @@
         <w:t xml:space="preserve"> </w:t>
       </w:r>
       <w:r>
-        <w:t xml:space="preserve">wrong-taxonomy trials the system returned WITHHELD (0% false discovery rate;</w:t>
+        <w:t xml:space="preserve">wrong-taxonomy trials the system returned WITHHELD (0/6 false discoveries;</w:t>
       </w:r>
       <w:r>
         <w:t xml:space="preserve"> </w:t>
@@ -4518,7 +4530,7 @@
         <w:t xml:space="preserve"> </w:t>
       </w:r>
       <w:r>
-        <w:t xml:space="preserve">All gates (Table </w:t>
+        <w:t xml:space="preserve">Gates 1–3 (Table </w:t>
       </w:r>
       <w:hyperlink w:anchor="_34fafeaa229659bea99805a2379672a37a5826b">
         <w:r>
@@ -4529,7 +4541,7 @@
         </w:r>
       </w:hyperlink>
       <w:r>
-        <w:t xml:space="preserve">) are evaluated on the</w:t>
+        <w:t xml:space="preserve">) inspect the symbolic</w:t>
       </w:r>
       <w:r>
         <w:t xml:space="preserve"> </w:t>
@@ -4545,12 +4557,21 @@
         <w:t xml:space="preserve"> </w:t>
       </w:r>
       <w:r>
-        <w:t xml:space="preserve">expression—the fully parameterized symbolic form before any</w:t>
-      </w:r>
-      <w:r>
-        <w:t xml:space="preserve"> </w:t>
-      </w:r>
-      <m:oMath>
+        <w:t xml:space="preserve">expression, treating single-variable free-scale ratios (e.g.,</w:t>
+      </w:r>
+      <w:r>
+        <w:t xml:space="preserve"> </w:t>
+      </w:r>
+      <m:oMath>
+        <m:r>
+          <m:t>r</m:t>
+        </m:r>
+        <m:r>
+          <m:rPr>
+            <m:sty m:val="p"/>
+          </m:rPr>
+          <m:t>/</m:t>
+        </m:r>
         <m:sSub>
           <m:e>
             <m:r>
@@ -4559,7 +4580,7 @@
           </m:e>
           <m:sub>
             <m:r>
-              <m:t>i</m:t>
+              <m:t>4</m:t>
             </m:r>
           </m:sub>
         </m:sSub>
@@ -4568,44 +4589,12 @@
         <w:t xml:space="preserve"> </w:t>
       </w:r>
       <w:r>
-        <w:t xml:space="preserve">is</w:t>
-      </w:r>
-      <w:r>
-        <w:t xml:space="preserve"> </w:t>
-      </w:r>
-      <w:r>
-        <w:t xml:space="preserve">assigned the value</w:t>
-      </w:r>
-      <w:r>
-        <w:t xml:space="preserve"> </w:t>
-      </w:r>
-      <m:oMath>
-        <m:r>
-          <m:t>1</m:t>
-        </m:r>
-      </m:oMath>
-      <w:r>
-        <w:t xml:space="preserve">—because early substitution collapses dimensionful scale</w:t>
-      </w:r>
-      <w:r>
-        <w:t xml:space="preserve"> </w:t>
-      </w:r>
-      <w:r>
-        <w:t xml:space="preserve">parameters (e.g.,</w:t>
-      </w:r>
-      <w:r>
-        <w:t xml:space="preserve"> </w:t>
-      </w:r>
-      <m:oMath>
-        <m:r>
-          <m:t>r</m:t>
-        </m:r>
-        <m:r>
-          <m:rPr>
-            <m:sty m:val="p"/>
-          </m:rPr>
-          <m:t>/</m:t>
-        </m:r>
+        <w:t xml:space="preserve">representing a Debye length) as dimensionally admissible because</w:t>
+      </w:r>
+      <w:r>
+        <w:t xml:space="preserve"> </w:t>
+      </w:r>
+      <m:oMath>
         <m:sSub>
           <m:e>
             <m:r>
@@ -4614,7 +4603,7 @@
           </m:e>
           <m:sub>
             <m:r>
-              <m:t>4</m:t>
+              <m:t>k</m:t>
             </m:r>
           </m:sub>
         </m:sSub>
@@ -4623,13 +4612,89 @@
         <w:t xml:space="preserve"> </w:t>
       </w:r>
       <w:r>
-        <w:t xml:space="preserve">representing a Debye length) to dimensionless</w:t>
-      </w:r>
-      <w:r>
-        <w:t xml:space="preserve"> </w:t>
-      </w:r>
-      <w:r>
-        <w:t xml:space="preserve">constants, falsifying the dimensional consistency check.</w:t>
+        <w:t xml:space="preserve">absorbs the variable’s physical scale during fitting.</w:t>
+      </w:r>
+      <w:r>
+        <w:t xml:space="preserve"> </w:t>
+      </w:r>
+      <w:r>
+        <w:t xml:space="preserve">Gate 4 evaluates the symbolic classical limit at</w:t>
+      </w:r>
+      <w:r>
+        <w:t xml:space="preserve"> </w:t>
+      </w:r>
+      <m:oMath>
+        <m:r>
+          <m:rPr>
+            <m:sty m:val="bi"/>
+          </m:rPr>
+          <m:t>θ</m:t>
+        </m:r>
+        <m:r>
+          <m:rPr>
+            <m:sty m:val="p"/>
+          </m:rPr>
+          <m:t>=</m:t>
+        </m:r>
+        <m:r>
+          <m:rPr>
+            <m:sty m:val="b"/>
+          </m:rPr>
+          <m:t>1</m:t>
+        </m:r>
+      </m:oMath>
+      <w:r>
+        <w:t xml:space="preserve"> </w:t>
+      </w:r>
+      <w:r>
+        <w:t xml:space="preserve">(deferring parametric candidates for strict post-fit re-verification at</w:t>
+      </w:r>
+      <w:r>
+        <w:t xml:space="preserve"> </w:t>
+      </w:r>
+      <m:oMath>
+        <m:acc>
+          <m:accPr>
+            <m:chr m:val="̂"/>
+          </m:accPr>
+          <m:e>
+            <m:r>
+              <m:rPr>
+                <m:sty m:val="bi"/>
+              </m:rPr>
+              <m:t>θ</m:t>
+            </m:r>
+          </m:e>
+        </m:acc>
+      </m:oMath>
+      <w:r>
+        <w:t xml:space="preserve">), and Gate 5 screens coarse numerical fitness at</w:t>
+      </w:r>
+      <w:r>
+        <w:t xml:space="preserve"> </w:t>
+      </w:r>
+      <m:oMath>
+        <m:r>
+          <m:rPr>
+            <m:sty m:val="bi"/>
+          </m:rPr>
+          <m:t>θ</m:t>
+        </m:r>
+        <m:r>
+          <m:rPr>
+            <m:sty m:val="p"/>
+          </m:rPr>
+          <m:t>=</m:t>
+        </m:r>
+        <m:r>
+          <m:rPr>
+            <m:sty m:val="b"/>
+          </m:rPr>
+          <m:t>1</m:t>
+        </m:r>
+      </m:oMath>
+      <w:r>
+        <w:t xml:space="preserve">.</w:t>
       </w:r>
     </w:p>
     <w:p>
@@ -4800,7 +4865,36 @@
               <w:jc w:val="left"/>
             </w:pPr>
             <w:r>
-              <w:t xml:space="preserve">SI base dimensions of the expression do not match the target.</w:t>
+              <w:t xml:space="preserve">SI base dimensions mismatch target (allowing free-scale</w:t>
+            </w:r>
+            <w:r>
+              <w:t xml:space="preserve"> </w:t>
+            </w:r>
+            <m:oMath>
+              <m:r>
+                <m:t>v</m:t>
+              </m:r>
+              <m:r>
+                <m:rPr>
+                  <m:sty m:val="p"/>
+                </m:rPr>
+                <m:t>/</m:t>
+              </m:r>
+              <m:sSub>
+                <m:e>
+                  <m:r>
+                    <m:t>θ</m:t>
+                  </m:r>
+                </m:e>
+                <m:sub>
+                  <m:r>
+                    <m:t>k</m:t>
+                  </m:r>
+                </m:sub>
+              </m:sSub>
+            </m:oMath>
+            <w:r>
+              <w:t xml:space="preserve">).</w:t>
             </w:r>
           </w:p>
         </w:tc>
@@ -4879,7 +4973,27 @@
               <w:t xml:space="preserve"> </w:t>
             </w:r>
             <w:r>
-              <w:t xml:space="preserve">are not dimensionless.</w:t>
+              <w:t xml:space="preserve">not dimensionless or</w:t>
+            </w:r>
+            <w:r>
+              <w:t xml:space="preserve"> </w:t>
+            </w:r>
+            <m:oMath>
+              <m:sSub>
+                <m:e>
+                  <m:r>
+                    <m:t>θ</m:t>
+                  </m:r>
+                </m:e>
+                <m:sub>
+                  <m:r>
+                    <m:t>k</m:t>
+                  </m:r>
+                </m:sub>
+              </m:sSub>
+            </m:oMath>
+            <w:r>
+              <w:t xml:space="preserve">-scaled.</w:t>
             </w:r>
           </w:p>
         </w:tc>
@@ -4905,7 +5019,57 @@
               <w:jc w:val="left"/>
             </w:pPr>
             <w:r>
-              <w:t xml:space="preserve">Symbolic limit at the classical boundary does not vanish.</w:t>
+              <w:t xml:space="preserve">Classical limit at</w:t>
+            </w:r>
+            <w:r>
+              <w:t xml:space="preserve"> </w:t>
+            </w:r>
+            <m:oMath>
+              <m:r>
+                <m:rPr>
+                  <m:sty m:val="bi"/>
+                </m:rPr>
+                <m:t>θ</m:t>
+              </m:r>
+              <m:r>
+                <m:rPr>
+                  <m:sty m:val="p"/>
+                </m:rPr>
+                <m:t>=</m:t>
+              </m:r>
+              <m:r>
+                <m:rPr>
+                  <m:sty m:val="b"/>
+                </m:rPr>
+                <m:t>1</m:t>
+              </m:r>
+            </m:oMath>
+            <w:r>
+              <w:t xml:space="preserve"> </w:t>
+            </w:r>
+            <w:r>
+              <w:t xml:space="preserve">(and post-fit</w:t>
+            </w:r>
+            <w:r>
+              <w:t xml:space="preserve"> </w:t>
+            </w:r>
+            <m:oMath>
+              <m:acc>
+                <m:accPr>
+                  <m:chr m:val="̂"/>
+                </m:accPr>
+                <m:e>
+                  <m:r>
+                    <m:rPr>
+                      <m:sty m:val="bi"/>
+                    </m:rPr>
+                    <m:t>θ</m:t>
+                  </m:r>
+                </m:e>
+              </m:acc>
+            </m:oMath>
+            <w:r>
+              <w:t xml:space="preserve">) does not vanish.</w:t>
             </w:r>
           </w:p>
         </w:tc>
@@ -8692,7 +8856,7 @@
         <w:pStyle w:val="FirstParagraph"/>
       </w:pPr>
       <w:r>
-        <w:t xml:space="preserve">At</w:t>
+        <w:t xml:space="preserve">Over</w:t>
       </w:r>
       <w:r>
         <w:t xml:space="preserve"> </w:t>
@@ -8705,14 +8869,41 @@
           <m:rPr>
             <m:sty m:val="p"/>
           </m:rPr>
-          <m:t>≤</m:t>
-        </m:r>
-        <m:r>
-          <m:t>0.3</m:t>
+          <m:t>/</m:t>
         </m:r>
         <m:r>
           <m:t>c</m:t>
         </m:r>
+        <m:r>
+          <m:rPr>
+            <m:sty m:val="p"/>
+          </m:rPr>
+          <m:t>∈</m:t>
+        </m:r>
+        <m:r>
+          <m:rPr>
+            <m:sty m:val="p"/>
+          </m:rPr>
+          <m:t>[</m:t>
+        </m:r>
+        <m:r>
+          <m:t>0.10</m:t>
+        </m:r>
+        <m:r>
+          <m:rPr>
+            <m:sty m:val="p"/>
+          </m:rPr>
+          <m:t>,</m:t>
+        </m:r>
+        <m:r>
+          <m:t>0.30</m:t>
+        </m:r>
+        <m:r>
+          <m:rPr>
+            <m:sty m:val="p"/>
+          </m:rPr>
+          <m:t>]</m:t>
+        </m:r>
       </m:oMath>
       <w:r>
         <w:t xml:space="preserve">, the Lorentz correction</w:t>
@@ -8733,6 +8924,97 @@
         <m:r>
           <m:t>1</m:t>
         </m:r>
+      </m:oMath>
+      <w:r>
+        <w:t xml:space="preserve"> </w:t>
+      </w:r>
+      <w:r>
+        <w:t xml:space="preserve">peaks at</w:t>
+      </w:r>
+      <w:r>
+        <w:t xml:space="preserve"> </w:t>
+      </w:r>
+      <m:oMath>
+        <m:r>
+          <m:t>4.8</m:t>
+        </m:r>
+        <m:r>
+          <m:rPr>
+            <m:sty m:val="p"/>
+          </m:rPr>
+          <m:t>%</m:t>
+        </m:r>
+      </m:oMath>
+      <w:r>
+        <w:t xml:space="preserve"> </w:t>
+      </w:r>
+      <w:r>
+        <w:t xml:space="preserve">with a signal standard deviation of</w:t>
+      </w:r>
+      <w:r>
+        <w:t xml:space="preserve"> </w:t>
+      </w:r>
+      <m:oMath>
+        <m:r>
+          <m:rPr>
+            <m:sty m:val="p"/>
+          </m:rPr>
+          <m:t>S</m:t>
+        </m:r>
+        <m:r>
+          <m:rPr>
+            <m:sty m:val="p"/>
+          </m:rPr>
+          <m:t>D</m:t>
+        </m:r>
+        <m:r>
+          <m:rPr>
+            <m:sty m:val="p"/>
+          </m:rPr>
+          <m:t>(</m:t>
+        </m:r>
+        <m:sSub>
+          <m:e>
+            <m:r>
+              <m:rPr>
+                <m:sty m:val="p"/>
+              </m:rPr>
+              <m:t>Δ</m:t>
+            </m:r>
+          </m:e>
+          <m:sub>
+            <m:r>
+              <m:rPr>
+                <m:sty m:val="p"/>
+              </m:rPr>
+              <m:t>t</m:t>
+            </m:r>
+            <m:r>
+              <m:rPr>
+                <m:sty m:val="p"/>
+              </m:rPr>
+              <m:t>r</m:t>
+            </m:r>
+            <m:r>
+              <m:rPr>
+                <m:sty m:val="p"/>
+              </m:rPr>
+              <m:t>u</m:t>
+            </m:r>
+            <m:r>
+              <m:rPr>
+                <m:sty m:val="p"/>
+              </m:rPr>
+              <m:t>e</m:t>
+            </m:r>
+          </m:sub>
+        </m:sSub>
+        <m:r>
+          <m:rPr>
+            <m:sty m:val="p"/>
+          </m:rPr>
+          <m:t>)</m:t>
+        </m:r>
         <m:r>
           <m:rPr>
             <m:sty m:val="p"/>
@@ -8740,7 +9022,7 @@
           <m:t>≈</m:t>
         </m:r>
         <m:r>
-          <m:t>4.8</m:t>
+          <m:t>1.25</m:t>
         </m:r>
         <m:r>
           <m:rPr>
@@ -8753,41 +9035,6 @@
         <w:t xml:space="preserve"> </w:t>
       </w:r>
       <w:r>
-        <w:t xml:space="preserve">of the classical</w:t>
-      </w:r>
-      <w:r>
-        <w:t xml:space="preserve"> </w:t>
-      </w:r>
-      <w:r>
-        <w:t xml:space="preserve">prediction—a signal-to-noise ratio of approximately</w:t>
-      </w:r>
-      <w:r>
-        <w:t xml:space="preserve"> </w:t>
-      </w:r>
-      <m:oMath>
-        <m:r>
-          <m:t>4.8</m:t>
-        </m:r>
-        <m:r>
-          <m:t>​</m:t>
-        </m:r>
-        <m:r>
-          <m:rPr>
-            <m:sty m:val="p"/>
-          </m:rPr>
-          <m:t>:</m:t>
-        </m:r>
-        <m:r>
-          <m:t>​</m:t>
-        </m:r>
-        <m:r>
-          <m:t>1</m:t>
-        </m:r>
-      </m:oMath>
-      <w:r>
-        <w:t xml:space="preserve"> </w:t>
-      </w:r>
-      <w:r>
         <w:t xml:space="preserve">against the</w:t>
       </w:r>
       <w:r>
@@ -8795,7 +9042,7 @@
       </w:r>
       <m:oMath>
         <m:r>
-          <m:t>1</m:t>
+          <m:t>1.0</m:t>
         </m:r>
         <m:r>
           <m:rPr>
@@ -8808,7 +9055,7 @@
         <w:t xml:space="preserve"> </w:t>
       </w:r>
       <w:r>
-        <w:t xml:space="preserve">noise floor, which is insufficient for reliable isolation.</w:t>
+        <w:t xml:space="preserve">measurement noise.</w:t>
       </w:r>
       <w:r>
         <w:t xml:space="preserve"> </w:t>
@@ -8933,9 +9180,33 @@
         </m:r>
       </m:oMath>
       <w:r>
-        <w:t xml:space="preserve">), but the positive control fails (NMSE</w:t>
-      </w:r>
-      <m:oMath>
+        <w:t xml:space="preserve">), but the positive control fails (</w:t>
+      </w:r>
+      <m:oMath>
+        <m:r>
+          <m:rPr>
+            <m:sty m:val="p"/>
+          </m:rPr>
+          <m:t>N</m:t>
+        </m:r>
+        <m:r>
+          <m:rPr>
+            <m:sty m:val="p"/>
+          </m:rPr>
+          <m:t>M</m:t>
+        </m:r>
+        <m:r>
+          <m:rPr>
+            <m:sty m:val="p"/>
+          </m:rPr>
+          <m:t>S</m:t>
+        </m:r>
+        <m:r>
+          <m:rPr>
+            <m:sty m:val="p"/>
+          </m:rPr>
+          <m:t>E</m:t>
+        </m:r>
         <m:r>
           <m:rPr>
             <m:sty m:val="p"/>
@@ -8947,93 +9218,12 @@
         </m:r>
       </m:oMath>
       <w:r>
-        <w:t xml:space="preserve">): over</w:t>
-      </w:r>
-      <w:r>
-        <w:t xml:space="preserve"> </w:t>
-      </w:r>
-      <m:oMath>
-        <m:r>
-          <m:t>v</m:t>
-        </m:r>
-        <m:r>
-          <m:rPr>
-            <m:sty m:val="p"/>
-          </m:rPr>
-          <m:t>≤</m:t>
-        </m:r>
-        <m:r>
-          <m:t>0.3</m:t>
-        </m:r>
-        <m:r>
-          <m:t>c</m:t>
-        </m:r>
-      </m:oMath>
-      <w:r>
-        <w:t xml:space="preserve"> </w:t>
-      </w:r>
-      <w:r>
-        <w:t xml:space="preserve">(RMS correction</w:t>
-      </w:r>
-      <w:r>
-        <w:t xml:space="preserve"> </w:t>
-      </w:r>
-      <m:oMath>
-        <m:r>
-          <m:rPr>
-            <m:sty m:val="p"/>
-          </m:rPr>
-          <m:t>≈</m:t>
-        </m:r>
-        <m:r>
-          <m:t>1.6</m:t>
-        </m:r>
-        <m:r>
-          <m:rPr>
-            <m:sty m:val="p"/>
-          </m:rPr>
-          <m:t>%</m:t>
-        </m:r>
-      </m:oMath>
-      <w:r>
-        <w:t xml:space="preserve"> </w:t>
-      </w:r>
-      <w:r>
-        <w:t xml:space="preserve">vs. </w:t>
-      </w:r>
-      <m:oMath>
-        <m:r>
-          <m:t>1</m:t>
-        </m:r>
-        <m:r>
-          <m:rPr>
-            <m:sty m:val="p"/>
-          </m:rPr>
-          <m:t>%</m:t>
-        </m:r>
-      </m:oMath>
-      <w:r>
-        <w:t xml:space="preserve"> </w:t>
-      </w:r>
-      <w:r>
-        <w:t xml:space="preserve">noise), even the exact ground-truth curve has an intrinsic observational noise floor of</w:t>
-      </w:r>
-      <w:r>
-        <w:t xml:space="preserve"> </w:t>
-      </w:r>
-      <m:oMath>
-        <m:r>
-          <m:rPr>
-            <m:sty m:val="p"/>
-          </m:rPr>
-          <m:t>N</m:t>
-        </m:r>
-        <m:r>
-          <m:rPr>
-            <m:sty m:val="p"/>
-          </m:rPr>
-          <m:t>M</m:t>
-        </m:r>
+        <w:t xml:space="preserve">): because</w:t>
+      </w:r>
+      <w:r>
+        <w:t xml:space="preserve"> </w:t>
+      </w:r>
+      <m:oMath>
         <m:r>
           <m:rPr>
             <m:sty m:val="p"/>
@@ -9044,18 +9234,21 @@
           <m:rPr>
             <m:sty m:val="p"/>
           </m:rPr>
-          <m:t>E</m:t>
-        </m:r>
-        <m:r>
-          <m:rPr>
-            <m:sty m:val="p"/>
-          </m:rPr>
-          <m:t>≈</m:t>
-        </m:r>
-        <m:sSubSup>
+          <m:t>D</m:t>
+        </m:r>
+        <m:r>
+          <m:rPr>
+            <m:sty m:val="p"/>
+          </m:rPr>
+          <m:t>(</m:t>
+        </m:r>
+        <m:sSub>
           <m:e>
             <m:r>
-              <m:t>σ</m:t>
+              <m:rPr>
+                <m:sty m:val="p"/>
+              </m:rPr>
+              <m:t>Δ</m:t>
             </m:r>
           </m:e>
           <m:sub>
@@ -9063,19 +9256,13 @@
               <m:rPr>
                 <m:sty m:val="p"/>
               </m:rPr>
-              <m:t>n</m:t>
-            </m:r>
-            <m:r>
-              <m:rPr>
-                <m:sty m:val="p"/>
-              </m:rPr>
               <m:t>o</m:t>
             </m:r>
             <m:r>
               <m:rPr>
                 <m:sty m:val="p"/>
               </m:rPr>
-              <m:t>i</m:t>
+              <m:t>b</m:t>
             </m:r>
             <m:r>
               <m:rPr>
@@ -9083,42 +9270,84 @@
               </m:rPr>
               <m:t>s</m:t>
             </m:r>
-            <m:r>
-              <m:rPr>
-                <m:sty m:val="p"/>
-              </m:rPr>
-              <m:t>e</m:t>
-            </m:r>
           </m:sub>
-          <m:sup>
-            <m:r>
-              <m:t>2</m:t>
-            </m:r>
-          </m:sup>
-        </m:sSubSup>
-        <m:r>
-          <m:rPr>
-            <m:sty m:val="p"/>
-          </m:rPr>
-          <m:t>/</m:t>
-        </m:r>
-        <m:r>
-          <m:rPr>
-            <m:sty m:val="p"/>
-          </m:rPr>
-          <m:t>V</m:t>
-        </m:r>
-        <m:r>
-          <m:rPr>
-            <m:sty m:val="p"/>
-          </m:rPr>
-          <m:t>a</m:t>
-        </m:r>
-        <m:r>
-          <m:rPr>
-            <m:sty m:val="p"/>
-          </m:rPr>
-          <m:t>r</m:t>
+        </m:sSub>
+        <m:r>
+          <m:rPr>
+            <m:sty m:val="p"/>
+          </m:rPr>
+          <m:t>)</m:t>
+        </m:r>
+        <m:r>
+          <m:rPr>
+            <m:sty m:val="p"/>
+          </m:rPr>
+          <m:t>≈</m:t>
+        </m:r>
+        <m:r>
+          <m:t>1.57</m:t>
+        </m:r>
+        <m:r>
+          <m:rPr>
+            <m:sty m:val="p"/>
+          </m:rPr>
+          <m:t>%</m:t>
+        </m:r>
+      </m:oMath>
+      <w:r>
+        <w:t xml:space="preserve">, even the exact ground-truth curve has an intrinsic observational noise floor of</w:t>
+      </w:r>
+      <w:r>
+        <w:t xml:space="preserve"> </w:t>
+      </w:r>
+      <m:oMath>
+        <m:r>
+          <m:rPr>
+            <m:sty m:val="p"/>
+          </m:rPr>
+          <m:t>N</m:t>
+        </m:r>
+        <m:r>
+          <m:rPr>
+            <m:sty m:val="p"/>
+          </m:rPr>
+          <m:t>M</m:t>
+        </m:r>
+        <m:r>
+          <m:rPr>
+            <m:sty m:val="p"/>
+          </m:rPr>
+          <m:t>S</m:t>
+        </m:r>
+        <m:r>
+          <m:rPr>
+            <m:sty m:val="p"/>
+          </m:rPr>
+          <m:t>E</m:t>
+        </m:r>
+        <m:r>
+          <m:rPr>
+            <m:sty m:val="p"/>
+          </m:rPr>
+          <m:t>=</m:t>
+        </m:r>
+        <m:r>
+          <m:rPr>
+            <m:sty m:val="p"/>
+          </m:rPr>
+          <m:t>M</m:t>
+        </m:r>
+        <m:r>
+          <m:rPr>
+            <m:sty m:val="p"/>
+          </m:rPr>
+          <m:t>S</m:t>
+        </m:r>
+        <m:r>
+          <m:rPr>
+            <m:sty m:val="p"/>
+          </m:rPr>
+          <m:t>E</m:t>
         </m:r>
         <m:r>
           <m:rPr>
@@ -9140,19 +9369,25 @@
               <m:rPr>
                 <m:sty m:val="p"/>
               </m:rPr>
-              <m:t>o</m:t>
-            </m:r>
-            <m:r>
-              <m:rPr>
-                <m:sty m:val="p"/>
-              </m:rPr>
-              <m:t>b</m:t>
-            </m:r>
-            <m:r>
-              <m:rPr>
-                <m:sty m:val="p"/>
-              </m:rPr>
-              <m:t>s</m:t>
+              <m:t>t</m:t>
+            </m:r>
+            <m:r>
+              <m:rPr>
+                <m:sty m:val="p"/>
+              </m:rPr>
+              <m:t>r</m:t>
+            </m:r>
+            <m:r>
+              <m:rPr>
+                <m:sty m:val="p"/>
+              </m:rPr>
+              <m:t>u</m:t>
+            </m:r>
+            <m:r>
+              <m:rPr>
+                <m:sty m:val="p"/>
+              </m:rPr>
+              <m:t>e</m:t>
             </m:r>
           </m:sub>
         </m:sSub>
@@ -9160,16 +9395,118 @@
           <m:rPr>
             <m:sty m:val="p"/>
           </m:rPr>
+          <m:t>,</m:t>
+        </m:r>
+        <m:sSub>
+          <m:e>
+            <m:r>
+              <m:rPr>
+                <m:sty m:val="p"/>
+              </m:rPr>
+              <m:t>Δ</m:t>
+            </m:r>
+          </m:e>
+          <m:sub>
+            <m:r>
+              <m:rPr>
+                <m:sty m:val="p"/>
+              </m:rPr>
+              <m:t>o</m:t>
+            </m:r>
+            <m:r>
+              <m:rPr>
+                <m:sty m:val="p"/>
+              </m:rPr>
+              <m:t>b</m:t>
+            </m:r>
+            <m:r>
+              <m:rPr>
+                <m:sty m:val="p"/>
+              </m:rPr>
+              <m:t>s</m:t>
+            </m:r>
+          </m:sub>
+        </m:sSub>
+        <m:r>
+          <m:rPr>
+            <m:sty m:val="p"/>
+          </m:rPr>
           <m:t>)</m:t>
         </m:r>
         <m:r>
           <m:rPr>
             <m:sty m:val="p"/>
           </m:rPr>
+          <m:t>/</m:t>
+        </m:r>
+        <m:r>
+          <m:rPr>
+            <m:sty m:val="p"/>
+          </m:rPr>
+          <m:t>V</m:t>
+        </m:r>
+        <m:r>
+          <m:rPr>
+            <m:sty m:val="p"/>
+          </m:rPr>
+          <m:t>a</m:t>
+        </m:r>
+        <m:r>
+          <m:rPr>
+            <m:sty m:val="p"/>
+          </m:rPr>
+          <m:t>r</m:t>
+        </m:r>
+        <m:r>
+          <m:rPr>
+            <m:sty m:val="p"/>
+          </m:rPr>
+          <m:t>(</m:t>
+        </m:r>
+        <m:sSub>
+          <m:e>
+            <m:r>
+              <m:rPr>
+                <m:sty m:val="p"/>
+              </m:rPr>
+              <m:t>Δ</m:t>
+            </m:r>
+          </m:e>
+          <m:sub>
+            <m:r>
+              <m:rPr>
+                <m:sty m:val="p"/>
+              </m:rPr>
+              <m:t>o</m:t>
+            </m:r>
+            <m:r>
+              <m:rPr>
+                <m:sty m:val="p"/>
+              </m:rPr>
+              <m:t>b</m:t>
+            </m:r>
+            <m:r>
+              <m:rPr>
+                <m:sty m:val="p"/>
+              </m:rPr>
+              <m:t>s</m:t>
+            </m:r>
+          </m:sub>
+        </m:sSub>
+        <m:r>
+          <m:rPr>
+            <m:sty m:val="p"/>
+          </m:rPr>
+          <m:t>)</m:t>
+        </m:r>
+        <m:r>
+          <m:rPr>
+            <m:sty m:val="p"/>
+          </m:rPr>
           <m:t>≈</m:t>
         </m:r>
         <m:r>
-          <m:t>0.41</m:t>
+          <m:t>0.412</m:t>
         </m:r>
         <m:r>
           <m:rPr>
@@ -9298,13 +9635,30 @@
         <w:t xml:space="preserve"> </w:t>
       </w:r>
       <w:r>
-        <w:t xml:space="preserve">its own identifiability boundary—a boundary that is quantitative and</w:t>
-      </w:r>
-      <w:r>
-        <w:t xml:space="preserve"> </w:t>
-      </w:r>
-      <w:r>
-        <w:t xml:space="preserve">testable: a wider velocity window (</w:t>
+        <w:t xml:space="preserve">its own identifiability boundary: lowering noise (</w:t>
+      </w:r>
+      <m:oMath>
+        <m:r>
+          <m:t>σ</m:t>
+        </m:r>
+        <m:r>
+          <m:rPr>
+            <m:sty m:val="p"/>
+          </m:rPr>
+          <m:t>≲</m:t>
+        </m:r>
+        <m:r>
+          <m:t>0.29</m:t>
+        </m:r>
+        <m:r>
+          <m:rPr>
+            <m:sty m:val="p"/>
+          </m:rPr>
+          <m:t>%</m:t>
+        </m:r>
+      </m:oMath>
+      <w:r>
+        <w:t xml:space="preserve">) or widening the velocity window (</w:t>
       </w:r>
       <m:oMath>
         <m:r>
@@ -9314,9 +9668,130 @@
           <m:rPr>
             <m:sty m:val="p"/>
           </m:rPr>
+          <m:t>≳</m:t>
+        </m:r>
+        <m:r>
+          <m:t>0.5</m:t>
+        </m:r>
+        <m:r>
+          <m:t>c</m:t>
+        </m:r>
+      </m:oMath>
+      <w:r>
+        <w:t xml:space="preserve"> </w:t>
+      </w:r>
+      <w:r>
+        <w:t xml:space="preserve">at</w:t>
+      </w:r>
+      <w:r>
+        <w:t xml:space="preserve"> </w:t>
+      </w:r>
+      <m:oMath>
+        <m:r>
+          <m:t>σ</m:t>
+        </m:r>
+        <m:r>
+          <m:rPr>
+            <m:sty m:val="p"/>
+          </m:rPr>
+          <m:t>=</m:t>
+        </m:r>
+        <m:r>
+          <m:t>1</m:t>
+        </m:r>
+        <m:r>
+          <m:rPr>
+            <m:sty m:val="p"/>
+          </m:rPr>
+          <m:t>%</m:t>
+        </m:r>
+      </m:oMath>
+      <w:r>
+        <w:t xml:space="preserve">) reduces the noise floor below</w:t>
+      </w:r>
+      <w:r>
+        <w:t xml:space="preserve"> </w:t>
+      </w:r>
+      <m:oMath>
+        <m:r>
+          <m:t>0.05</m:t>
+        </m:r>
+      </m:oMath>
+      <w:r>
+        <w:t xml:space="preserve">, while separating</w:t>
+      </w:r>
+      <w:r>
+        <w:t xml:space="preserve"> </w:t>
+      </w:r>
+      <m:oMath>
+        <m:sSub>
+          <m:e>
+            <m:r>
+              <m:t>D</m:t>
+            </m:r>
+          </m:e>
+          <m:sub>
+            <m:r>
+              <m:rPr>
+                <m:sty m:val="p"/>
+              </m:rPr>
+              <m:t>l</m:t>
+            </m:r>
+            <m:r>
+              <m:rPr>
+                <m:sty m:val="p"/>
+              </m:rPr>
+              <m:t>o</m:t>
+            </m:r>
+            <m:r>
+              <m:rPr>
+                <m:sty m:val="p"/>
+              </m:rPr>
+              <m:t>r</m:t>
+            </m:r>
+          </m:sub>
+        </m:sSub>
+      </m:oMath>
+      <w:r>
+        <w:t xml:space="preserve"> </w:t>
+      </w:r>
+      <w:r>
+        <w:t xml:space="preserve">from competing rational/polynomial families on pure fit (</w:t>
+      </w:r>
+      <m:oMath>
+        <m:r>
+          <m:rPr>
+            <m:sty m:val="p"/>
+          </m:rPr>
+          <m:t>Δ</m:t>
+        </m:r>
+        <m:r>
+          <m:t>D</m:t>
+        </m:r>
+        <m:r>
+          <m:rPr>
+            <m:sty m:val="p"/>
+          </m:rPr>
           <m:t>&gt;</m:t>
         </m:r>
         <m:r>
+          <m:t>10</m:t>
+        </m:r>
+      </m:oMath>
+      <w:r>
+        <w:t xml:space="preserve">) requires extending into the relativistic regime (</w:t>
+      </w:r>
+      <m:oMath>
+        <m:r>
+          <m:t>v</m:t>
+        </m:r>
+        <m:r>
+          <m:rPr>
+            <m:sty m:val="p"/>
+          </m:rPr>
+          <m:t>&gt;</m:t>
+        </m:r>
+        <m:r>
           <m:t>0.3</m:t>
         </m:r>
         <m:r>
@@ -9324,41 +9799,7 @@
         </m:r>
       </m:oMath>
       <w:r>
-        <w:t xml:space="preserve">) or lower measurement noise (</w:t>
-      </w:r>
-      <m:oMath>
-        <m:r>
-          <m:t>σ</m:t>
-        </m:r>
-        <m:r>
-          <m:rPr>
-            <m:sty m:val="p"/>
-          </m:rPr>
-          <m:t>&lt;</m:t>
-        </m:r>
-        <m:r>
-          <m:t>1</m:t>
-        </m:r>
-        <m:r>
-          <m:rPr>
-            <m:sty m:val="p"/>
-          </m:rPr>
-          <m:t>%</m:t>
-        </m:r>
-      </m:oMath>
-      <w:r>
-        <w:t xml:space="preserve">) would lower the observational noise floor below</w:t>
-      </w:r>
-      <w:r>
-        <w:t xml:space="preserve"> </w:t>
-      </w:r>
-      <m:oMath>
-        <m:r>
-          <m:t>0.05</m:t>
-        </m:r>
-      </m:oMath>
-      <w:r>
-        <w:t xml:space="preserve">, yielding IDENTIFIABLE.</w:t>
+        <w:t xml:space="preserve">).</w:t>
       </w:r>
     </w:p>
     <w:p>
@@ -9584,7 +10025,7 @@
         <w:t xml:space="preserve"> </w:t>
       </w:r>
       <w:r>
-        <w:t xml:space="preserve">all 6 wrong-taxonomy trials yielded WITHHELD (0% false discovery).</w:t>
+        <w:t xml:space="preserve">all 6 wrong-taxonomy trials yielded WITHHELD (0/6 false discoveries).</w:t>
       </w:r>
     </w:p>
     <w:p>
@@ -10005,7 +10446,7 @@
               <w:jc w:val="left"/>
             </w:pPr>
             <w:r>
-              <w:t xml:space="preserve">Stochastic</w:t>
+              <w:t xml:space="preserve">Stochastic by default</w:t>
             </w:r>
           </w:p>
         </w:tc>
@@ -10398,19 +10839,19 @@
         <w:t xml:space="preserve"> </w:t>
       </w:r>
       <w:r>
-        <w:t xml:space="preserve">Within its deliberate scope—known classical baseline, multiplicative</w:t>
-      </w:r>
-      <w:r>
-        <w:t xml:space="preserve"> </w:t>
-      </w:r>
-      <w:r>
-        <w:t xml:space="preserve">correction, Gaussian noise—ADCD provides stronger reproducibility and</w:t>
-      </w:r>
-      <w:r>
-        <w:t xml:space="preserve"> </w:t>
-      </w:r>
-      <w:r>
-        <w:t xml:space="preserve">identifiability guarantees than general-purpose SR, and furnishes an explicit</w:t>
+        <w:t xml:space="preserve">Within its deliberate scope—known classical baseline, additive or multiplicative</w:t>
+      </w:r>
+      <w:r>
+        <w:t xml:space="preserve"> </w:t>
+      </w:r>
+      <w:r>
+        <w:t xml:space="preserve">correction, Gaussian noise—ADCD provides explicit reproducibility and</w:t>
+      </w:r>
+      <w:r>
+        <w:t xml:space="preserve"> </w:t>
+      </w:r>
+      <w:r>
+        <w:t xml:space="preserve">identifiability diagnostics absent from unconstrained SR, and furnishes a formal</w:t>
       </w:r>
       <w:r>
         <w:t xml:space="preserve"> </w:t>
@@ -10448,13 +10889,7 @@
         </m:r>
       </m:oMath>
       <w:r>
-        <w:t xml:space="preserve">) when those</w:t>
-      </w:r>
-      <w:r>
-        <w:t xml:space="preserve"> </w:t>
-      </w:r>
-      <w:r>
-        <w:t xml:space="preserve">guarantees cannot be met.</w:t>
+        <w:t xml:space="preserve">) when data sufficiency cannot be met.</w:t>
       </w:r>
     </w:p>
     <w:p>
@@ -11696,24 +12131,7 @@
         <w:t xml:space="preserve"> </w:t>
       </w:r>
       <w:r>
-        <w:t xml:space="preserve">(</w:t>
-      </w:r>
-      <m:oMath>
-        <m:r>
-          <m:t>0</m:t>
-        </m:r>
-        <m:r>
-          <m:rPr>
-            <m:sty m:val="p"/>
-          </m:rPr>
-          <m:t>%</m:t>
-        </m:r>
-      </m:oMath>
-      <w:r>
-        <w:t xml:space="preserve"> </w:t>
-      </w:r>
-      <w:r>
-        <w:t xml:space="preserve">false discovery rate): when the true primitive family is absent from the domain prior, the unrestricted ablation search outperforms the misspecified domain search (</w:t>
+        <w:t xml:space="preserve">(0/6 false discoveries): when the true primitive family is absent from the domain prior, the unrestricted ablation search outperforms the misspecified domain search (</w:t>
       </w:r>
       <m:oMath>
         <m:r>
@@ -11790,7 +12208,7 @@
         <w:t xml:space="preserve">on identifiable scenarios), triggering conservative abstention rather than overfitting.</w:t>
       </w:r>
     </w:p>
-    <w:bookmarkStart w:id="101" w:name="_refs"/>
+    <w:bookmarkStart w:id="102" w:name="_refs"/>
     <w:bookmarkStart w:id="48" w:name="_4821a1adf58ef0c96a762a09b8aff3e5f2fbdd2"/>
     <w:p>
       <w:pPr>
@@ -12499,7 +12917,7 @@
         <w:ind w:left="720" w:hanging="720"/>
       </w:pPr>
       <w:r>
-        <w:t xml:space="preserve">Kramer, Stefan, Marco Cerrato, Jannis Brugger, Sašo Džeroski, and Ross D. King. 2026.</w:t>
+        <w:t xml:space="preserve">Kramer, Stefan, Mattia Cerrato, Jannis Brugger, Sašo Džeroski, and Ross D. King. 2026.</w:t>
       </w:r>
       <w:r>
         <w:t xml:space="preserve"> </w:t>
@@ -12657,7 +13075,7 @@
       </w:r>
     </w:p>
     <w:bookmarkEnd w:id="79"/>
-    <w:bookmarkStart w:id="80" w:name="_487adff8243fba59e6cf717edc54005140a48bd"/>
+    <w:bookmarkStart w:id="81" w:name="_487adff8243fba59e6cf717edc54005140a48bd"/>
     <w:p>
       <w:pPr>
         <w:pStyle w:val="Bibliography"/>
@@ -12670,7 +13088,7 @@
         <w:t xml:space="preserve"> </w:t>
       </w:r>
       <w:r>
-        <w:t xml:space="preserve">“A Perspective on Symbolic Machine Learning in Physical Sciences.”</w:t>
+        <w:t xml:space="preserve">“Interpretable Scientific Discovery with Symbolic Regression: A Review.”</w:t>
       </w:r>
       <w:r>
         <w:t xml:space="preserve"> </w:t>
@@ -12680,14 +13098,31 @@
           <w:i/>
           <w:iCs/>
         </w:rPr>
-        <w:t xml:space="preserve">NeurIPS 2024 Workshop on Machine Learning and the Physical Sciences</w:t>
-      </w:r>
+        <w:t xml:space="preserve">Artificial Intelligence Review</w:t>
+      </w:r>
+      <w:r>
+        <w:t xml:space="preserve"> </w:t>
+      </w:r>
+      <w:r>
+        <w:t xml:space="preserve">57 (1): 2.</w:t>
+      </w:r>
+      <w:r>
+        <w:t xml:space="preserve"> </w:t>
+      </w:r>
+      <w:hyperlink r:id="rId80">
+        <w:r>
+          <w:rPr>
+            <w:rStyle w:val="Hyperlink"/>
+          </w:rPr>
+          <w:t xml:space="preserve">https://doi.org/10.1007/s10462-023-10622-0</w:t>
+        </w:r>
+      </w:hyperlink>
       <w:r>
         <w:t xml:space="preserve">.</w:t>
       </w:r>
     </w:p>
-    <w:bookmarkEnd w:id="80"/>
-    <w:bookmarkStart w:id="82" w:name="_91b59947130ffdd5d02deab777df77813338c35"/>
+    <w:bookmarkEnd w:id="81"/>
+    <w:bookmarkStart w:id="83" w:name="_91b59947130ffdd5d02deab777df77813338c35"/>
     <w:p>
       <w:pPr>
         <w:pStyle w:val="Bibliography"/>
@@ -12721,7 +13156,7 @@
       <w:r>
         <w:t xml:space="preserve"> </w:t>
       </w:r>
-      <w:hyperlink r:id="rId81">
+      <w:hyperlink r:id="rId82">
         <w:r>
           <w:rPr>
             <w:rStyle w:val="Hyperlink"/>
@@ -12733,8 +13168,8 @@
         <w:t xml:space="preserve">.</w:t>
       </w:r>
     </w:p>
-    <w:bookmarkEnd w:id="82"/>
-    <w:bookmarkStart w:id="83" w:name="_97fe74aee6e1866024e3578107d1a9db6ca039d"/>
+    <w:bookmarkEnd w:id="83"/>
+    <w:bookmarkStart w:id="84" w:name="_97fe74aee6e1866024e3578107d1a9db6ca039d"/>
     <w:p>
       <w:pPr>
         <w:pStyle w:val="Bibliography"/>
@@ -12766,8 +13201,8 @@
         <w:t xml:space="preserve">26: 1–83.</w:t>
       </w:r>
     </w:p>
-    <w:bookmarkEnd w:id="83"/>
-    <w:bookmarkStart w:id="85" w:name="_ef604ae533fad333bc697748e3dc0fd28f0aa78"/>
+    <w:bookmarkEnd w:id="84"/>
+    <w:bookmarkStart w:id="86" w:name="_ef604ae533fad333bc697748e3dc0fd28f0aa78"/>
     <w:p>
       <w:pPr>
         <w:pStyle w:val="Bibliography"/>
@@ -12798,7 +13233,7 @@
       <w:r>
         <w:t xml:space="preserve"> </w:t>
       </w:r>
-      <w:hyperlink r:id="rId84">
+      <w:hyperlink r:id="rId85">
         <w:r>
           <w:rPr>
             <w:rStyle w:val="Hyperlink"/>
@@ -12810,8 +13245,8 @@
         <w:t xml:space="preserve">.</w:t>
       </w:r>
     </w:p>
-    <w:bookmarkEnd w:id="85"/>
-    <w:bookmarkStart w:id="87" w:name="_457df0eb6f3cee80a45c4fff61dc37b0f5cd9b1"/>
+    <w:bookmarkEnd w:id="86"/>
+    <w:bookmarkStart w:id="88" w:name="_457df0eb6f3cee80a45c4fff61dc37b0f5cd9b1"/>
     <w:p>
       <w:pPr>
         <w:pStyle w:val="Bibliography"/>
@@ -12845,7 +13280,7 @@
       <w:r>
         <w:t xml:space="preserve"> </w:t>
       </w:r>
-      <w:hyperlink r:id="rId86">
+      <w:hyperlink r:id="rId87">
         <w:r>
           <w:rPr>
             <w:rStyle w:val="Hyperlink"/>
@@ -12857,8 +13292,8 @@
         <w:t xml:space="preserve">.</w:t>
       </w:r>
     </w:p>
-    <w:bookmarkEnd w:id="87"/>
-    <w:bookmarkStart w:id="89" w:name="_224126058e881b11118696e484baee7c8dbe6db"/>
+    <w:bookmarkEnd w:id="88"/>
+    <w:bookmarkStart w:id="90" w:name="_224126058e881b11118696e484baee7c8dbe6db"/>
     <w:p>
       <w:pPr>
         <w:pStyle w:val="Bibliography"/>
@@ -12892,7 +13327,7 @@
       <w:r>
         <w:t xml:space="preserve"> </w:t>
       </w:r>
-      <w:hyperlink r:id="rId88">
+      <w:hyperlink r:id="rId89">
         <w:r>
           <w:rPr>
             <w:rStyle w:val="Hyperlink"/>
@@ -12904,8 +13339,8 @@
         <w:t xml:space="preserve">.</w:t>
       </w:r>
     </w:p>
-    <w:bookmarkEnd w:id="89"/>
-    <w:bookmarkStart w:id="91" w:name="_1717fb37a54aa1a40df471b2975d2fd09729c85"/>
+    <w:bookmarkEnd w:id="90"/>
+    <w:bookmarkStart w:id="92" w:name="_1717fb37a54aa1a40df471b2975d2fd09729c85"/>
     <w:p>
       <w:pPr>
         <w:pStyle w:val="Bibliography"/>
@@ -12939,7 +13374,7 @@
       <w:r>
         <w:t xml:space="preserve"> </w:t>
       </w:r>
-      <w:hyperlink r:id="rId90">
+      <w:hyperlink r:id="rId91">
         <w:r>
           <w:rPr>
             <w:rStyle w:val="Hyperlink"/>
@@ -12951,8 +13386,8 @@
         <w:t xml:space="preserve">.</w:t>
       </w:r>
     </w:p>
-    <w:bookmarkEnd w:id="91"/>
-    <w:bookmarkStart w:id="93" w:name="_8b25f64435fc5ff192d03ffcdc0af37daecff02"/>
+    <w:bookmarkEnd w:id="92"/>
+    <w:bookmarkStart w:id="94" w:name="_8b25f64435fc5ff192d03ffcdc0af37daecff02"/>
     <w:p>
       <w:pPr>
         <w:pStyle w:val="Bibliography"/>
@@ -13004,7 +13439,7 @@
       <w:r>
         <w:t xml:space="preserve"> </w:t>
       </w:r>
-      <w:hyperlink r:id="rId92">
+      <w:hyperlink r:id="rId93">
         <w:r>
           <w:rPr>
             <w:rStyle w:val="Hyperlink"/>
@@ -13016,8 +13451,8 @@
         <w:t xml:space="preserve">.</w:t>
       </w:r>
     </w:p>
-    <w:bookmarkEnd w:id="93"/>
-    <w:bookmarkStart w:id="95" w:name="_087162fecb529c26266ceb922b457ce775002f4"/>
+    <w:bookmarkEnd w:id="94"/>
+    <w:bookmarkStart w:id="96" w:name="_087162fecb529c26266ceb922b457ce775002f4"/>
     <w:p>
       <w:pPr>
         <w:pStyle w:val="Bibliography"/>
@@ -13051,7 +13486,7 @@
       <w:r>
         <w:t xml:space="preserve"> </w:t>
       </w:r>
-      <w:hyperlink r:id="rId94">
+      <w:hyperlink r:id="rId95">
         <w:r>
           <w:rPr>
             <w:rStyle w:val="Hyperlink"/>
@@ -13063,8 +13498,8 @@
         <w:t xml:space="preserve">.</w:t>
       </w:r>
     </w:p>
-    <w:bookmarkEnd w:id="95"/>
-    <w:bookmarkStart w:id="96" w:name="_7ab753a07ab1486fccf9d5891a2e9e206624fa4"/>
+    <w:bookmarkEnd w:id="96"/>
+    <w:bookmarkStart w:id="97" w:name="_7ab753a07ab1486fccf9d5891a2e9e206624fa4"/>
     <w:p>
       <w:pPr>
         <w:pStyle w:val="Bibliography"/>
@@ -13105,8 +13540,8 @@
         <w:t xml:space="preserve">33: 4860–71.</w:t>
       </w:r>
     </w:p>
-    <w:bookmarkEnd w:id="96"/>
-    <w:bookmarkStart w:id="98" w:name="_a9b2e19e299c9f94ea16f0b1c1b195864220abf"/>
+    <w:bookmarkEnd w:id="97"/>
+    <w:bookmarkStart w:id="99" w:name="_a9b2e19e299c9f94ea16f0b1c1b195864220abf"/>
     <w:p>
       <w:pPr>
         <w:pStyle w:val="Bibliography"/>
@@ -13146,7 +13581,7 @@
       <w:r>
         <w:t xml:space="preserve"> </w:t>
       </w:r>
-      <w:hyperlink r:id="rId97">
+      <w:hyperlink r:id="rId98">
         <w:r>
           <w:rPr>
             <w:rStyle w:val="Hyperlink"/>
@@ -13158,8 +13593,8 @@
         <w:t xml:space="preserve">.</w:t>
       </w:r>
     </w:p>
-    <w:bookmarkEnd w:id="98"/>
-    <w:bookmarkStart w:id="100" w:name="_a50bc08bafa126fa7b3f332668ec078da73e90d"/>
+    <w:bookmarkEnd w:id="99"/>
+    <w:bookmarkStart w:id="101" w:name="_a50bc08bafa126fa7b3f332668ec078da73e90d"/>
     <w:p>
       <w:pPr>
         <w:pStyle w:val="Bibliography"/>
@@ -13193,7 +13628,7 @@
       <w:r>
         <w:t xml:space="preserve"> </w:t>
       </w:r>
-      <w:hyperlink r:id="rId99">
+      <w:hyperlink r:id="rId100">
         <w:r>
           <w:rPr>
             <w:rStyle w:val="Hyperlink"/>
@@ -13205,8 +13640,8 @@
         <w:t xml:space="preserve">.</w:t>
       </w:r>
     </w:p>
-    <w:bookmarkEnd w:id="100"/>
     <w:bookmarkEnd w:id="101"/>
+    <w:bookmarkEnd w:id="102"/>
     <w:sectPr>
       <w:footnotePr>
         <w:numRestart w:val="eachSect"/>

</xml_diff>